<commit_message>
Verify RP-GG-PL-003 V04 against official NRP texts and approved V03
Uses official titles (NRP-42 and NRP-05 'de las Entidades Financieras'),
BCR terminology for BIA/RTO/RPO/MTPD, NRP-42 art. 4 minimum fields for
the centralized control, and cites tech/counterparty/concentration risk
to NRP-42/NRP-23 instead of NRP-20/NRP-17. Restores V03/NRP-23 wording
in Annex 1 Section B and adds missing NRP-23 requirements (A.3 b-c,
A.7, B.19) plus NRP-23 art. 22/26, NRP-42 art. 21 and NRP-20 art. 8
reporting duties.

Co-Authored-By: Claude Opus 5.5 <noreply@anthropic.com>
Claude-Session: https://claude.ai/code/session_01PyMC4LRxqsjjU8zCw9m9SH
</commit_message>
<xml_diff>
--- a/politicas/RP-GG-PL-003_Contrat.Servicios_Criticos_Terce_V04_Final.docx
+++ b/politicas/RP-GG-PL-003_Contrat.Servicios_Criticos_Terce_V04_Final.docx
@@ -682,7 +682,7 @@
           <w:fldChar w:fldCharType="begin"/>
           <w:instrText xml:space="preserve"> PAGEREF _Toc144550020 \h </w:instrText>
           <w:fldChar w:fldCharType="separate"/>
-          <w:t>6</w:t>
+          <w:t>7</w:t>
           <w:fldChar w:fldCharType="end"/>
         </w:r>
       </w:hyperlink>
@@ -934,7 +934,7 @@
           <w:fldChar w:fldCharType="begin"/>
           <w:instrText xml:space="preserve"> PAGEREF _Toc144550024 \h </w:instrText>
           <w:fldChar w:fldCharType="separate"/>
-          <w:t>15</w:t>
+          <w:t>16</w:t>
           <w:fldChar w:fldCharType="end"/>
         </w:r>
       </w:hyperlink>
@@ -997,7 +997,7 @@
           <w:fldChar w:fldCharType="begin"/>
           <w:instrText xml:space="preserve"> PAGEREF _Toc144550025 \h </w:instrText>
           <w:fldChar w:fldCharType="separate"/>
-          <w:t>15</w:t>
+          <w:t>16</w:t>
           <w:fldChar w:fldCharType="end"/>
         </w:r>
       </w:hyperlink>
@@ -1060,7 +1060,7 @@
           <w:fldChar w:fldCharType="begin"/>
           <w:instrText xml:space="preserve"> PAGEREF _Toc144550026 \h </w:instrText>
           <w:fldChar w:fldCharType="separate"/>
-          <w:t>16</w:t>
+          <w:t>17</w:t>
           <w:fldChar w:fldCharType="end"/>
         </w:r>
       </w:hyperlink>
@@ -1123,7 +1123,7 @@
           <w:fldChar w:fldCharType="begin"/>
           <w:instrText xml:space="preserve"> PAGEREF _Toc144550030 \h </w:instrText>
           <w:fldChar w:fldCharType="separate"/>
-          <w:t>16</w:t>
+          <w:t>17</w:t>
           <w:fldChar w:fldCharType="end"/>
         </w:r>
       </w:hyperlink>
@@ -1249,7 +1249,7 @@
           <w:fldChar w:fldCharType="begin"/>
           <w:instrText xml:space="preserve"> PAGEREF _Toc144550027 \h </w:instrText>
           <w:fldChar w:fldCharType="separate"/>
-          <w:t>17</w:t>
+          <w:t>18</w:t>
           <w:fldChar w:fldCharType="end"/>
         </w:r>
       </w:hyperlink>
@@ -1312,7 +1312,7 @@
           <w:fldChar w:fldCharType="begin"/>
           <w:instrText xml:space="preserve"> PAGEREF _Toc144550028 \h </w:instrText>
           <w:fldChar w:fldCharType="separate"/>
-          <w:t>17</w:t>
+          <w:t>18</w:t>
           <w:fldChar w:fldCharType="end"/>
         </w:r>
       </w:hyperlink>
@@ -1375,7 +1375,7 @@
           <w:fldChar w:fldCharType="begin"/>
           <w:instrText xml:space="preserve"> PAGEREF _Toc144550029 \h </w:instrText>
           <w:fldChar w:fldCharType="separate"/>
-          <w:t>17</w:t>
+          <w:t>18</w:t>
           <w:fldChar w:fldCharType="end"/>
         </w:r>
       </w:hyperlink>
@@ -1843,7 +1843,7 @@
           <w:rFonts w:ascii="Arial" w:hAnsi="Arial" w:cs="Arial"/>
           <w:color w:val="000000" w:themeColor="text1"/>
         </w:rPr>
-        <w:t xml:space="preserve">La presente política se alinea con lo dispuesto en las Normas Técnicas para la Gestión Integral de Riesgos de las Entidades Financieras (NRP-20); las Normas Técnicas para la Gestión del Riesgo Operacional en las Entidades Financieras (NRP-42), en lo relativo a la gestión de los servicios críticos provistos por terceros; las Normas Técnicas para el Sistema de Gestión de la Continuidad del Negocio (NRP-24); las Normas Técnicas para la Gestión de la Seguridad de la Información (NRP-23); las Normas Técnicas de Gobierno Corporativo (NRP-17), en lo relativo a la supervisión de los riesgos por parte de los órganos de gobierno; y las Normas Técnicas para la Gestión del Riesgo de Liquidez (NRP-05).</w:t>
+        <w:t xml:space="preserve">La presente política se alinea con lo dispuesto en las Normas Técnicas para la Gestión Integral de Riesgos de las Entidades Financieras (NRP-20); las Normas Técnicas para la Gestión del Riesgo Operacional de las Entidades Financieras (NRP-42), en lo relativo a la gestión de los servicios críticos provistos por terceros; las Normas Técnicas para el Sistema de Gestión de la Continuidad del Negocio (NRP-24); las Normas Técnicas para la Gestión de la Seguridad de la Información (NRP-23); las Normas Técnicas de Gobierno Corporativo (NRP-17), en lo relativo a la supervisión de los riesgos por parte de los órganos de gobierno; y las Normas Técnicas para la Gestión del Riesgo de Liquidez de las Entidades Financieras (NRP-05).</w:t>
       </w:r>
     </w:p>
     <w:p>
@@ -1971,7 +1971,7 @@
           <w:rFonts w:ascii="Arial" w:hAnsi="Arial" w:cs="Arial"/>
           <w:color w:val="000000" w:themeColor="text1"/>
         </w:rPr>
-        <w:t>Normas Técnicas para la Gestión del Riesgo Operacional en las Entidades Financieras (NRP-42).</w:t>
+        <w:t xml:space="preserve">Normas Técnicas para la Gestión del Riesgo Operacional de las Entidades Financieras (NRP-42).</w:t>
       </w:r>
     </w:p>
     <w:p>
@@ -2040,7 +2040,7 @@
           <w:rFonts w:ascii="Arial" w:hAnsi="Arial" w:cs="Arial"/>
           <w:color w:val="000000" w:themeColor="text1"/>
         </w:rPr>
-        <w:t xml:space="preserve">Normas Técnicas para la Gestión del Riesgo de Liquidez (NRP-05).</w:t>
+        <w:t xml:space="preserve">Normas Técnicas para la Gestión del Riesgo de Liquidez de las Entidades Financieras (NRP-05).</w:t>
       </w:r>
     </w:p>
     <w:p>
@@ -2243,37 +2243,14 @@
           <w:b/>
           <w:color w:val="000000" w:themeColor="text1"/>
         </w:rPr>
-        <w:t>Servicio</w:t>
-      </w:r>
-      <w:r>
-        <w:rPr>
-          <w:rFonts w:ascii="Arial" w:hAnsi="Arial" w:cs="Arial"/>
-          <w:b/>
-          <w:color w:val="000000" w:themeColor="text1"/>
-        </w:rPr>
-        <w:t>s</w:t>
-      </w:r>
-      <w:r>
-        <w:rPr>
-          <w:rFonts w:ascii="Arial" w:hAnsi="Arial" w:cs="Arial"/>
-          <w:b/>
-          <w:color w:val="000000" w:themeColor="text1"/>
-        </w:rPr>
-        <w:t xml:space="preserve"> Críticos:</w:t>
-      </w:r>
-      <w:r>
-        <w:rPr>
-          <w:rFonts w:ascii="Arial" w:hAnsi="Arial" w:cs="Arial"/>
-          <w:color w:val="000000" w:themeColor="text1"/>
-        </w:rPr>
-        <w:t xml:space="preserve"> Son un conjunto de actividades o procedimientos definidos como prioritarios, cuya no disponibilidad compromete la existencia de la entidad</w:t>
-      </w:r>
-      <w:r>
-        <w:rPr>
-          <w:rFonts w:ascii="Arial" w:hAnsi="Arial" w:cs="Arial"/>
-          <w:color w:val="000000" w:themeColor="text1"/>
-        </w:rPr>
-        <w:t>, la continuidad de sus procesos críticos identificados en el Análisis de Impacto al Negocio (BIA), su posición de liquidez o el cumplimiento de sus obligaciones regulatorias.</w:t>
+        <w:t xml:space="preserve">Servicios Críticos:</w:t>
+      </w:r>
+      <w:r>
+        <w:rPr>
+          <w:rFonts w:ascii="Arial" w:hAnsi="Arial" w:cs="Arial"/>
+          <w:color w:val="000000" w:themeColor="text1"/>
+        </w:rPr>
+        <w:t xml:space="preserve"> Son un conjunto de actividades o procedimientos definidos como prioritarios, cuya no disponibilidad compromete la existencia de la entidad, la continuidad de sus procesos críticos identificados en el Análisis de Impacto del Negocio (BIA), su posición de liquidez o el cumplimiento de sus obligaciones regulatorias.</w:t>
       </w:r>
     </w:p>
     <w:p>
@@ -2309,49 +2286,14 @@
           <w:b/>
           <w:color w:val="000000" w:themeColor="text1"/>
         </w:rPr>
-        <w:t>Procesos Críticos:</w:t>
-      </w:r>
-      <w:r>
-        <w:rPr>
-          <w:rFonts w:ascii="Arial" w:hAnsi="Arial" w:cs="Arial"/>
-          <w:color w:val="000000" w:themeColor="text1"/>
-        </w:rPr>
-        <w:t xml:space="preserve"> Son los procesos dentro de la Cooperativa que se han defini</w:t>
-      </w:r>
-      <w:r>
-        <w:rPr>
-          <w:rFonts w:ascii="Arial" w:hAnsi="Arial" w:cs="Arial"/>
-          <w:color w:val="000000" w:themeColor="text1"/>
-        </w:rPr>
-        <w:t>do</w:t>
-      </w:r>
-      <w:r>
-        <w:rPr>
-          <w:rFonts w:ascii="Arial" w:hAnsi="Arial" w:cs="Arial"/>
-          <w:color w:val="000000" w:themeColor="text1"/>
-        </w:rPr>
-        <w:t xml:space="preserve"> como prioritarios para la entrega de productos y servicios y </w:t>
-      </w:r>
-      <w:r>
-        <w:rPr>
-          <w:rFonts w:ascii="Arial" w:hAnsi="Arial" w:cs="Arial"/>
-          <w:color w:val="000000" w:themeColor="text1"/>
-        </w:rPr>
-        <w:t>cuya</w:t>
-      </w:r>
-      <w:r>
-        <w:rPr>
-          <w:rFonts w:ascii="Arial" w:hAnsi="Arial" w:cs="Arial"/>
-          <w:color w:val="000000" w:themeColor="text1"/>
-        </w:rPr>
-        <w:t xml:space="preserve"> interrupción detiene la continuidad del negocio</w:t>
-      </w:r>
-      <w:r>
-        <w:rPr>
-          <w:rFonts w:ascii="Arial" w:hAnsi="Arial" w:cs="Arial"/>
-          <w:color w:val="000000" w:themeColor="text1"/>
-        </w:rPr>
-        <w:t>, conforme al Análisis de Impacto al Negocio (BIA) del Sistema de Gestión de la Continuidad del Negocio (NRP-24).</w:t>
+        <w:t xml:space="preserve">Procesos Críticos:</w:t>
+      </w:r>
+      <w:r>
+        <w:rPr>
+          <w:rFonts w:ascii="Arial" w:hAnsi="Arial" w:cs="Arial"/>
+          <w:color w:val="000000" w:themeColor="text1"/>
+        </w:rPr>
+        <w:t xml:space="preserve"> Son los procesos dentro de la Cooperativa que se han definido como prioritarios para la entrega de productos y servicios y cuya interrupción detiene la continuidad del negocio, conforme al Análisis de Impacto del Negocio (BIA) del Sistema de Gestión de la Continuidad del Negocio (NRP-24).</w:t>
       </w:r>
     </w:p>
     <w:p>
@@ -2654,7 +2596,7 @@
           <w:rFonts w:ascii="Arial" w:hAnsi="Arial" w:cs="Arial"/>
           <w:color w:val="000000" w:themeColor="text1"/>
         </w:rPr>
-        <w:t xml:space="preserve"> Posibilidad de incurrir en pérdidas derivadas de fallas, deficiencias, obsolescencia o uso inadecuado de la infraestructura tecnológica, sistemas de información, aplicaciones, redes y demás canales tecnológicos, incluyendo los provistos o administrados por terceros. Forma parte del riesgo operacional, conforme a la NRP-20 y la NRP-42.</w:t>
+        <w:t xml:space="preserve"> Posibilidad de incurrir en pérdidas derivadas de fallas, deficiencias, obsolescencia o uso inadecuado de la infraestructura tecnológica, sistemas de información, aplicaciones, redes y demás canales tecnológicos, incluyendo los provistos o administrados por terceros. Forma parte del riesgo operacional, como factor de tecnología de información (NRP-42).</w:t>
       </w:r>
     </w:p>
     <w:p>
@@ -2689,21 +2631,14 @@
           <w:b/>
           <w:color w:val="000000" w:themeColor="text1"/>
         </w:rPr>
-        <w:t>Riesgo Operacional (NRP-42):</w:t>
-      </w:r>
-      <w:r>
-        <w:rPr>
-          <w:rFonts w:ascii="Arial" w:hAnsi="Arial" w:cs="Arial"/>
-          <w:color w:val="000000" w:themeColor="text1"/>
-        </w:rPr>
-        <w:t xml:space="preserve"> </w:t>
-      </w:r>
-      <w:r>
-        <w:rPr>
-          <w:rFonts w:ascii="Arial" w:hAnsi="Arial" w:cs="Arial"/>
-          <w:color w:val="000000" w:themeColor="text1"/>
-        </w:rPr>
-        <w:t>Posibilidad de incurrir en pérdidas debido a fallas o inadecuaciones en los procesos, las personas, los sistemas de información o por eventos externos, incluyendo el riesgo legal.</w:t>
+        <w:t xml:space="preserve">Riesgo Operacional (NRP-20 y NRP-42):</w:t>
+      </w:r>
+      <w:r>
+        <w:rPr>
+          <w:rFonts w:ascii="Arial" w:hAnsi="Arial" w:cs="Arial"/>
+          <w:color w:val="000000" w:themeColor="text1"/>
+        </w:rPr>
+        <w:t xml:space="preserve"> Posibilidad de incurrir en pérdidas debido a fallas en los procesos, en las personas, en los sistemas de información y a causa de acontecimientos externos; incluye el riesgo legal.</w:t>
       </w:r>
     </w:p>
     <w:p>
@@ -2963,14 +2898,14 @@
           <w:b/>
           <w:color w:val="000000" w:themeColor="text1"/>
         </w:rPr>
-        <w:t xml:space="preserve">Tiempo Objetivo de Recuperación (RTO) y Punto Objetivo de Recuperación (RPO):</w:t>
-      </w:r>
-      <w:r>
-        <w:rPr>
-          <w:rFonts w:ascii="Arial" w:hAnsi="Arial" w:cs="Arial"/>
-          <w:color w:val="000000" w:themeColor="text1"/>
-        </w:rPr>
-        <w:t xml:space="preserve"> Parámetros de recuperación definidos en el Análisis de Impacto al Negocio (BIA) del Sistema de Gestión de la Continuidad del Negocio (NRP-24), que el servicio tercerizado y el plan de continuidad del proveedor deben cumplir.</w:t>
+        <w:t xml:space="preserve">Tiempo Objetivo de Recuperación (RTO), Punto Objetivo de Recuperación (RPO) y Máximo Período Tolerable de Disrupción (MTPD):</w:t>
+      </w:r>
+      <w:r>
+        <w:rPr>
+          <w:rFonts w:ascii="Arial" w:hAnsi="Arial" w:cs="Arial"/>
+          <w:color w:val="000000" w:themeColor="text1"/>
+        </w:rPr>
+        <w:t xml:space="preserve"> Parámetros definidos en el Análisis de Impacto del Negocio (BIA) conforme a la NRP-24. El RTO es el tiempo establecido para reanudar la entrega de un producto o servicio luego de un incidente de interrupción; el RPO es la máxima pérdida de datos admisible para que continúe siendo factible reanudar una operación; y el MTPD es el tiempo que le tomaría a los impactos adversos volverse inaceptables para la Cooperativa. El servicio tercerizado y el plan de continuidad del proveedor deben ser consistentes con estos parámetros.</w:t>
       </w:r>
     </w:p>
     <w:p>
@@ -3005,21 +2940,14 @@
           <w:b/>
           <w:color w:val="000000" w:themeColor="text1"/>
         </w:rPr>
-        <w:t>Apetito y Tolerancia al Riesgo:</w:t>
-      </w:r>
-      <w:r>
-        <w:rPr>
-          <w:rFonts w:ascii="Arial" w:hAnsi="Arial" w:cs="Arial"/>
-          <w:color w:val="000000" w:themeColor="text1"/>
-        </w:rPr>
-        <w:t xml:space="preserve"> </w:t>
-      </w:r>
-      <w:r>
-        <w:rPr>
-          <w:rFonts w:ascii="Arial" w:hAnsi="Arial" w:cs="Arial"/>
-          <w:color w:val="000000" w:themeColor="text1"/>
-        </w:rPr>
-        <w:t>Nivel de riesgo que la Cooperativa está dispuesta a asumir, y su desviación máxima aceptable, aprobados por el Consejo de Administración conforme a la NRP-20 y la NRP-17.</w:t>
+        <w:t xml:space="preserve">Apetito y Tolerancia al Riesgo:</w:t>
+      </w:r>
+      <w:r>
+        <w:rPr>
+          <w:rFonts w:ascii="Arial" w:hAnsi="Arial" w:cs="Arial"/>
+          <w:color w:val="000000" w:themeColor="text1"/>
+        </w:rPr>
+        <w:t xml:space="preserve"> El apetito de riesgo es el nivel y los tipos de riesgos que la Cooperativa está dispuesta a asumir en relación a sus actividades, para alcanzar sus objetivos estratégicos y planes de negocio; la tolerancia al riesgo son los niveles de toma de riesgos aceptables para lograr un objetivo específico o administrar una categoría de riesgo. Ambos son aprobados por el Consejo de Administración (NRP-20).</w:t>
       </w:r>
     </w:p>
     <w:p>
@@ -3061,7 +2989,7 @@
           <w:rFonts w:ascii="Arial" w:hAnsi="Arial" w:cs="Arial"/>
           <w:color w:val="000000" w:themeColor="text1"/>
         </w:rPr>
-        <w:t xml:space="preserve"> Registro consolidado y actualizado de todos los servicios críticos tercerizados de la Cooperativa, que sirve de insumo para la gestión del riesgo operacional (NRP-42).</w:t>
+        <w:t xml:space="preserve"> Control centralizado de los servicios prestados por terceros que, conforme a la NRP-42, contiene como mínimo el nombre del proveedor, el tipo de servicio, el monto del contrato, la contraparte dentro de la Cooperativa y su vigencia, y que debe estar a disposición de la Superintendencia en el momento que ésta lo requiera.</w:t>
       </w:r>
     </w:p>
     <w:p>
@@ -3206,7 +3134,7 @@
           <w:rFonts w:ascii="Arial" w:hAnsi="Arial" w:cs="Arial"/>
           <w:color w:val="000000"/>
         </w:rPr>
-        <w:t xml:space="preserve">Aprobar el apetito y la tolerancia al riesgo aplicables a la tercerización, incluyendo los límites de concentración por proveedor y los criterios de exposición de contraparte (NRP-17 y NRP-20).</w:t>
+        <w:t xml:space="preserve">Aprobar el apetito y la tolerancia al riesgo aplicables a la tercerización, incluyendo los límites de concentración por proveedor y los criterios de exposición de contraparte (NRP-20).</w:t>
       </w:r>
     </w:p>
     <w:p>
@@ -3617,7 +3545,7 @@
           <w:rFonts w:ascii="Arial" w:hAnsi="Arial" w:cs="Arial"/>
           <w:color w:val="000000"/>
         </w:rPr>
-        <w:t xml:space="preserve">Elaborar la evaluación integral de riesgos previa a la contratación, que incluya riesgo operacional (NRP-42), riesgo tecnológico (NRP-20), riesgo de concentración y contraparte (NRP-20), impacto en liquidez (NRP-05) y riesgo de continuidad (NRP-24), proponiendo los mecanismos de mitigación correspondientes.</w:t>
+        <w:t xml:space="preserve">Elaborar la evaluación integral de riesgos previa a la contratación, que incluya riesgo operacional, incluyendo el tecnológico y el legal (NRP-42), riesgo reputacional (NRP-20), riesgo de concentración (NRP-23) y de contraparte del proveedor (NRP-42), impacto en liquidez (NRP-05) y riesgo de continuidad (NRP-24), proponiendo los mecanismos de mitigación correspondientes.</w:t>
       </w:r>
     </w:p>
     <w:p>
@@ -3869,7 +3797,7 @@
           <w:rFonts w:ascii="Arial" w:hAnsi="Arial" w:cs="Arial"/>
           <w:color w:val="000000" w:themeColor="text1"/>
         </w:rPr>
-        <w:t xml:space="preserve">Asesorar a los Gerentes y Jefes en la verificación del servicio a contratar, para que se cumpla con las condiciones establecidas en el Anexo 1 de la presente política.</w:t>
+        <w:t xml:space="preserve">Asesorar a los Gerentes y Jefes en la verificación del servicio a contratar, para que se cumpla con las condiciones establecidas en el Anexo 1 (Condiciones para tercerizar Actividades u Operaciones de Tecnología de la Información relacionadas a productos y servicios financieros) de la presente política, referidas en las Normas Técnicas para la Gestión de la Seguridad de la Información (NRP-23).</w:t>
       </w:r>
     </w:p>
     <w:p>
@@ -4588,7 +4516,7 @@
           <w:rFonts w:ascii="Arial" w:hAnsi="Arial" w:cs="Arial"/>
           <w:color w:val="000000"/>
         </w:rPr>
-        <w:t xml:space="preserve">Responsable de completar y actualizar la “Matriz Centralizada de Servicios Críticos Tercerizados” con la información requerida por el Departamento de Administración de Riesgos para la gestión del riesgo operacional, conforme a las Normas Técnicas para la Gestión del Riesgo Operacional en las Entidades Financieras (NRP-42).</w:t>
+        <w:t xml:space="preserve">Responsable de completar y actualizar la “Matriz Centralizada de Servicios Críticos Tercerizados” con los campos definidos en las Normas Técnicas para la Gestión del Riesgo Operacional de las Entidades Financieras (NRP-42): nombre del proveedor, tipo de servicio, monto del contrato, contraparte dentro de la Cooperativa y vigencia.</w:t>
       </w:r>
     </w:p>
     <w:p>
@@ -5140,7 +5068,7 @@
                 <w:rFonts w:ascii="Arial" w:hAnsi="Arial" w:cs="Arial"/>
                 <w:color w:val="000000"/>
               </w:rPr>
-              <w:t xml:space="preserve">Las demoras o incidentes del proveedor del servicio interrumpen total o parcialmente la operatividad de los procesos críticos, por encima de los tiempos de recuperación definidos en el Análisis de Impacto al Negocio (BIA) (NRP-24).</w:t>
+              <w:t xml:space="preserve">Las demoras o incidentes del proveedor del servicio interrumpen total o parcialmente la operatividad de los procesos críticos, por encima del Máximo Período Tolerable de Disrupción (MTPD) definido en el Análisis de Impacto del Negocio (BIA) (NRP-24).</w:t>
             </w:r>
           </w:p>
           <w:p>
@@ -5271,7 +5199,7 @@
                 <w:b/>
                 <w:color w:val="000000"/>
               </w:rPr>
-              <w:t>Riesgo tecnológico (NRP-20):</w:t>
+              <w:t xml:space="preserve">Riesgo tecnológico (NRP-42):</w:t>
             </w:r>
             <w:r>
               <w:rPr>
@@ -5302,7 +5230,7 @@
                 <w:b/>
                 <w:color w:val="000000"/>
               </w:rPr>
-              <w:t xml:space="preserve">Concentración y contraparte (NRP-20):</w:t>
+              <w:t xml:space="preserve">Concentración y contraparte (NRP-23 / NRP-42):</w:t>
             </w:r>
             <w:r>
               <w:rPr>
@@ -5723,7 +5651,7 @@
         <w:rPr>
           <w:rFonts w:ascii="Arial" w:hAnsi="Arial" w:cs="Arial"/>
         </w:rPr>
-        <w:t xml:space="preserve">Cuando cada Gerente y/o Jefatura, en coordinación con la Gerencia de Sistemas, determine la necesidad de efectuar sustituciones o reemplazos de sistemas informáticos principales, sean estos sistemas gestores de bases de datos o aplicaciones, o la adquisición de sistemas informáticos para nuevas operaciones, productos o servicios financieros que la Cooperativa ofrece a sus asociados y clientes, deberán presentar al Consejo de Administración la siguiente información:</w:t>
+        <w:t xml:space="preserve">Cuando cada Gerente y/o Jefatura, en coordinación con la Gerencia de Sistemas, determine la necesidad de efectuar sustituciones, reemplazos o cambios importantes de sistemas informáticos principales, sean estos sistemas gestores de bases de datos o aplicaciones, o la adquisición de infraestructura y/o sistemas informáticos para nuevas operaciones, productos o servicios financieros que la Cooperativa ofrece a sus asociados y clientes, deberán presentar al Consejo de Administración la siguiente información, quien resolverá dejando constancia de su decisión en el Acta de Sesión correspondiente (NRP-23, art. 22):</w:t>
       </w:r>
     </w:p>
     <w:p>
@@ -5905,7 +5833,7 @@
           <w:rFonts w:ascii="Arial" w:eastAsiaTheme="minorEastAsia" w:hAnsi="Arial" w:cs="Arial"/>
           <w:lang w:val="es-MX" w:eastAsia="es-MX"/>
         </w:rPr>
-        <w:t xml:space="preserve">Para la tercerización de actividades como las detalladas en el párrafo anterior, el Administrador de contrato deberá solicitar al proveedor del servicio la documentación descrita en el Anexo No. 1, así como lo establecido en el Manual de Compras de Bienes y Servicios (RP-GA-M-001), la cual deberá consolidarse y enviarse a Servicios Generales para archivarla en el expediente.</w:t>
+        <w:t xml:space="preserve">Para la tercerización de actividades como las detalladas en el párrafo anterior, el Administrador de contrato deberá solicitar al proveedor del servicio la documentación descrita en el Anexo No. 1, así como lo establecido en el Manual de Compras de Bienes y Servicios (RP-GA-M-001), la cual deberá consolidarse y enviarse a Servicios Generales para archivarla en el expediente. Conforme a la NRP-23, la información antes detallada deberá remitirse a la Superintendencia con quince días hábiles de anticipación a la puesta en producción; asimismo, las condiciones del Anexo No. 1 deberán documentarse en un informe, acompañado de un cronograma de actividades con plazos, responsables e hitos de control, que se remitirá a la Superintendencia con quince días hábiles de anticipación a la puesta en producción de la actividad tercerizada.</w:t>
       </w:r>
     </w:p>
     <w:p>
@@ -6069,7 +5997,7 @@
           <w:rFonts w:ascii="Arial" w:hAnsi="Arial" w:cs="Arial"/>
           <w:b/>
         </w:rPr>
-        <w:t>Riesgo tecnológico (NRP-20):</w:t>
+        <w:t xml:space="preserve">Riesgo tecnológico (NRP-42):</w:t>
       </w:r>
       <w:r>
         <w:rPr>
@@ -6097,13 +6025,13 @@
           <w:rFonts w:ascii="Arial" w:hAnsi="Arial" w:cs="Arial"/>
           <w:b/>
         </w:rPr>
-        <w:t xml:space="preserve">Riesgo de concentración (NRP-20):</w:t>
-      </w:r>
-      <w:r>
-        <w:rPr>
-          <w:rFonts w:ascii="Arial" w:hAnsi="Arial" w:cs="Arial"/>
-        </w:rPr>
-        <w:t xml:space="preserve"> número de servicios críticos asignados al mismo proveedor o grupo económico, dependencia tecnológica, concentración geográfica y disponibilidad de proveedores alternos en el mercado. Ningún proveedor o grupo económico podrá superar los límites de concentración aprobados por el Consejo de Administración sin la aprobación expresa de éste.</w:t>
+        <w:t xml:space="preserve">Riesgo de concentración (NRP-23):</w:t>
+      </w:r>
+      <w:r>
+        <w:rPr>
+          <w:rFonts w:ascii="Arial" w:hAnsi="Arial" w:cs="Arial"/>
+        </w:rPr>
+        <w:t xml:space="preserve"> número de servicios críticos asignados al mismo proveedor o grupo económico, concentración de entidades financieras en el mismo proveedor, dependencia tecnológica, concentración geográfica y disponibilidad de proveedores alternos en el mercado, estableciendo los mecanismos de mitigación y las acciones a realizar si el proveedor falla. Ningún proveedor o grupo económico podrá superar los límites de concentración aprobados por el Consejo de Administración (NRP-20) sin la aprobación expresa de éste.</w:t>
       </w:r>
     </w:p>
     <w:p>
@@ -6125,7 +6053,7 @@
           <w:rFonts w:ascii="Arial" w:hAnsi="Arial" w:cs="Arial"/>
           <w:b/>
         </w:rPr>
-        <w:t xml:space="preserve">Riesgo de contraparte (NRP-20):</w:t>
+        <w:t xml:space="preserve">Riesgo de contraparte (NRP-42):</w:t>
       </w:r>
       <w:r>
         <w:rPr>
@@ -6209,7 +6137,7 @@
           <w:rFonts w:ascii="Arial" w:hAnsi="Arial" w:cs="Arial"/>
           <w:b/>
         </w:rPr>
-        <w:t xml:space="preserve">Riesgo legal y reputacional:</w:t>
+        <w:t xml:space="preserve">Riesgo legal y reputacional (NRP-20):</w:t>
       </w:r>
       <w:r>
         <w:rPr>
@@ -6291,7 +6219,7 @@
           <w:color w:val="000000"/>
           <w:lang w:eastAsia="es-MX"/>
         </w:rPr>
-        <w:t xml:space="preserve"> la evaluación de riesgos no concluye con la contratación. El Departamento de Administración de Riesgos reevaluará semestralmente a los proveedores de criticidad Alta y anualmente a los de criticidad Media y Baja, considerando la información financiera disponible del proveedor, el cumplimiento de los ANS, los eventos de riesgo operacional registrados y los resultados de las pruebas de continuidad y de seguridad de la información. Los resultados se informarán al Comité de Riesgos.</w:t>
+        <w:t xml:space="preserve"> la evaluación de riesgos no concluye con la contratación. El Departamento de Administración de Riesgos reevaluará semestralmente a los proveedores de criticidad Alta y anualmente a los de criticidad Media y Baja, considerando la debida diligencia del proveedor, la cual deberá documentarse y revisarse anualmente con la información más reciente (NRP-23), el cumplimiento de los ANS, los eventos de riesgo operacional registrados y los resultados de las pruebas de continuidad y de seguridad de la información. Los resultados se informarán al Comité de Riesgos.</w:t>
       </w:r>
     </w:p>
     <w:p>
@@ -6850,7 +6778,7 @@
           <w:rFonts w:ascii="Arial" w:hAnsi="Arial" w:cs="Arial"/>
           <w:color w:val="000000"/>
         </w:rPr>
-        <w:t xml:space="preserve">Índice de concentración: número de servicios críticos y porcentaje del gasto en servicios críticos por proveedor o grupo económico (NRP-20).</w:t>
+        <w:t xml:space="preserve">Índice de concentración: número de servicios críticos y porcentaje del gasto en servicios críticos por proveedor o grupo económico (NRP-23).</w:t>
       </w:r>
     </w:p>
     <w:p>
@@ -7036,6 +6964,26 @@
           <w:color w:val="000000"/>
         </w:rPr>
         <w:t xml:space="preserve">Todo evento de riesgo operacional, interrupción, incumplimiento o incidente originado en un proveedor de servicios críticos tercerizados deberá ser reportado por el Administrador de Contrato al Departamento de Administración de Riesgos, para su registro en la base de datos de eventos de riesgo operacional, análisis de causa raíz y seguimiento de planes de acción, conforme a la NRP-42.</w:t>
+      </w:r>
+    </w:p>
+    <w:p>
+      <w:pPr>
+        <w:autoSpaceDE w:val="0"/>
+        <w:autoSpaceDN w:val="0"/>
+        <w:spacing w:line="276" w:lineRule="auto"/>
+        <w:contextualSpacing/>
+        <w:jc w:val="both"/>
+        <w:rPr>
+          <w:rFonts w:ascii="Arial" w:hAnsi="Arial" w:cs="Arial"/>
+          <w:color w:val="000000"/>
+        </w:rPr>
+      </w:pPr>
+      <w:r>
+        <w:rPr>
+          <w:rFonts w:ascii="Arial" w:hAnsi="Arial" w:cs="Arial"/>
+          <w:color w:val="000000"/>
+        </w:rPr>
+        <w:t xml:space="preserve">Cuando el evento sea ocasionado por fallas de las personas o errores operativos en los procesos y afecte de forma masiva cualquier producto financiero que ofrece la Cooperativa, deberá reportarse a la Superintendencia en el momento de su ocurrencia, por medio del responsable designado por el Consejo de Administración, conforme al artículo 21 de la NRP-42.</w:t>
       </w:r>
     </w:p>
     <w:p>
@@ -7223,7 +7171,7 @@
           <w:rFonts w:ascii="Arial" w:hAnsi="Arial" w:cs="Arial"/>
           <w:color w:val="000000" w:themeColor="text1"/>
         </w:rPr>
-        <w:t>La presente política debe ser actualizada por el Departamento de Administración de Riesgos para someterla a validación del Comité de Riesgos y posterior aprobación del Consejo de Administración.</w:t>
+        <w:t xml:space="preserve">La presente política debe ser actualizada por el Departamento de Administración de Riesgos para someterla a validación del Comité de Riesgos y posterior aprobación del Consejo de Administración. Una vez aprobada, deberá remitirse a la Superintendencia dentro de los diez días hábiles siguientes a su aprobación (NRP-20, art. 8).</w:t>
       </w:r>
     </w:p>
     <w:p>
@@ -7443,7 +7391,7 @@
           <w:rFonts w:ascii="Arial" w:hAnsi="Arial" w:cs="Arial"/>
           <w:b/>
         </w:rPr>
-        <w:t xml:space="preserve">Condiciones para tercerizar Actividades u Operaciones de Tecnología de la Información.</w:t>
+        <w:t xml:space="preserve">Condiciones para tercerizar Actividades u Operaciones de Tecnología de la Información relacionadas a productos y servicios financieros.</w:t>
       </w:r>
     </w:p>
     <w:p>
@@ -7690,7 +7638,7 @@
               <w:rPr>
                 <w:rFonts w:ascii="Arial" w:hAnsi="Arial" w:cs="Arial"/>
               </w:rPr>
-              <w:t xml:space="preserve">Realizar una evaluación integral de riesgos a efecto de identificar aquellos riesgos derivados de los servicios a contratar (operacional – NRP-42, tecnológico – NRP-20, continuidad – NRP-24, concentración y contraparte – NRP-20, e impacto en liquidez – NRP-05) y establecer los mecanismos de mitigación apropiados. Evaluar riesgos derivados de la capacidad del proveedor respecto a la concentración de instituciones con el proveedor, así como la concentración de la propia Cooperativa en dicho proveedor y su grupo económico.</w:t>
+              <w:t xml:space="preserve">Realizar una evaluación integral de riesgos a efecto de identificar aquellos riesgos derivados de los servicios a contratar y establecer los mecanismos de mitigación apropiados. La evaluación deberá considerar los riesgos operacionales (incluyendo los tecnológicos y legales), riesgos reputacionales y riesgos financieros, así como la continuidad (NRP-24), la contraparte y el impacto en liquidez (NRP-05). Evaluar los riesgos que se generan como consecuencia de la concentración de entidades financieras en el proveedor, así como la concentración de la propia Cooperativa en dicho proveedor y su grupo económico, estableciendo los mecanismos de mitigación y las acciones a realizar si dicho proveedor falla, considerando, en la medida de lo posible, contratar otros proveedores o contar con otras garantías.</w:t>
             </w:r>
           </w:p>
         </w:tc>
@@ -7889,7 +7837,7 @@
                 <w:rFonts w:ascii="Arial" w:hAnsi="Arial" w:cs="Arial"/>
                 <w:color w:val="000000"/>
               </w:rPr>
-              <w:t xml:space="preserve">Denominación o Razón social y giro del negocio, experiencia, servicios, clientes (personas jurídicas), periodos de servicio, entre otros.</w:t>
+              <w:t xml:space="preserve">Denominación o Razón social y giro del negocio, experiencia, servicios, clientes (personas jurídicas), periodos de servicio, entre otros. Para el caso de un proveedor local, nómina de accionistas y principales funcionarios.</w:t>
             </w:r>
           </w:p>
         </w:tc>
@@ -8078,7 +8026,7 @@
                 <w:rFonts w:ascii="Arial" w:hAnsi="Arial" w:cs="Arial"/>
                 <w:color w:val="000000" w:themeColor="text1"/>
               </w:rPr>
-              <w:t xml:space="preserve">La entidad deberá realizar la debida diligencia de dicho proveedor sobre:</w:t>
+              <w:t xml:space="preserve">La entidad deberá realizar la debida diligencia de dicho proveedor, la cual deberá documentarse y revisarse anualmente utilizando la información más reciente, sobre:</w:t>
               <w:br/>
               <w:t xml:space="preserve">1. Solidez financiera.</w:t>
             </w:r>
@@ -8736,6 +8684,100 @@
                 <w:color w:val="000000"/>
               </w:rPr>
               <w:t>Depto. de Administración de Riesgos.</w:t>
+            </w:r>
+          </w:p>
+        </w:tc>
+      </w:tr>
+      <w:tr>
+        <w:trPr>
+          <w:trHeight w:val="559"/>
+        </w:trPr>
+        <w:tc>
+          <w:tcPr>
+            <w:tcW w:w="261" w:type="pct"/>
+            <w:tcBorders>
+              <w:top w:val="nil"/>
+              <w:left w:val="nil"/>
+              <w:bottom w:val="nil"/>
+              <w:right w:val="nil"/>
+            </w:tcBorders>
+            <w:shd w:val="clear" w:color="000000" w:fill="305496"/>
+            <w:noWrap/>
+            <w:vAlign w:val="bottom"/>
+            <w:hideMark/>
+          </w:tcPr>
+          <w:p>
+            <w:pPr>
+              <w:spacing w:line="276" w:lineRule="auto"/>
+              <w:jc w:val="both"/>
+              <w:rPr>
+                <w:rFonts w:ascii="Arial" w:hAnsi="Arial" w:cs="Arial"/>
+                <w:color w:val="FFFFFF" w:themeColor="background1"/>
+              </w:rPr>
+            </w:pPr>
+            <w:r>
+              <w:rPr>
+                <w:rFonts w:ascii="Arial" w:hAnsi="Arial" w:cs="Arial"/>
+                <w:color w:val="FFFFFF" w:themeColor="background1"/>
+              </w:rPr>
+              <w:t xml:space="preserve">7</w:t>
+            </w:r>
+          </w:p>
+        </w:tc>
+        <w:tc>
+          <w:tcPr>
+            <w:tcW w:w="3453" w:type="pct"/>
+            <w:tcBorders>
+              <w:top w:val="nil"/>
+              <w:left w:val="single" w:sz="4" w:space="0" w:color="auto"/>
+              <w:bottom w:val="single" w:sz="4" w:space="0" w:color="auto"/>
+              <w:right w:val="single" w:sz="4" w:space="0" w:color="auto"/>
+            </w:tcBorders>
+            <w:vAlign w:val="center"/>
+            <w:hideMark/>
+          </w:tcPr>
+          <w:p>
+            <w:pPr>
+              <w:spacing w:line="276" w:lineRule="auto"/>
+              <w:rPr>
+                <w:rFonts w:ascii="Arial" w:hAnsi="Arial" w:cs="Arial"/>
+                <w:color w:val="000000"/>
+              </w:rPr>
+            </w:pPr>
+            <w:r>
+              <w:rPr>
+                <w:rFonts w:ascii="Arial" w:hAnsi="Arial" w:cs="Arial"/>
+                <w:color w:val="000000"/>
+              </w:rPr>
+              <w:t xml:space="preserve">Verificar que se puede requerir al proveedor del servicio informes de auditoría vigentes y asociados a los servicios prestados, los cuales deberán ser provistos a requerimiento de la Superintendencia.</w:t>
+            </w:r>
+          </w:p>
+        </w:tc>
+        <w:tc>
+          <w:tcPr>
+            <w:tcW w:w="1286" w:type="pct"/>
+            <w:tcBorders>
+              <w:top w:val="nil"/>
+              <w:left w:val="nil"/>
+              <w:bottom w:val="single" w:sz="4" w:space="0" w:color="auto"/>
+              <w:right w:val="single" w:sz="4" w:space="0" w:color="auto"/>
+            </w:tcBorders>
+            <w:hideMark/>
+          </w:tcPr>
+          <w:p>
+            <w:pPr>
+              <w:jc w:val="both"/>
+              <w:rPr>
+                <w:rFonts w:ascii="Arial" w:hAnsi="Arial" w:cs="Arial"/>
+                <w:color w:val="000000"/>
+              </w:rPr>
+            </w:pPr>
+            <w:r>
+              <w:rPr>
+                <w:rFonts w:ascii="Arial" w:hAnsi="Arial" w:cs="Arial"/>
+                <w:color w:val="000000"/>
+              </w:rPr>
+              <w:t xml:space="preserve">Administrador de Contrato.</w:t>
             </w:r>
           </w:p>
         </w:tc>
@@ -9449,7 +9491,7 @@
                 <w:rFonts w:ascii="Arial" w:hAnsi="Arial" w:cs="Arial"/>
                 <w:color w:val="000000" w:themeColor="text1"/>
               </w:rPr>
-              <w:t xml:space="preserve">La obligación del proveedor del servicio de informar, de forma inmediata, a COMEDICA de R.L. sobre cualquier evento o situación que pudiera afectar significativamente la prestación del servicio.</w:t>
+              <w:t xml:space="preserve">La obligación del proveedor del servicio de informar, en cuanto le sea posible, a COMEDICA de R.L. sobre cualquier evento o situación que pudiera afectar significativamente la prestación del servicio.</w:t>
             </w:r>
           </w:p>
         </w:tc>
@@ -9650,7 +9692,7 @@
                 <w:rFonts w:ascii="Arial" w:hAnsi="Arial" w:cs="Arial"/>
                 <w:color w:val="000000" w:themeColor="text1"/>
               </w:rPr>
-              <w:t xml:space="preserve">Obligación de establecer acuerdos de no revelación por el personal subcontratado por el proveedor relacionados con el manejo de la información de COMEDICA de R.L.</w:t>
+              <w:t xml:space="preserve">Obligación de establecer acuerdos de no revelación, de ser el caso, por el personal subcontratado por el proveedor relacionados con el manejo de la información de COMEDICA de R.L.</w:t>
             </w:r>
           </w:p>
         </w:tc>
@@ -10053,7 +10095,7 @@
                 <w:rFonts w:ascii="Arial" w:hAnsi="Arial" w:cs="Arial"/>
                 <w:color w:val="000000" w:themeColor="text1"/>
               </w:rPr>
-              <w:t xml:space="preserve">Cuando sea aplicable, el proveedor debe hacer constar que la información y el procesamiento o almacenamiento objeto de la contratación se encuentran efectivamente aislados en todo momento, de tal forma que no exista comunicación o conectividad con la información de otros clientes del proveedor o del subcontratado.</w:t>
+              <w:t xml:space="preserve">Cuando sea aplicable, el proveedor debe hacer constar que la información y el procesamiento o almacenamiento objeto de la contratación se encuentran efectivamente aislados en todo momento, de tal forma que no exista comunicación o conectividad con la información de otros clientes del proveedor subcontratado.</w:t>
             </w:r>
           </w:p>
         </w:tc>
@@ -10327,7 +10369,7 @@
                 <w:rFonts w:ascii="Arial" w:hAnsi="Arial" w:cs="Arial"/>
                 <w:color w:val="000000" w:themeColor="text1"/>
               </w:rPr>
-              <w:t xml:space="preserve">En caso de resolución, intervención o liquidación de la Cooperativa, el contrato deberá garantizar que la Superintendencia tenga acceso a los datos o información.</w:t>
+              <w:t xml:space="preserve">En caso de resolución, intervención o liquidación de COMEDICA de R.L., establecer los procesos para garantizar que la Superintendencia tenga acceso a los datos o información.</w:t>
             </w:r>
           </w:p>
         </w:tc>
@@ -10365,6 +10407,73 @@
                 <w:color w:val="FFFFFF" w:themeColor="background1"/>
               </w:rPr>
               <w:t xml:space="preserve">22</w:t>
+            </w:r>
+          </w:p>
+        </w:tc>
+        <w:tc>
+          <w:tcPr>
+            <w:tcW w:w="4735" w:type="pct"/>
+            <w:tcBorders>
+              <w:top w:val="single" w:sz="4" w:space="0" w:color="auto"/>
+              <w:left w:val="single" w:sz="4" w:space="0" w:color="auto"/>
+              <w:bottom w:val="single" w:sz="4" w:space="0" w:color="auto"/>
+              <w:right w:val="single" w:sz="4" w:space="0" w:color="auto"/>
+            </w:tcBorders>
+            <w:vAlign w:val="bottom"/>
+            <w:hideMark/>
+          </w:tcPr>
+          <w:p>
+            <w:pPr>
+              <w:spacing w:line="276" w:lineRule="auto"/>
+              <w:jc w:val="both"/>
+              <w:rPr>
+                <w:rFonts w:ascii="Arial" w:hAnsi="Arial" w:cs="Arial"/>
+                <w:color w:val="000000"/>
+              </w:rPr>
+            </w:pPr>
+            <w:r>
+              <w:rPr>
+                <w:rFonts w:ascii="Arial" w:hAnsi="Arial" w:cs="Arial"/>
+                <w:color w:val="000000"/>
+              </w:rPr>
+              <w:t xml:space="preserve">Garantizar la devolución y destrucción o borrado seguro de la información involucrada en la prestación del servicio en caso de que lo solicite COMEDICA de R.L. o ante la terminación del contrato, y tratamiento de la misma, a fin de proteger los derechos de los asociados.</w:t>
+            </w:r>
+          </w:p>
+        </w:tc>
+      </w:tr>
+      <w:tr>
+        <w:trPr>
+          <w:trHeight w:val="600"/>
+        </w:trPr>
+        <w:tc>
+          <w:tcPr>
+            <w:tcW w:w="265" w:type="pct"/>
+            <w:tcBorders>
+              <w:top w:val="single" w:sz="4" w:space="0" w:color="auto"/>
+              <w:left w:val="single" w:sz="4" w:space="0" w:color="auto"/>
+              <w:bottom w:val="single" w:sz="4" w:space="0" w:color="auto"/>
+              <w:right w:val="nil"/>
+            </w:tcBorders>
+            <w:shd w:val="clear" w:color="000000" w:fill="305496"/>
+            <w:noWrap/>
+            <w:vAlign w:val="bottom"/>
+            <w:hideMark/>
+          </w:tcPr>
+          <w:p>
+            <w:pPr>
+              <w:spacing w:line="276" w:lineRule="auto"/>
+              <w:jc w:val="both"/>
+              <w:rPr>
+                <w:rFonts w:ascii="Arial" w:hAnsi="Arial" w:cs="Arial"/>
+                <w:color w:val="FFFFFF" w:themeColor="background1"/>
+              </w:rPr>
+            </w:pPr>
+            <w:r>
+              <w:rPr>
+                <w:rFonts w:ascii="Arial" w:hAnsi="Arial" w:cs="Arial"/>
+                <w:color w:val="FFFFFF" w:themeColor="background1"/>
+              </w:rPr>
+              <w:t xml:space="preserve">23</w:t>
             </w:r>
           </w:p>
         </w:tc>
@@ -11809,7 +11918,7 @@
                 <w:sz w:val="20"/>
                 <w:szCs w:val="20"/>
               </w:rPr>
-              <w:t xml:space="preserve">Se realizan las siguientes modificaciones: Se sustituye Comité de Administración de Riesgos por Comité de Riesgos y NPB4-50 por NRP-42. I. PROPÓSITO: se amplía y se incorpora la alineación con NRP-20, NRP-42, NRP-24, NRP-23, NRP-17 y NRP-05. II. ALCANCE: se amplía al ciclo de vida del servicio y a servicios de otra naturaleza, y se incorporan nuevas normativas. III. DEFINICIONES: se actualizan definiciones y se incorporan riesgo tecnológico, riesgo operacional, riesgo de tercerización, riesgo de concentración de proveedores, riesgo de contraparte, impacto en liquidez, ANS, RTO/RPO, apetito y tolerancia al riesgo y Matriz Centralizada de Servicios Críticos Tercerizados. IV. RESPONSABILIDADES: se incorporan responsabilidades del Consejo de Administración, Comité de Riesgos y Jefe de Administración de Riesgos en la gestión de riesgos de tercerización; se actualizan las del Administrador de Contrato y Jefe de Servicios Generales en lo relativo al reporte de eventos de riesgo operacional y a la Matriz Centralizada. V. CRITERIOS: se incorporan criterios de riesgo tecnológico, concentración y contraparte e impacto en liquidez, niveles de criticidad y reevaluación. VII. se amplía la evaluación de riesgos y se establece el monitoreo continuo. Se incorporan los apartados XI. Monitoreo, Indicadores Clave de Riesgo y Reportes, y XII. Gestión de Eventos de Riesgo Operacional Originados en Proveedores. XIII. ACTUALIZACIÓN: se establece revisión al menos anual. XVI. DISPOSICIÓN FINAL: se incorpora la opinión previa del Comité de Riesgos. ANEXO 1: Sección A, se actualiza el numeral 1 y se incorpora el numeral 6; Sección B, se incorpora el acceso del Departamento de Administración de Riesgos en el numeral 20 y se incorpora el numeral 22.</w:t>
+              <w:t xml:space="preserve">Se realizan las siguientes modificaciones: Se sustituye Comité de Administración de Riesgos por Comité de Riesgos y NPB4-50 por NRP-42. I. PROPÓSITO: se amplía y se incorpora la alineación con NRP-20, NRP-42, NRP-24, NRP-23, NRP-17 y NRP-05. II. ALCANCE: se amplía al ciclo de vida del servicio y a servicios de otra naturaleza, y se incorporan nuevas normativas. III. DEFINICIONES: se actualizan definiciones conforme a NRP-20, NRP-24 y NRP-42, y se incorporan riesgo tecnológico, riesgo operacional, riesgo de tercerización, riesgo de concentración de proveedores, riesgo de contraparte, impacto en liquidez, ANS, RTO/RPO/MTPD, apetito y tolerancia al riesgo y Matriz Centralizada de Servicios Críticos Tercerizados. IV. RESPONSABILIDADES: se incorporan responsabilidades del Consejo de Administración, Comité de Riesgos y Jefe de Administración de Riesgos en la gestión de riesgos de tercerización; se actualizan las del Administrador de Contrato en lo relativo al reporte de eventos de riesgo operacional y las del Jefe de Servicios Generales en lo relativo a los campos de la Matriz Centralizada (NRP-42, art. 4). V. CRITERIOS: se incorporan criterios de riesgo tecnológico, concentración y contraparte e impacto en liquidez, niveles de criticidad y reevaluación. VI. se actualiza conforme a la NRP-23 (arts. 22 y 26). VII. se amplía la evaluación de riesgos y se establece el monitoreo continuo. Se incorporan los apartados XI. Monitoreo, Indicadores Clave de Riesgo y Reportes, y XII. Gestión de Eventos de Riesgo Operacional Originados en Proveedores. XIII. ACTUALIZACIÓN: se establece revisión al menos anual. XIV. APROBACIÓN: se incorpora la remisión a la Superintendencia (NRP-20, art. 8). XVI. DISPOSICIÓN FINAL: se incorpora la opinión previa del Comité de Riesgos. ANEXO 1: se actualiza conforme a la NRP-23; Sección A, se actualizan los numerales 1, 3 y 5 y se incorporan los numerales 6 y 7; Sección B, se incorpora el acceso del Departamento de Administración de Riesgos en el numeral 20 y se incorporan los numerales 22 y 23.</w:t>
             </w:r>
           </w:p>
         </w:tc>

</xml_diff>

<commit_message>
Replace 'subcontratista' terms with 'contratista' in RP-GG-PL-003 V04
Co-Authored-By: Claude Opus 5.5 <noreply@anthropic.com>
Claude-Session: https://claude.ai/code/session_01PyMC4LRxqsjjU8zCw9m9SH
</commit_message>
<xml_diff>
--- a/politicas/RP-GG-PL-003_Contrat.Servicios_Criticos_Terce_V04_Final.docx
+++ b/politicas/RP-GG-PL-003_Contrat.Servicios_Criticos_Terce_V04_Final.docx
@@ -9224,7 +9224,7 @@
                 <w:rFonts w:ascii="Arial" w:hAnsi="Arial" w:cs="Arial"/>
                 <w:color w:val="000000" w:themeColor="text1"/>
               </w:rPr>
-              <w:t xml:space="preserve">Establecer los niveles de servicio en condiciones normales y de contingencia tras una interrupción; para esto último se deberá garantizar el establecimiento de planes de contingencia y de continuidad del servicio, de tal forma que el proveedor, y subcontratistas si los hubiere, garanticen el cumplimiento de la actividad u operación tercerizada y que el riesgo de tercerización está dentro del nivel determinado como aceptable para la entidad contratante.</w:t>
+              <w:t xml:space="preserve">Establecer los niveles de servicio en condiciones normales y de contingencia tras una interrupción; para esto último se deberá garantizar el establecimiento de planes de contingencia y de continuidad del servicio, de tal forma que el proveedor, y contratistas si los hubiere, garanticen el cumplimiento de la actividad u operación tercerizada y que el riesgo de tercerización está dentro del nivel determinado como aceptable para la entidad contratante.</w:t>
             </w:r>
           </w:p>
         </w:tc>
@@ -9692,7 +9692,7 @@
                 <w:rFonts w:ascii="Arial" w:hAnsi="Arial" w:cs="Arial"/>
                 <w:color w:val="000000" w:themeColor="text1"/>
               </w:rPr>
-              <w:t xml:space="preserve">Obligación de establecer acuerdos de no revelación, de ser el caso, por el personal subcontratado por el proveedor relacionados con el manejo de la información de COMEDICA de R.L.</w:t>
+              <w:t xml:space="preserve">Obligación de establecer acuerdos de no revelación, de ser el caso, por el personal contratado por el proveedor relacionados con el manejo de la información de COMEDICA de R.L.</w:t>
             </w:r>
           </w:p>
         </w:tc>
@@ -10028,7 +10028,7 @@
                 <w:rFonts w:ascii="Arial" w:hAnsi="Arial" w:cs="Arial"/>
                 <w:color w:val="000000" w:themeColor="text1"/>
               </w:rPr>
-              <w:t xml:space="preserve">Para el caso de que el proveedor realice subcontrataciones en los servicios que está ofreciendo a COMEDICA de R.L. deberá considerar los riesgos operacionales (incluyendo los tecnológicos y legales), riesgos reputacionales y riesgos financieros.</w:t>
+              <w:t xml:space="preserve">Para el caso de que el proveedor realice contrataciones en los servicios que está ofreciendo a COMEDICA de R.L. deberá considerar los riesgos operacionales (incluyendo los tecnológicos y legales), riesgos reputacionales y riesgos financieros.</w:t>
             </w:r>
           </w:p>
         </w:tc>
@@ -10095,7 +10095,7 @@
                 <w:rFonts w:ascii="Arial" w:hAnsi="Arial" w:cs="Arial"/>
                 <w:color w:val="000000" w:themeColor="text1"/>
               </w:rPr>
-              <w:t xml:space="preserve">Cuando sea aplicable, el proveedor debe hacer constar que la información y el procesamiento o almacenamiento objeto de la contratación se encuentran efectivamente aislados en todo momento, de tal forma que no exista comunicación o conectividad con la información de otros clientes del proveedor subcontratado.</w:t>
+              <w:t xml:space="preserve">Cuando sea aplicable, el proveedor debe hacer constar que la información y el procesamiento o almacenamiento objeto de la contratación se encuentran efectivamente aislados en todo momento, de tal forma que no exista comunicación o conectividad con la información de otros clientes del proveedor contratado.</w:t>
             </w:r>
           </w:p>
         </w:tc>
@@ -10162,7 +10162,7 @@
                 <w:rFonts w:ascii="Arial" w:hAnsi="Arial" w:cs="Arial"/>
                 <w:color w:val="000000" w:themeColor="text1"/>
               </w:rPr>
-              <w:t xml:space="preserve">El proveedor deberá indicar claramente al subcontratista que COMEDICA </w:t>
+              <w:t xml:space="preserve">El proveedor deberá indicar claramente al contratista que COMEDICA </w:t>
             </w:r>
             <w:r>
               <w:rPr>
@@ -10176,7 +10176,7 @@
                 <w:rFonts w:ascii="Arial" w:hAnsi="Arial" w:cs="Arial"/>
                 <w:color w:val="000000" w:themeColor="text1"/>
               </w:rPr>
-              <w:t xml:space="preserve"> es la que tiene la propiedad exclusiva sobre todos sus datos o información relacionada con la actividad o proceso a tercerizar; que el proveedor subcontratado no adquiere ningún tipo de derechos o licencias a través del contrato para utilizar los datos o información que el proveedor le proporcione para sus propios fines; y que el proveedor subcontratado no adquiere y no puede reclamar ningún interés en los datos o información debido a la confidencialidad y seguridad que se debe guardar sobre los mismos.</w:t>
+              <w:t xml:space="preserve"> es la que tiene la propiedad exclusiva sobre todos sus datos o información relacionada con la actividad o proceso a tercerizar; que el proveedor contratado no adquiere ningún tipo de derechos o licencias a través del contrato para utilizar los datos o información que el proveedor le proporcione para sus propios fines; y que el proveedor contratado no adquiere y no puede reclamar ningún interés en los datos o información debido a la confidencialidad y seguridad que se debe guardar sobre los mismos.</w:t>
             </w:r>
           </w:p>
         </w:tc>

</xml_diff>

<commit_message>
Underline V04 changes versus approved V03 in RP-GG-PL-003
The main V04 file now marks new or modified text with underline, per
COMEDICA's revision convention; a clean copy is kept as _limpio.

Co-Authored-By: Claude Opus 5.5 <noreply@anthropic.com>
Claude-Session: https://claude.ai/code/session_01PyMC4LRxqsjjU8zCw9m9SH
</commit_message>
<xml_diff>
--- a/politicas/RP-GG-PL-003_Contrat.Servicios_Criticos_Terce_V04_Final.docx
+++ b/politicas/RP-GG-PL-003_Contrat.Servicios_Criticos_Terce_V04_Final.docx
@@ -165,8 +165,18 @@
           <w:color w:val="000000"/>
           <w:sz w:val="56"/>
           <w:szCs w:val="56"/>
-        </w:rPr>
-        <w:t xml:space="preserve">POLÍTICA DE CONTRATACIÓN DE SERVICIOS CRÍTICOS TERCERIZADOS</w:t>
+          <w:u w:val="single"/>
+        </w:rPr>
+        <w:t xml:space="preserve">POLÍTICA DE</w:t>
+      </w:r>
+      <w:r>
+        <w:rPr>
+          <w:rFonts w:ascii="Arial" w:hAnsi="Arial" w:cs="Arial"/>
+          <w:color w:val="000000"/>
+          <w:sz w:val="56"/>
+          <w:szCs w:val="56"/>
+        </w:rPr>
+        <w:t xml:space="preserve"> CONTRATACIÓN DE SERVICIOS CRÍTICOS TERCERIZADOS</w:t>
       </w:r>
     </w:p>
     <w:p>
@@ -1690,8 +1700,9 @@
         <w:rPr>
           <w:rFonts w:ascii="Arial" w:hAnsi="Arial" w:cs="Arial"/>
           <w:color w:val="000000" w:themeColor="text1"/>
-        </w:rPr>
-        <w:t>, lineamientos y controles mínimos</w:t>
+          <w:u w:val="single"/>
+        </w:rPr>
+        <w:t xml:space="preserve">, lineamientos y controles mínimos</w:t>
       </w:r>
       <w:r>
         <w:rPr>
@@ -1704,8 +1715,9 @@
         <w:rPr>
           <w:rFonts w:ascii="Arial" w:hAnsi="Arial" w:cs="Arial"/>
           <w:color w:val="000000" w:themeColor="text1"/>
-        </w:rPr>
-        <w:t>identificar,</w:t>
+          <w:u w:val="single"/>
+        </w:rPr>
+        <w:t xml:space="preserve">identificar,</w:t>
       </w:r>
       <w:r>
         <w:rPr>
@@ -1718,8 +1730,9 @@
         <w:rPr>
           <w:rFonts w:ascii="Arial" w:hAnsi="Arial" w:cs="Arial"/>
           <w:color w:val="000000" w:themeColor="text1"/>
-        </w:rPr>
-        <w:t>mitigar</w:t>
+          <w:u w:val="single"/>
+        </w:rPr>
+        <w:t xml:space="preserve">mitigar</w:t>
       </w:r>
       <w:r>
         <w:rPr>
@@ -1733,47 +1746,141 @@
           <w:rFonts w:ascii="Arial" w:hAnsi="Arial" w:cs="Arial"/>
           <w:color w:val="000000" w:themeColor="text1"/>
         </w:rPr>
-        <w:t>los riesgos asociados a la tercerización de servicios críticos, asegurando que dichos servicios</w:t>
-      </w:r>
-      <w:r>
-        <w:rPr>
-          <w:rFonts w:ascii="Arial" w:hAnsi="Arial" w:cs="Arial"/>
-          <w:color w:val="000000" w:themeColor="text1"/>
-        </w:rPr>
-        <w:t xml:space="preserve"> sean prestados de manera eficiente, </w:t>
-      </w:r>
-      <w:r>
-        <w:rPr>
-          <w:rFonts w:ascii="Arial" w:hAnsi="Arial" w:cs="Arial"/>
-          <w:color w:val="000000" w:themeColor="text1"/>
-        </w:rPr>
-        <w:t>segura y continua, y que</w:t>
-      </w:r>
-      <w:r>
-        <w:rPr>
-          <w:rFonts w:ascii="Arial" w:hAnsi="Arial" w:cs="Arial"/>
-          <w:color w:val="000000" w:themeColor="text1"/>
-        </w:rPr>
-        <w:t xml:space="preserve"> no interfieran en el correcto funcionamiento de la Cooperativa</w:t>
-      </w:r>
-      <w:r>
-        <w:rPr>
-          <w:rFonts w:ascii="Arial" w:hAnsi="Arial" w:cs="Arial"/>
-          <w:color w:val="000000" w:themeColor="text1"/>
-        </w:rPr>
-        <w:t>, en su perfil de riesgo, en su posición de liquidez ni en el cumplimiento del marco regulatorio</w:t>
-      </w:r>
-      <w:r>
-        <w:rPr>
-          <w:rFonts w:ascii="Arial" w:hAnsi="Arial" w:cs="Arial"/>
-          <w:color w:val="000000" w:themeColor="text1"/>
-        </w:rPr>
-        <w:t xml:space="preserve">, cuidando los intereses de COMEDICA </w:t>
-      </w:r>
-      <w:r>
-        <w:rPr>
-          <w:rFonts w:ascii="Arial" w:hAnsi="Arial" w:cs="Arial"/>
-          <w:color w:val="000000" w:themeColor="text1"/>
+        <w:t xml:space="preserve">los </w:t>
+      </w:r>
+      <w:r>
+        <w:rPr>
+          <w:rFonts w:ascii="Arial" w:hAnsi="Arial" w:cs="Arial"/>
+          <w:color w:val="000000" w:themeColor="text1"/>
+          <w:u w:val="single"/>
+        </w:rPr>
+        <w:t xml:space="preserve">riesgos asociados a la tercerización de</w:t>
+      </w:r>
+      <w:r>
+        <w:rPr>
+          <w:rFonts w:ascii="Arial" w:hAnsi="Arial" w:cs="Arial"/>
+          <w:color w:val="000000" w:themeColor="text1"/>
+        </w:rPr>
+        <w:t xml:space="preserve"> servicios </w:t>
+      </w:r>
+      <w:r>
+        <w:rPr>
+          <w:rFonts w:ascii="Arial" w:hAnsi="Arial" w:cs="Arial"/>
+          <w:color w:val="000000" w:themeColor="text1"/>
+          <w:u w:val="single"/>
+        </w:rPr>
+        <w:t xml:space="preserve">críticos, asegurando</w:t>
+      </w:r>
+      <w:r>
+        <w:rPr>
+          <w:rFonts w:ascii="Arial" w:hAnsi="Arial" w:cs="Arial"/>
+          <w:color w:val="000000" w:themeColor="text1"/>
+        </w:rPr>
+        <w:t xml:space="preserve"> que </w:t>
+      </w:r>
+      <w:r>
+        <w:rPr>
+          <w:rFonts w:ascii="Arial" w:hAnsi="Arial" w:cs="Arial"/>
+          <w:color w:val="000000" w:themeColor="text1"/>
+          <w:u w:val="single"/>
+        </w:rPr>
+        <w:t xml:space="preserve">dichos servicios</w:t>
+      </w:r>
+      <w:r>
+        <w:rPr>
+          <w:rFonts w:ascii="Arial" w:hAnsi="Arial" w:cs="Arial"/>
+          <w:color w:val="000000" w:themeColor="text1"/>
+        </w:rPr>
+        <w:t xml:space="preserve"> </w:t>
+      </w:r>
+      <w:r>
+        <w:rPr>
+          <w:rFonts w:ascii="Arial" w:hAnsi="Arial" w:cs="Arial"/>
+          <w:color w:val="000000" w:themeColor="text1"/>
+          <w:u w:val="single"/>
+        </w:rPr>
+        <w:t xml:space="preserve">sean</w:t>
+      </w:r>
+      <w:r>
+        <w:rPr>
+          <w:rFonts w:ascii="Arial" w:hAnsi="Arial" w:cs="Arial"/>
+          <w:color w:val="000000" w:themeColor="text1"/>
+        </w:rPr>
+        <w:t xml:space="preserve"> prestados de manera eficiente, </w:t>
+      </w:r>
+      <w:r>
+        <w:rPr>
+          <w:rFonts w:ascii="Arial" w:hAnsi="Arial" w:cs="Arial"/>
+          <w:color w:val="000000" w:themeColor="text1"/>
+          <w:u w:val="single"/>
+        </w:rPr>
+        <w:t xml:space="preserve">segura</w:t>
+      </w:r>
+      <w:r>
+        <w:rPr>
+          <w:rFonts w:ascii="Arial" w:hAnsi="Arial" w:cs="Arial"/>
+          <w:color w:val="000000" w:themeColor="text1"/>
+        </w:rPr>
+        <w:t xml:space="preserve"> y </w:t>
+      </w:r>
+      <w:r>
+        <w:rPr>
+          <w:rFonts w:ascii="Arial" w:hAnsi="Arial" w:cs="Arial"/>
+          <w:color w:val="000000" w:themeColor="text1"/>
+          <w:u w:val="single"/>
+        </w:rPr>
+        <w:t xml:space="preserve">continua, y que</w:t>
+      </w:r>
+      <w:r>
+        <w:rPr>
+          <w:rFonts w:ascii="Arial" w:hAnsi="Arial" w:cs="Arial"/>
+          <w:color w:val="000000" w:themeColor="text1"/>
+        </w:rPr>
+        <w:t xml:space="preserve"> no </w:t>
+      </w:r>
+      <w:r>
+        <w:rPr>
+          <w:rFonts w:ascii="Arial" w:hAnsi="Arial" w:cs="Arial"/>
+          <w:color w:val="000000" w:themeColor="text1"/>
+          <w:u w:val="single"/>
+        </w:rPr>
+        <w:t xml:space="preserve">interfieran</w:t>
+      </w:r>
+      <w:r>
+        <w:rPr>
+          <w:rFonts w:ascii="Arial" w:hAnsi="Arial" w:cs="Arial"/>
+          <w:color w:val="000000" w:themeColor="text1"/>
+        </w:rPr>
+        <w:t xml:space="preserve"> en el correcto funcionamiento de la Cooperativa</w:t>
+      </w:r>
+      <w:r>
+        <w:rPr>
+          <w:rFonts w:ascii="Arial" w:hAnsi="Arial" w:cs="Arial"/>
+          <w:color w:val="000000" w:themeColor="text1"/>
+          <w:u w:val="single"/>
+        </w:rPr>
+        <w:t xml:space="preserve">, en su perfil de riesgo, en su posición de liquidez ni en el cumplimiento del marco regulatorio</w:t>
+      </w:r>
+      <w:r>
+        <w:rPr>
+          <w:rFonts w:ascii="Arial" w:hAnsi="Arial" w:cs="Arial"/>
+          <w:color w:val="000000" w:themeColor="text1"/>
+          <w:u w:val="single"/>
+        </w:rPr>
+        <w:t xml:space="preserve">,</w:t>
+      </w:r>
+      <w:r>
+        <w:rPr>
+          <w:rFonts w:ascii="Arial" w:hAnsi="Arial" w:cs="Arial"/>
+          <w:color w:val="000000" w:themeColor="text1"/>
+        </w:rPr>
+        <w:t xml:space="preserve"> cuidando los intereses de COMEDICA </w:t>
+      </w:r>
+      <w:r>
+        <w:rPr>
+          <w:rFonts w:ascii="Arial" w:hAnsi="Arial" w:cs="Arial"/>
+          <w:color w:val="000000" w:themeColor="text1"/>
+          <w:u w:val="single"/>
         </w:rPr>
         <w:t xml:space="preserve">de R.L. y de sus asociados</w:t>
       </w:r>
@@ -1782,28 +1889,60 @@
           <w:rFonts w:ascii="Arial" w:hAnsi="Arial" w:cs="Arial"/>
           <w:color w:val="000000" w:themeColor="text1"/>
         </w:rPr>
-        <w:t xml:space="preserve"> en los procesos de </w:t>
-      </w:r>
-      <w:r>
-        <w:rPr>
-          <w:rFonts w:ascii="Arial" w:hAnsi="Arial" w:cs="Arial"/>
-          <w:color w:val="000000" w:themeColor="text1"/>
-        </w:rPr>
-        <w:t>selección,</w:t>
-      </w:r>
-      <w:r>
-        <w:rPr>
-          <w:rFonts w:ascii="Arial" w:hAnsi="Arial" w:cs="Arial"/>
-          <w:color w:val="000000" w:themeColor="text1"/>
-        </w:rPr>
-        <w:t xml:space="preserve"> contratación, </w:t>
-      </w:r>
-      <w:r>
-        <w:rPr>
-          <w:rFonts w:ascii="Arial" w:hAnsi="Arial" w:cs="Arial"/>
-          <w:color w:val="000000" w:themeColor="text1"/>
-        </w:rPr>
-        <w:t>monitoreo, renovación y terminación</w:t>
+        <w:t xml:space="preserve"> en los </w:t>
+      </w:r>
+      <w:r>
+        <w:rPr>
+          <w:rFonts w:ascii="Arial" w:hAnsi="Arial" w:cs="Arial"/>
+          <w:color w:val="000000" w:themeColor="text1"/>
+          <w:u w:val="single"/>
+        </w:rPr>
+        <w:t xml:space="preserve">procesos</w:t>
+      </w:r>
+      <w:r>
+        <w:rPr>
+          <w:rFonts w:ascii="Arial" w:hAnsi="Arial" w:cs="Arial"/>
+          <w:color w:val="000000" w:themeColor="text1"/>
+        </w:rPr>
+        <w:t xml:space="preserve"> de </w:t>
+      </w:r>
+      <w:r>
+        <w:rPr>
+          <w:rFonts w:ascii="Arial" w:hAnsi="Arial" w:cs="Arial"/>
+          <w:color w:val="000000" w:themeColor="text1"/>
+          <w:u w:val="single"/>
+        </w:rPr>
+        <w:t xml:space="preserve">selección,</w:t>
+      </w:r>
+      <w:r>
+        <w:rPr>
+          <w:rFonts w:ascii="Arial" w:hAnsi="Arial" w:cs="Arial"/>
+          <w:color w:val="000000" w:themeColor="text1"/>
+        </w:rPr>
+        <w:t xml:space="preserve"> </w:t>
+      </w:r>
+      <w:r>
+        <w:rPr>
+          <w:rFonts w:ascii="Arial" w:hAnsi="Arial" w:cs="Arial"/>
+          <w:color w:val="000000" w:themeColor="text1"/>
+          <w:u w:val="single"/>
+        </w:rPr>
+        <w:t xml:space="preserve">contratación,</w:t>
+      </w:r>
+      <w:r>
+        <w:rPr>
+          <w:rFonts w:ascii="Arial" w:hAnsi="Arial" w:cs="Arial"/>
+          <w:color w:val="000000" w:themeColor="text1"/>
+        </w:rPr>
+        <w:t xml:space="preserve"> </w:t>
+      </w:r>
+      <w:r>
+        <w:rPr>
+          <w:rFonts w:ascii="Arial" w:hAnsi="Arial" w:cs="Arial"/>
+          <w:color w:val="000000" w:themeColor="text1"/>
+          <w:u w:val="single"/>
+        </w:rPr>
+        <w:t xml:space="preserve">monitoreo, renovación y terminación</w:t>
       </w:r>
       <w:r>
         <w:rPr>
@@ -1843,7 +1982,105 @@
           <w:rFonts w:ascii="Arial" w:hAnsi="Arial" w:cs="Arial"/>
           <w:color w:val="000000" w:themeColor="text1"/>
         </w:rPr>
-        <w:t xml:space="preserve">La presente política se alinea con lo dispuesto en las Normas Técnicas para la Gestión Integral de Riesgos de las Entidades Financieras (NRP-20); las Normas Técnicas para la Gestión del Riesgo Operacional de las Entidades Financieras (NRP-42), en lo relativo a la gestión de los servicios críticos provistos por terceros; las Normas Técnicas para el Sistema de Gestión de la Continuidad del Negocio (NRP-24); las Normas Técnicas para la Gestión de la Seguridad de la Información (NRP-23); las Normas Técnicas de Gobierno Corporativo (NRP-17), en lo relativo a la supervisión de los riesgos por parte de los órganos de gobierno; y las Normas Técnicas para la Gestión del Riesgo de Liquidez de las Entidades Financieras (NRP-05).</w:t>
+        <w:t xml:space="preserve">La presente política </w:t>
+      </w:r>
+      <w:r>
+        <w:rPr>
+          <w:rFonts w:ascii="Arial" w:hAnsi="Arial" w:cs="Arial"/>
+          <w:color w:val="000000" w:themeColor="text1"/>
+          <w:u w:val="single"/>
+        </w:rPr>
+        <w:t xml:space="preserve">se alinea con</w:t>
+      </w:r>
+      <w:r>
+        <w:rPr>
+          <w:rFonts w:ascii="Arial" w:hAnsi="Arial" w:cs="Arial"/>
+          <w:color w:val="000000" w:themeColor="text1"/>
+        </w:rPr>
+        <w:t xml:space="preserve"> lo </w:t>
+      </w:r>
+      <w:r>
+        <w:rPr>
+          <w:rFonts w:ascii="Arial" w:hAnsi="Arial" w:cs="Arial"/>
+          <w:color w:val="000000" w:themeColor="text1"/>
+          <w:u w:val="single"/>
+        </w:rPr>
+        <w:t xml:space="preserve">dispuesto</w:t>
+      </w:r>
+      <w:r>
+        <w:rPr>
+          <w:rFonts w:ascii="Arial" w:hAnsi="Arial" w:cs="Arial"/>
+          <w:color w:val="000000" w:themeColor="text1"/>
+        </w:rPr>
+        <w:t xml:space="preserve"> en las Normas </w:t>
+      </w:r>
+      <w:r>
+        <w:rPr>
+          <w:rFonts w:ascii="Arial" w:hAnsi="Arial" w:cs="Arial"/>
+          <w:color w:val="000000" w:themeColor="text1"/>
+          <w:u w:val="single"/>
+        </w:rPr>
+        <w:t xml:space="preserve">Técnicas para la Gestión Integral de Riesgos de las Entidades Financieras (NRP-20); las Normas Técnicas</w:t>
+      </w:r>
+      <w:r>
+        <w:rPr>
+          <w:rFonts w:ascii="Arial" w:hAnsi="Arial" w:cs="Arial"/>
+          <w:color w:val="000000" w:themeColor="text1"/>
+        </w:rPr>
+        <w:t xml:space="preserve"> para la Gestión del Riesgo Operacional de las Entidades Financieras </w:t>
+      </w:r>
+      <w:r>
+        <w:rPr>
+          <w:rFonts w:ascii="Arial" w:hAnsi="Arial" w:cs="Arial"/>
+          <w:color w:val="000000" w:themeColor="text1"/>
+          <w:u w:val="single"/>
+        </w:rPr>
+        <w:t xml:space="preserve">(NRP-42), en lo relativo a</w:t>
+      </w:r>
+      <w:r>
+        <w:rPr>
+          <w:rFonts w:ascii="Arial" w:hAnsi="Arial" w:cs="Arial"/>
+          <w:color w:val="000000" w:themeColor="text1"/>
+        </w:rPr>
+        <w:t xml:space="preserve"> la </w:t>
+      </w:r>
+      <w:r>
+        <w:rPr>
+          <w:rFonts w:ascii="Arial" w:hAnsi="Arial" w:cs="Arial"/>
+          <w:color w:val="000000" w:themeColor="text1"/>
+          <w:u w:val="single"/>
+        </w:rPr>
+        <w:t xml:space="preserve">gestión</w:t>
+      </w:r>
+      <w:r>
+        <w:rPr>
+          <w:rFonts w:ascii="Arial" w:hAnsi="Arial" w:cs="Arial"/>
+          <w:color w:val="000000" w:themeColor="text1"/>
+        </w:rPr>
+        <w:t xml:space="preserve"> de </w:t>
+      </w:r>
+      <w:r>
+        <w:rPr>
+          <w:rFonts w:ascii="Arial" w:hAnsi="Arial" w:cs="Arial"/>
+          <w:color w:val="000000" w:themeColor="text1"/>
+          <w:u w:val="single"/>
+        </w:rPr>
+        <w:t xml:space="preserve">los servicios críticos provistos por terceros; las</w:t>
+      </w:r>
+      <w:r>
+        <w:rPr>
+          <w:rFonts w:ascii="Arial" w:hAnsi="Arial" w:cs="Arial"/>
+          <w:color w:val="000000" w:themeColor="text1"/>
+        </w:rPr>
+        <w:t xml:space="preserve"> Normas Técnicas para el Sistema de Gestión de la Continuidad del Negocio (NRP-24); </w:t>
+      </w:r>
+      <w:r>
+        <w:rPr>
+          <w:rFonts w:ascii="Arial" w:hAnsi="Arial" w:cs="Arial"/>
+          <w:color w:val="000000" w:themeColor="text1"/>
+          <w:u w:val="single"/>
+        </w:rPr>
+        <w:t xml:space="preserve">las Normas Técnicas para la Gestión de la Seguridad de la Información (NRP-23); las Normas Técnicas de Gobierno Corporativo (NRP-17), en lo relativo a la supervisión de los riesgos por parte de los órganos de gobierno; y las Normas Técnicas para la Gestión del Riesgo de Liquidez de las Entidades Financieras (NRP-05).</w:t>
       </w:r>
     </w:p>
     <w:p>
@@ -1862,6 +2099,7 @@
         <w:rPr>
           <w:rFonts w:ascii="Arial" w:hAnsi="Arial" w:cs="Arial"/>
           <w:color w:val="000000" w:themeColor="text1"/>
+          <w:u w:val="single"/>
         </w:rPr>
         <w:t xml:space="preserve">La tercerización de un servicio no exime a la Cooperativa de su responsabilidad sobre las actividades delegadas, ni del cumplimiento de sus obligaciones legales, regulatorias y frente a sus asociados; en consecuencia, COMEDICA de R.L. conserva en todo momento la capacidad de supervisar, controlar y, cuando sea necesario, reasumir o transferir el servicio tercerizado.</w:t>
       </w:r>
@@ -1923,6 +2161,7 @@
         <w:rPr>
           <w:rFonts w:ascii="Arial" w:hAnsi="Arial" w:cs="Arial"/>
           <w:color w:val="000000" w:themeColor="text1"/>
+          <w:u w:val="single"/>
         </w:rPr>
         <w:t xml:space="preserve">La presente política aplica para la contratación de Servicios Críticos Tercerizados y su gestión durante todo el ciclo de vida (evaluación, selección, contratación, monitoreo, renovación y terminación), sean éstos de Tecnología de la Información o de otra naturaleza. Es de cumplimiento obligatorio para el Consejo de Administración, Comité de Riesgos, Gerencia General y todas las Gerencias, Jefaturas y Administradores de Contrato de la Cooperativa, en cumplimiento a lo establecido en:</w:t>
       </w:r>
@@ -1946,6 +2185,7 @@
         <w:rPr>
           <w:rFonts w:ascii="Arial" w:hAnsi="Arial" w:cs="Arial"/>
           <w:color w:val="000000" w:themeColor="text1"/>
+          <w:u w:val="single"/>
         </w:rPr>
         <w:lastRenderedPageBreak/>
         <w:t>Normas Técnicas para la Gestión Integral de Riesgos de las Entidades Financieras (NRP-20).</w:t>
@@ -1971,7 +2211,30 @@
           <w:rFonts w:ascii="Arial" w:hAnsi="Arial" w:cs="Arial"/>
           <w:color w:val="000000" w:themeColor="text1"/>
         </w:rPr>
-        <w:t xml:space="preserve">Normas Técnicas para la Gestión del Riesgo Operacional de las Entidades Financieras (NRP-42).</w:t>
+        <w:t xml:space="preserve">Normas </w:t>
+      </w:r>
+      <w:r>
+        <w:rPr>
+          <w:rFonts w:ascii="Arial" w:hAnsi="Arial" w:cs="Arial"/>
+          <w:color w:val="000000" w:themeColor="text1"/>
+          <w:u w:val="single"/>
+        </w:rPr>
+        <w:t xml:space="preserve">Técnicas</w:t>
+      </w:r>
+      <w:r>
+        <w:rPr>
+          <w:rFonts w:ascii="Arial" w:hAnsi="Arial" w:cs="Arial"/>
+          <w:color w:val="000000" w:themeColor="text1"/>
+        </w:rPr>
+        <w:t xml:space="preserve"> para la Gestión del Riesgo Operacional </w:t>
+      </w:r>
+      <w:r>
+        <w:rPr>
+          <w:rFonts w:ascii="Arial" w:hAnsi="Arial" w:cs="Arial"/>
+          <w:color w:val="000000" w:themeColor="text1"/>
+          <w:u w:val="single"/>
+        </w:rPr>
+        <w:t xml:space="preserve">de las Entidades Financieras (NRP-42).</w:t>
       </w:r>
     </w:p>
     <w:p>
@@ -2016,8 +2279,9 @@
         <w:rPr>
           <w:rFonts w:ascii="Arial" w:hAnsi="Arial" w:cs="Arial"/>
           <w:color w:val="000000" w:themeColor="text1"/>
-        </w:rPr>
-        <w:t>Normas Técnicas de Gobierno Corporativo (NRP-17).</w:t>
+          <w:u w:val="single"/>
+        </w:rPr>
+        <w:t xml:space="preserve">Normas Técnicas de Gobierno Corporativo (NRP-17).</w:t>
       </w:r>
     </w:p>
     <w:p>
@@ -2039,6 +2303,7 @@
         <w:rPr>
           <w:rFonts w:ascii="Arial" w:hAnsi="Arial" w:cs="Arial"/>
           <w:color w:val="000000" w:themeColor="text1"/>
+          <w:u w:val="single"/>
         </w:rPr>
         <w:t xml:space="preserve">Normas Técnicas para la Gestión del Riesgo de Liquidez de las Entidades Financieras (NRP-05).</w:t>
       </w:r>
@@ -2062,8 +2327,39 @@
         <w:rPr>
           <w:rFonts w:ascii="Arial" w:hAnsi="Arial" w:cs="Arial"/>
           <w:color w:val="000000" w:themeColor="text1"/>
-        </w:rPr>
-        <w:t>Normas Técnicas para la Gestión de la Seguridad de la Información (NRP-23).</w:t>
+          <w:u w:val="single"/>
+        </w:rPr>
+        <w:t xml:space="preserve">Normas Técnicas para la Gestión</w:t>
+      </w:r>
+      <w:r>
+        <w:rPr>
+          <w:rFonts w:ascii="Arial" w:hAnsi="Arial" w:cs="Arial"/>
+          <w:color w:val="000000" w:themeColor="text1"/>
+        </w:rPr>
+        <w:t xml:space="preserve"> de </w:t>
+      </w:r>
+      <w:r>
+        <w:rPr>
+          <w:rFonts w:ascii="Arial" w:hAnsi="Arial" w:cs="Arial"/>
+          <w:color w:val="000000" w:themeColor="text1"/>
+          <w:u w:val="single"/>
+        </w:rPr>
+        <w:t xml:space="preserve">la</w:t>
+      </w:r>
+      <w:r>
+        <w:rPr>
+          <w:rFonts w:ascii="Arial" w:hAnsi="Arial" w:cs="Arial"/>
+          <w:color w:val="000000" w:themeColor="text1"/>
+        </w:rPr>
+        <w:t xml:space="preserve"> Seguridad de la Información </w:t>
+      </w:r>
+      <w:r>
+        <w:rPr>
+          <w:rFonts w:ascii="Arial" w:hAnsi="Arial" w:cs="Arial"/>
+          <w:color w:val="000000" w:themeColor="text1"/>
+          <w:u w:val="single"/>
+        </w:rPr>
+        <w:t xml:space="preserve">(NRP-23).</w:t>
       </w:r>
     </w:p>
     <w:p>
@@ -2085,15 +2381,24 @@
         <w:rPr>
           <w:rFonts w:ascii="Arial" w:hAnsi="Arial" w:cs="Arial"/>
           <w:color w:val="000000"/>
-        </w:rPr>
-        <w:t xml:space="preserve">Manual de Compras de Bienes y Servicios (RP-GA-M-001), </w:t>
-      </w:r>
-      <w:r>
-        <w:rPr>
-          <w:rFonts w:ascii="Arial" w:hAnsi="Arial" w:cs="Arial"/>
-          <w:color w:val="000000"/>
-        </w:rPr>
-        <w:t>Código de Gobierno Corporativo, Código de Conducta y demás normativa interna y disposiciones legales y regulatorias aplicables.</w:t>
+          <w:u w:val="single"/>
+        </w:rPr>
+        <w:t xml:space="preserve">Manual de Compras de Bienes y Servicios (RP-GA-M-001),</w:t>
+      </w:r>
+      <w:r>
+        <w:rPr>
+          <w:rFonts w:ascii="Arial" w:hAnsi="Arial" w:cs="Arial"/>
+          <w:color w:val="000000"/>
+        </w:rPr>
+        <w:t xml:space="preserve"> </w:t>
+      </w:r>
+      <w:r>
+        <w:rPr>
+          <w:rFonts w:ascii="Arial" w:hAnsi="Arial" w:cs="Arial"/>
+          <w:color w:val="000000"/>
+          <w:u w:val="single"/>
+        </w:rPr>
+        <w:t xml:space="preserve">Código de Gobierno Corporativo, Código de Conducta y demás normativa interna y disposiciones legales y regulatorias aplicables.</w:t>
       </w:r>
     </w:p>
     <w:p>
@@ -2192,8 +2497,9 @@
         <w:rPr>
           <w:rFonts w:ascii="Arial" w:hAnsi="Arial" w:cs="Arial"/>
           <w:color w:val="000000" w:themeColor="text1"/>
-        </w:rPr>
-        <w:t>, o de procesos de soporte que la habilitan,</w:t>
+          <w:u w:val="single"/>
+        </w:rPr>
+        <w:t xml:space="preserve">, o de procesos de soporte que la habilitan,</w:t>
       </w:r>
       <w:r>
         <w:rPr>
@@ -2206,8 +2512,9 @@
         <w:rPr>
           <w:rFonts w:ascii="Arial" w:hAnsi="Arial" w:cs="Arial"/>
           <w:color w:val="000000" w:themeColor="text1"/>
-        </w:rPr>
-        <w:t>, sin que ello traslade a dicho tercero la responsabilidad que la Cooperativa mantiene frente a sus asociados y al ente supervisor.</w:t>
+          <w:u w:val="single"/>
+        </w:rPr>
+        <w:t xml:space="preserve">, sin que ello traslade a dicho tercero la responsabilidad que la Cooperativa mantiene frente a sus asociados y al ente supervisor.</w:t>
       </w:r>
     </w:p>
     <w:p>
@@ -2242,15 +2549,32 @@
           <w:rFonts w:ascii="Arial" w:hAnsi="Arial" w:cs="Arial"/>
           <w:b/>
           <w:color w:val="000000" w:themeColor="text1"/>
-        </w:rPr>
-        <w:t xml:space="preserve">Servicios Críticos:</w:t>
-      </w:r>
-      <w:r>
-        <w:rPr>
-          <w:rFonts w:ascii="Arial" w:hAnsi="Arial" w:cs="Arial"/>
-          <w:color w:val="000000" w:themeColor="text1"/>
-        </w:rPr>
-        <w:t xml:space="preserve"> Son un conjunto de actividades o procedimientos definidos como prioritarios, cuya no disponibilidad compromete la existencia de la entidad, la continuidad de sus procesos críticos identificados en el Análisis de Impacto del Negocio (BIA), su posición de liquidez o el cumplimiento de sus obligaciones regulatorias.</w:t>
+          <w:u w:val="single"/>
+        </w:rPr>
+        <w:t xml:space="preserve">Servicios</w:t>
+      </w:r>
+      <w:r>
+        <w:rPr>
+          <w:rFonts w:ascii="Arial" w:hAnsi="Arial" w:cs="Arial"/>
+          <w:b/>
+          <w:color w:val="000000" w:themeColor="text1"/>
+        </w:rPr>
+        <w:t xml:space="preserve"> Críticos:</w:t>
+      </w:r>
+      <w:r>
+        <w:rPr>
+          <w:rFonts w:ascii="Arial" w:hAnsi="Arial" w:cs="Arial"/>
+          <w:color w:val="000000" w:themeColor="text1"/>
+        </w:rPr>
+        <w:t xml:space="preserve"> Son un conjunto de actividades o procedimientos definidos como prioritarios, cuya no disponibilidad compromete la existencia de la entidad, </w:t>
+      </w:r>
+      <w:r>
+        <w:rPr>
+          <w:rFonts w:ascii="Arial" w:hAnsi="Arial" w:cs="Arial"/>
+          <w:color w:val="000000" w:themeColor="text1"/>
+          <w:u w:val="single"/>
+        </w:rPr>
+        <w:t xml:space="preserve">la continuidad de sus procesos críticos identificados en el Análisis de Impacto del Negocio (BIA), su posición de liquidez o el cumplimiento de sus obligaciones regulatorias.</w:t>
       </w:r>
     </w:p>
     <w:p>
@@ -2293,7 +2617,45 @@
           <w:rFonts w:ascii="Arial" w:hAnsi="Arial" w:cs="Arial"/>
           <w:color w:val="000000" w:themeColor="text1"/>
         </w:rPr>
-        <w:t xml:space="preserve"> Son los procesos dentro de la Cooperativa que se han definido como prioritarios para la entrega de productos y servicios y cuya interrupción detiene la continuidad del negocio, conforme al Análisis de Impacto del Negocio (BIA) del Sistema de Gestión de la Continuidad del Negocio (NRP-24).</w:t>
+        <w:t xml:space="preserve"> Son los procesos dentro de la Cooperativa que se han </w:t>
+      </w:r>
+      <w:r>
+        <w:rPr>
+          <w:rFonts w:ascii="Arial" w:hAnsi="Arial" w:cs="Arial"/>
+          <w:color w:val="000000" w:themeColor="text1"/>
+          <w:u w:val="single"/>
+        </w:rPr>
+        <w:t xml:space="preserve">definido</w:t>
+      </w:r>
+      <w:r>
+        <w:rPr>
+          <w:rFonts w:ascii="Arial" w:hAnsi="Arial" w:cs="Arial"/>
+          <w:color w:val="000000" w:themeColor="text1"/>
+        </w:rPr>
+        <w:t xml:space="preserve"> como prioritarios para la entrega de productos y servicios y </w:t>
+      </w:r>
+      <w:r>
+        <w:rPr>
+          <w:rFonts w:ascii="Arial" w:hAnsi="Arial" w:cs="Arial"/>
+          <w:color w:val="000000" w:themeColor="text1"/>
+          <w:u w:val="single"/>
+        </w:rPr>
+        <w:t xml:space="preserve">cuya</w:t>
+      </w:r>
+      <w:r>
+        <w:rPr>
+          <w:rFonts w:ascii="Arial" w:hAnsi="Arial" w:cs="Arial"/>
+          <w:color w:val="000000" w:themeColor="text1"/>
+        </w:rPr>
+        <w:t xml:space="preserve"> interrupción detiene la continuidad del negocio, </w:t>
+      </w:r>
+      <w:r>
+        <w:rPr>
+          <w:rFonts w:ascii="Arial" w:hAnsi="Arial" w:cs="Arial"/>
+          <w:color w:val="000000" w:themeColor="text1"/>
+          <w:u w:val="single"/>
+        </w:rPr>
+        <w:t xml:space="preserve">conforme al Análisis de Impacto del Negocio (BIA) del Sistema de Gestión de la Continuidad del Negocio (NRP-24).</w:t>
       </w:r>
     </w:p>
     <w:p>
@@ -2341,8 +2703,54 @@
         <w:rPr>
           <w:rFonts w:ascii="Arial" w:hAnsi="Arial" w:cs="Arial"/>
           <w:color w:val="000000" w:themeColor="text1"/>
-        </w:rPr>
-        <w:t>Son los servicios cuya ejecución se delega en un proveedor externo y que cumplen uno o más de los criterios de criticidad establecidos en el apartado V de la presente política, de tal forma que su</w:t>
+          <w:u w:val="single"/>
+        </w:rPr>
+        <w:t xml:space="preserve">Son los servicios cuya ejecución</w:t>
+      </w:r>
+      <w:r>
+        <w:rPr>
+          <w:rFonts w:ascii="Arial" w:hAnsi="Arial" w:cs="Arial"/>
+          <w:color w:val="000000" w:themeColor="text1"/>
+        </w:rPr>
+        <w:t xml:space="preserve"> se delega </w:t>
+      </w:r>
+      <w:r>
+        <w:rPr>
+          <w:rFonts w:ascii="Arial" w:hAnsi="Arial" w:cs="Arial"/>
+          <w:color w:val="000000" w:themeColor="text1"/>
+          <w:u w:val="single"/>
+        </w:rPr>
+        <w:t xml:space="preserve">en un proveedor externo y que cumplen uno o más de los criterios de criticidad establecidos en el apartado V</w:t>
+      </w:r>
+      <w:r>
+        <w:rPr>
+          <w:rFonts w:ascii="Arial" w:hAnsi="Arial" w:cs="Arial"/>
+          <w:color w:val="000000" w:themeColor="text1"/>
+        </w:rPr>
+        <w:t xml:space="preserve"> de la </w:t>
+      </w:r>
+      <w:r>
+        <w:rPr>
+          <w:rFonts w:ascii="Arial" w:hAnsi="Arial" w:cs="Arial"/>
+          <w:color w:val="000000" w:themeColor="text1"/>
+          <w:u w:val="single"/>
+        </w:rPr>
+        <w:t xml:space="preserve">presente política,</w:t>
+      </w:r>
+      <w:r>
+        <w:rPr>
+          <w:rFonts w:ascii="Arial" w:hAnsi="Arial" w:cs="Arial"/>
+          <w:color w:val="000000" w:themeColor="text1"/>
+        </w:rPr>
+        <w:t xml:space="preserve"> de </w:t>
+      </w:r>
+      <w:r>
+        <w:rPr>
+          <w:rFonts w:ascii="Arial" w:hAnsi="Arial" w:cs="Arial"/>
+          <w:color w:val="000000" w:themeColor="text1"/>
+          <w:u w:val="single"/>
+        </w:rPr>
+        <w:t xml:space="preserve">tal forma que su</w:t>
       </w:r>
       <w:r>
         <w:rPr>
@@ -2357,8 +2765,9 @@
         <w:rPr>
           <w:rFonts w:ascii="Arial" w:hAnsi="Arial" w:cs="Arial"/>
           <w:color w:val="000000" w:themeColor="text1"/>
-        </w:rPr>
-        <w:t>, o afecta materialmente el perfil de riesgo de la Cooperativa.</w:t>
+          <w:u w:val="single"/>
+        </w:rPr>
+        <w:t xml:space="preserve">, o afecta materialmente el perfil de riesgo de la Cooperativa.</w:t>
       </w:r>
     </w:p>
     <w:p>
@@ -2393,8 +2802,17 @@
           <w:rFonts w:ascii="Arial" w:hAnsi="Arial" w:cs="Arial"/>
           <w:b/>
           <w:color w:val="000000" w:themeColor="text1"/>
-        </w:rPr>
-        <w:t>Proveedor de Servicios Críticos Tercerizados:</w:t>
+          <w:u w:val="single"/>
+        </w:rPr>
+        <w:t xml:space="preserve">Proveedor de</w:t>
+      </w:r>
+      <w:r>
+        <w:rPr>
+          <w:rFonts w:ascii="Arial" w:hAnsi="Arial" w:cs="Arial"/>
+          <w:b/>
+          <w:color w:val="000000" w:themeColor="text1"/>
+        </w:rPr>
+        <w:t xml:space="preserve"> Servicios Críticos Tercerizados:</w:t>
       </w:r>
       <w:r>
         <w:rPr>
@@ -2421,8 +2839,24 @@
         <w:rPr>
           <w:rFonts w:ascii="Arial" w:hAnsi="Arial" w:cs="Arial"/>
           <w:color w:val="000000" w:themeColor="text1"/>
-        </w:rPr>
-        <w:t>, o de procesos que la soportan, calificadas como críticas.</w:t>
+          <w:u w:val="single"/>
+        </w:rPr>
+        <w:t xml:space="preserve">, o de procesos que</w:t>
+      </w:r>
+      <w:r>
+        <w:rPr>
+          <w:rFonts w:ascii="Arial" w:hAnsi="Arial" w:cs="Arial"/>
+          <w:color w:val="000000" w:themeColor="text1"/>
+        </w:rPr>
+        <w:t xml:space="preserve"> la </w:t>
+      </w:r>
+      <w:r>
+        <w:rPr>
+          <w:rFonts w:ascii="Arial" w:hAnsi="Arial" w:cs="Arial"/>
+          <w:color w:val="000000" w:themeColor="text1"/>
+          <w:u w:val="single"/>
+        </w:rPr>
+        <w:t xml:space="preserve">soportan, calificadas como críticas.</w:t>
       </w:r>
     </w:p>
     <w:p>
@@ -2483,8 +2917,9 @@
         <w:rPr>
           <w:rFonts w:ascii="Arial" w:hAnsi="Arial" w:cs="Arial"/>
           <w:color w:val="000000" w:themeColor="text1"/>
-        </w:rPr>
-        <w:t>el servicio prestado por</w:t>
+          <w:u w:val="single"/>
+        </w:rPr>
+        <w:t xml:space="preserve">el servicio prestado por</w:t>
       </w:r>
       <w:r>
         <w:rPr>
@@ -2497,8 +2932,9 @@
         <w:rPr>
           <w:rFonts w:ascii="Arial" w:hAnsi="Arial" w:cs="Arial"/>
           <w:color w:val="000000" w:themeColor="text1"/>
-        </w:rPr>
-        <w:t>cuya</w:t>
+          <w:u w:val="single"/>
+        </w:rPr>
+        <w:t xml:space="preserve">cuya</w:t>
       </w:r>
       <w:r>
         <w:rPr>
@@ -2511,8 +2947,9 @@
         <w:rPr>
           <w:rFonts w:ascii="Arial" w:hAnsi="Arial" w:cs="Arial"/>
           <w:color w:val="000000" w:themeColor="text1"/>
-        </w:rPr>
-        <w:t>, no afecta su posición de liquidez ni genera incumplimientos regulatorios, y para el cual existen alternativas de sustitución inmediata.</w:t>
+          <w:u w:val="single"/>
+        </w:rPr>
+        <w:t xml:space="preserve">, no afecta su posición de liquidez ni genera incumplimientos regulatorios, y para el cual existen alternativas de sustitución inmediata.</w:t>
       </w:r>
     </w:p>
     <w:p>
@@ -2588,6 +3025,7 @@
           <w:rFonts w:ascii="Arial" w:hAnsi="Arial" w:cs="Arial"/>
           <w:b/>
           <w:color w:val="000000" w:themeColor="text1"/>
+          <w:u w:val="single"/>
         </w:rPr>
         <w:t xml:space="preserve">Riesgo Tecnológico:</w:t>
       </w:r>
@@ -2596,7 +3034,15 @@
           <w:rFonts w:ascii="Arial" w:hAnsi="Arial" w:cs="Arial"/>
           <w:color w:val="000000" w:themeColor="text1"/>
         </w:rPr>
-        <w:t xml:space="preserve"> Posibilidad de incurrir en pérdidas derivadas de fallas, deficiencias, obsolescencia o uso inadecuado de la infraestructura tecnológica, sistemas de información, aplicaciones, redes y demás canales tecnológicos, incluyendo los provistos o administrados por terceros. Forma parte del riesgo operacional, como factor de tecnología de información (NRP-42).</w:t>
+        <w:t xml:space="preserve"> </w:t>
+      </w:r>
+      <w:r>
+        <w:rPr>
+          <w:rFonts w:ascii="Arial" w:hAnsi="Arial" w:cs="Arial"/>
+          <w:color w:val="000000" w:themeColor="text1"/>
+          <w:u w:val="single"/>
+        </w:rPr>
+        <w:t xml:space="preserve">Posibilidad de incurrir en pérdidas derivadas de fallas, deficiencias, obsolescencia o uso inadecuado de la infraestructura tecnológica, sistemas de información, aplicaciones, redes y demás canales tecnológicos, incluyendo los provistos o administrados por terceros. Forma parte del riesgo operacional, como factor de tecnología de información (NRP-42).</w:t>
       </w:r>
     </w:p>
     <w:p>
@@ -2630,6 +3076,7 @@
           <w:rFonts w:ascii="Arial" w:hAnsi="Arial" w:cs="Arial"/>
           <w:b/>
           <w:color w:val="000000" w:themeColor="text1"/>
+          <w:u w:val="single"/>
         </w:rPr>
         <w:t xml:space="preserve">Riesgo Operacional (NRP-20 y NRP-42):</w:t>
       </w:r>
@@ -2638,7 +3085,15 @@
           <w:rFonts w:ascii="Arial" w:hAnsi="Arial" w:cs="Arial"/>
           <w:color w:val="000000" w:themeColor="text1"/>
         </w:rPr>
-        <w:t xml:space="preserve"> Posibilidad de incurrir en pérdidas debido a fallas en los procesos, en las personas, en los sistemas de información y a causa de acontecimientos externos; incluye el riesgo legal.</w:t>
+        <w:t xml:space="preserve"> </w:t>
+      </w:r>
+      <w:r>
+        <w:rPr>
+          <w:rFonts w:ascii="Arial" w:hAnsi="Arial" w:cs="Arial"/>
+          <w:color w:val="000000" w:themeColor="text1"/>
+          <w:u w:val="single"/>
+        </w:rPr>
+        <w:t xml:space="preserve">Posibilidad de incurrir en pérdidas debido a fallas en los procesos, en las personas, en los sistemas de información y a causa de acontecimientos externos; incluye el riesgo legal.</w:t>
       </w:r>
     </w:p>
     <w:p>
@@ -2672,8 +3127,9 @@
           <w:rFonts w:ascii="Arial" w:hAnsi="Arial" w:cs="Arial"/>
           <w:b/>
           <w:color w:val="000000" w:themeColor="text1"/>
-        </w:rPr>
-        <w:t>Riesgo de Tercerización:</w:t>
+          <w:u w:val="single"/>
+        </w:rPr>
+        <w:t xml:space="preserve">Riesgo de Tercerización:</w:t>
       </w:r>
       <w:r>
         <w:rPr>
@@ -2686,8 +3142,9 @@
         <w:rPr>
           <w:rFonts w:ascii="Arial" w:hAnsi="Arial" w:cs="Arial"/>
           <w:color w:val="000000" w:themeColor="text1"/>
-        </w:rPr>
-        <w:t>Posibilidad de pérdidas, interrupciones o incumplimientos derivados de la falla, deficiencia, insolvencia o incumplimiento de un proveedor en la prestación de un servicio tercerizado.</w:t>
+          <w:u w:val="single"/>
+        </w:rPr>
+        <w:t xml:space="preserve">Posibilidad de pérdidas, interrupciones o incumplimientos derivados de la falla, deficiencia, insolvencia o incumplimiento de un proveedor en la prestación de un servicio tercerizado.</w:t>
       </w:r>
     </w:p>
     <w:p>
@@ -2721,6 +3178,7 @@
           <w:rFonts w:ascii="Arial" w:hAnsi="Arial" w:cs="Arial"/>
           <w:b/>
           <w:color w:val="000000" w:themeColor="text1"/>
+          <w:u w:val="single"/>
         </w:rPr>
         <w:t xml:space="preserve">Riesgo de Concentración de Proveedores:</w:t>
       </w:r>
@@ -2729,7 +3187,15 @@
           <w:rFonts w:ascii="Arial" w:hAnsi="Arial" w:cs="Arial"/>
           <w:color w:val="000000" w:themeColor="text1"/>
         </w:rPr>
-        <w:t xml:space="preserve"> Exposición derivada de la dependencia de la Cooperativa respecto de un mismo proveedor, grupo económico, tecnología o ubicación geográfica para la prestación de uno o varios servicios críticos, o de la existencia de un número limitado de proveedores alternos en el mercado.</w:t>
+        <w:t xml:space="preserve"> </w:t>
+      </w:r>
+      <w:r>
+        <w:rPr>
+          <w:rFonts w:ascii="Arial" w:hAnsi="Arial" w:cs="Arial"/>
+          <w:color w:val="000000" w:themeColor="text1"/>
+          <w:u w:val="single"/>
+        </w:rPr>
+        <w:t xml:space="preserve">Exposición derivada de la dependencia de la Cooperativa respecto de un mismo proveedor, grupo económico, tecnología o ubicación geográfica para la prestación de uno o varios servicios críticos, o de la existencia de un número limitado de proveedores alternos en el mercado.</w:t>
       </w:r>
     </w:p>
     <w:p>
@@ -2763,6 +3229,7 @@
           <w:rFonts w:ascii="Arial" w:hAnsi="Arial" w:cs="Arial"/>
           <w:b/>
           <w:color w:val="000000" w:themeColor="text1"/>
+          <w:u w:val="single"/>
         </w:rPr>
         <w:lastRenderedPageBreak/>
         <w:t>Riesgo de Contraparte:</w:t>
@@ -2778,8 +3245,9 @@
         <w:rPr>
           <w:rFonts w:ascii="Arial" w:hAnsi="Arial" w:cs="Arial"/>
           <w:color w:val="000000" w:themeColor="text1"/>
-        </w:rPr>
-        <w:t>Posibilidad de pérdida derivada de que el proveedor no cumpla sus obligaciones contractuales por deterioro de su solvencia financiera, incluyendo la pérdida de anticipos, depósitos en garantía, licencias prepagadas u otros recursos entregados por la Cooperativa.</w:t>
+          <w:u w:val="single"/>
+        </w:rPr>
+        <w:t xml:space="preserve">Posibilidad de pérdida derivada de que el proveedor no cumpla sus obligaciones contractuales por deterioro de su solvencia financiera, incluyendo la pérdida de anticipos, depósitos en garantía, licencias prepagadas u otros recursos entregados por la Cooperativa.</w:t>
       </w:r>
     </w:p>
     <w:p>
@@ -2813,6 +3281,7 @@
           <w:rFonts w:ascii="Arial" w:hAnsi="Arial" w:cs="Arial"/>
           <w:b/>
           <w:color w:val="000000" w:themeColor="text1"/>
+          <w:u w:val="single"/>
         </w:rPr>
         <w:t xml:space="preserve">Impacto en Liquidez (NRP-05):</w:t>
       </w:r>
@@ -2821,7 +3290,15 @@
           <w:rFonts w:ascii="Arial" w:hAnsi="Arial" w:cs="Arial"/>
           <w:color w:val="000000" w:themeColor="text1"/>
         </w:rPr>
-        <w:t xml:space="preserve"> Efecto que la contratación, interrupción o terminación de un servicio tercerizado puede generar sobre los flujos de efectivo, los compromisos de pago y la capacidad de la Cooperativa para atender oportunamente sus obligaciones, incluyendo la afectación de canales de pago, transferencias, compensación y gestión de tesorería.</w:t>
+        <w:t xml:space="preserve"> </w:t>
+      </w:r>
+      <w:r>
+        <w:rPr>
+          <w:rFonts w:ascii="Arial" w:hAnsi="Arial" w:cs="Arial"/>
+          <w:color w:val="000000" w:themeColor="text1"/>
+          <w:u w:val="single"/>
+        </w:rPr>
+        <w:t xml:space="preserve">Efecto que la contratación, interrupción o terminación de un servicio tercerizado puede generar sobre los flujos de efectivo, los compromisos de pago y la capacidad de la Cooperativa para atender oportunamente sus obligaciones, incluyendo la afectación de canales de pago, transferencias, compensación y gestión de tesorería.</w:t>
       </w:r>
     </w:p>
     <w:p>
@@ -2855,6 +3332,7 @@
           <w:rFonts w:ascii="Arial" w:hAnsi="Arial" w:cs="Arial"/>
           <w:b/>
           <w:color w:val="000000" w:themeColor="text1"/>
+          <w:u w:val="single"/>
         </w:rPr>
         <w:t xml:space="preserve">Acuerdo de Niveles de Servicio (ANS):</w:t>
       </w:r>
@@ -2863,7 +3341,15 @@
           <w:rFonts w:ascii="Arial" w:hAnsi="Arial" w:cs="Arial"/>
           <w:color w:val="000000" w:themeColor="text1"/>
         </w:rPr>
-        <w:t xml:space="preserve"> Compromisos medibles de calidad, disponibilidad, capacidad, tiempos de respuesta y de recuperación pactados con el proveedor, en condiciones normales y de contingencia.</w:t>
+        <w:t xml:space="preserve"> </w:t>
+      </w:r>
+      <w:r>
+        <w:rPr>
+          <w:rFonts w:ascii="Arial" w:hAnsi="Arial" w:cs="Arial"/>
+          <w:color w:val="000000" w:themeColor="text1"/>
+          <w:u w:val="single"/>
+        </w:rPr>
+        <w:t xml:space="preserve">Compromisos medibles de calidad, disponibilidad, capacidad, tiempos de respuesta y de recuperación pactados con el proveedor, en condiciones normales y de contingencia.</w:t>
       </w:r>
     </w:p>
     <w:p>
@@ -2897,6 +3383,7 @@
           <w:rFonts w:ascii="Arial" w:hAnsi="Arial" w:cs="Arial"/>
           <w:b/>
           <w:color w:val="000000" w:themeColor="text1"/>
+          <w:u w:val="single"/>
         </w:rPr>
         <w:t xml:space="preserve">Tiempo Objetivo de Recuperación (RTO), Punto Objetivo de Recuperación (RPO) y Máximo Período Tolerable de Disrupción (MTPD):</w:t>
       </w:r>
@@ -2905,7 +3392,15 @@
           <w:rFonts w:ascii="Arial" w:hAnsi="Arial" w:cs="Arial"/>
           <w:color w:val="000000" w:themeColor="text1"/>
         </w:rPr>
-        <w:t xml:space="preserve"> Parámetros definidos en el Análisis de Impacto del Negocio (BIA) conforme a la NRP-24. El RTO es el tiempo establecido para reanudar la entrega de un producto o servicio luego de un incidente de interrupción; el RPO es la máxima pérdida de datos admisible para que continúe siendo factible reanudar una operación; y el MTPD es el tiempo que le tomaría a los impactos adversos volverse inaceptables para la Cooperativa. El servicio tercerizado y el plan de continuidad del proveedor deben ser consistentes con estos parámetros.</w:t>
+        <w:t xml:space="preserve"> </w:t>
+      </w:r>
+      <w:r>
+        <w:rPr>
+          <w:rFonts w:ascii="Arial" w:hAnsi="Arial" w:cs="Arial"/>
+          <w:color w:val="000000" w:themeColor="text1"/>
+          <w:u w:val="single"/>
+        </w:rPr>
+        <w:t xml:space="preserve">Parámetros definidos en el Análisis de Impacto del Negocio (BIA) conforme a la NRP-24. El RTO es el tiempo establecido para reanudar la entrega de un producto o servicio luego de un incidente de interrupción; el RPO es la máxima pérdida de datos admisible para que continúe siendo factible reanudar una operación; y el MTPD es el tiempo que le tomaría a los impactos adversos volverse inaceptables para la Cooperativa. El servicio tercerizado y el plan de continuidad del proveedor deben ser consistentes con estos parámetros.</w:t>
       </w:r>
     </w:p>
     <w:p>
@@ -2939,6 +3434,7 @@
           <w:rFonts w:ascii="Arial" w:hAnsi="Arial" w:cs="Arial"/>
           <w:b/>
           <w:color w:val="000000" w:themeColor="text1"/>
+          <w:u w:val="single"/>
         </w:rPr>
         <w:t xml:space="preserve">Apetito y Tolerancia al Riesgo:</w:t>
       </w:r>
@@ -2947,7 +3443,15 @@
           <w:rFonts w:ascii="Arial" w:hAnsi="Arial" w:cs="Arial"/>
           <w:color w:val="000000" w:themeColor="text1"/>
         </w:rPr>
-        <w:t xml:space="preserve"> El apetito de riesgo es el nivel y los tipos de riesgos que la Cooperativa está dispuesta a asumir en relación a sus actividades, para alcanzar sus objetivos estratégicos y planes de negocio; la tolerancia al riesgo son los niveles de toma de riesgos aceptables para lograr un objetivo específico o administrar una categoría de riesgo. Ambos son aprobados por el Consejo de Administración (NRP-20).</w:t>
+        <w:t xml:space="preserve"> </w:t>
+      </w:r>
+      <w:r>
+        <w:rPr>
+          <w:rFonts w:ascii="Arial" w:hAnsi="Arial" w:cs="Arial"/>
+          <w:color w:val="000000" w:themeColor="text1"/>
+          <w:u w:val="single"/>
+        </w:rPr>
+        <w:t xml:space="preserve">El apetito de riesgo es el nivel y los tipos de riesgos que la Cooperativa está dispuesta a asumir en relación a sus actividades, para alcanzar sus objetivos estratégicos y planes de negocio; la tolerancia al riesgo son los niveles de toma de riesgos aceptables para lograr un objetivo específico o administrar una categoría de riesgo. Ambos son aprobados por el Consejo de Administración (NRP-20).</w:t>
       </w:r>
     </w:p>
     <w:p>
@@ -2981,6 +3485,7 @@
           <w:rFonts w:ascii="Arial" w:hAnsi="Arial" w:cs="Arial"/>
           <w:b/>
           <w:color w:val="000000" w:themeColor="text1"/>
+          <w:u w:val="single"/>
         </w:rPr>
         <w:t xml:space="preserve">Matriz Centralizada de Servicios Críticos Tercerizados:</w:t>
       </w:r>
@@ -2989,7 +3494,15 @@
           <w:rFonts w:ascii="Arial" w:hAnsi="Arial" w:cs="Arial"/>
           <w:color w:val="000000" w:themeColor="text1"/>
         </w:rPr>
-        <w:t xml:space="preserve"> Control centralizado de los servicios prestados por terceros que, conforme a la NRP-42, contiene como mínimo el nombre del proveedor, el tipo de servicio, el monto del contrato, la contraparte dentro de la Cooperativa y su vigencia, y que debe estar a disposición de la Superintendencia en el momento que ésta lo requiera.</w:t>
+        <w:t xml:space="preserve"> </w:t>
+      </w:r>
+      <w:r>
+        <w:rPr>
+          <w:rFonts w:ascii="Arial" w:hAnsi="Arial" w:cs="Arial"/>
+          <w:color w:val="000000" w:themeColor="text1"/>
+          <w:u w:val="single"/>
+        </w:rPr>
+        <w:t xml:space="preserve">Control centralizado de los servicios prestados por terceros que, conforme a la NRP-42, contiene como mínimo el nombre del proveedor, el tipo de servicio, el monto del contrato, la contraparte dentro de la Cooperativa y su vigencia, y que debe estar a disposición de la Superintendencia en el momento que ésta lo requiera.</w:t>
       </w:r>
     </w:p>
     <w:p>
@@ -3104,8 +3617,9 @@
         <w:rPr>
           <w:rFonts w:ascii="Arial" w:hAnsi="Arial" w:cs="Arial"/>
           <w:color w:val="000000" w:themeColor="text1"/>
-        </w:rPr>
-        <w:t>de sus</w:t>
+          <w:u w:val="single"/>
+        </w:rPr>
+        <w:t xml:space="preserve">de sus</w:t>
       </w:r>
       <w:r>
         <w:rPr>
@@ -3133,6 +3647,7 @@
         <w:rPr>
           <w:rFonts w:ascii="Arial" w:hAnsi="Arial" w:cs="Arial"/>
           <w:color w:val="000000"/>
+          <w:u w:val="single"/>
         </w:rPr>
         <w:t xml:space="preserve">Aprobar el apetito y la tolerancia al riesgo aplicables a la tercerización, incluyendo los límites de concentración por proveedor y los criterios de exposición de contraparte (NRP-20).</w:t>
       </w:r>
@@ -3155,6 +3670,7 @@
         <w:rPr>
           <w:rFonts w:ascii="Arial" w:hAnsi="Arial" w:cs="Arial"/>
           <w:color w:val="000000" w:themeColor="text1"/>
+          <w:u w:val="single"/>
         </w:rPr>
         <w:t xml:space="preserve">Conocer, al menos anualmente, el informe consolidado sobre los proveedores de servicios críticos tercerizados, su nivel de riesgo, concentración, cumplimiento de niveles de servicio y resultados de pruebas de continuidad.</w:t>
       </w:r>
@@ -3177,8 +3693,9 @@
         <w:rPr>
           <w:rFonts w:ascii="Arial" w:hAnsi="Arial" w:cs="Arial"/>
           <w:color w:val="000000"/>
-        </w:rPr>
-        <w:t>Aprobar las excepciones a la presente política, previa opinión del Comité de Riesgos.</w:t>
+          <w:u w:val="single"/>
+        </w:rPr>
+        <w:t xml:space="preserve">Aprobar las excepciones a la presente política, previa opinión del Comité de Riesgos.</w:t>
       </w:r>
     </w:p>
     <w:p>
@@ -3255,8 +3772,9 @@
         <w:rPr>
           <w:rFonts w:ascii="Arial" w:hAnsi="Arial" w:cs="Arial"/>
           <w:color w:val="000000"/>
-        </w:rPr>
-        <w:t>Proponer al Consejo de Administración los límites de concentración de proveedores y los criterios de exposición de contraparte e impacto en liquidez aplicables a los servicios críticos tercerizados.</w:t>
+          <w:u w:val="single"/>
+        </w:rPr>
+        <w:t xml:space="preserve">Proponer al Consejo de Administración los límites de concentración de proveedores y los criterios de exposición de contraparte e impacto en liquidez aplicables a los servicios críticos tercerizados.</w:t>
       </w:r>
     </w:p>
     <w:p>
@@ -3277,6 +3795,7 @@
         <w:rPr>
           <w:rFonts w:ascii="Arial" w:hAnsi="Arial" w:cs="Arial"/>
           <w:color w:val="000000" w:themeColor="text1"/>
+          <w:u w:val="single"/>
         </w:rPr>
         <w:t xml:space="preserve">Dar seguimiento semestral a los indicadores clave de riesgo (KRI) de tercerización, a los eventos de riesgo operacional originados en proveedores de servicios críticos tercerizados y a sus planes de acción.</w:t>
       </w:r>
@@ -3299,8 +3818,9 @@
         <w:rPr>
           <w:rFonts w:ascii="Arial" w:hAnsi="Arial" w:cs="Arial"/>
           <w:color w:val="000000"/>
-        </w:rPr>
-        <w:t>Informar al Consejo de Administración sobre las exposiciones relevantes y desviaciones a los límites aprobados.</w:t>
+          <w:u w:val="single"/>
+        </w:rPr>
+        <w:t xml:space="preserve">Informar al Consejo de Administración sobre las exposiciones relevantes y desviaciones a los límites aprobados.</w:t>
       </w:r>
     </w:p>
     <w:p>
@@ -3450,8 +3970,9 @@
         <w:rPr>
           <w:rFonts w:ascii="Arial" w:hAnsi="Arial" w:cs="Arial"/>
           <w:color w:val="000000" w:themeColor="text1"/>
-        </w:rPr>
-        <w:t>, así como su reevaluación anual o ante cambios significativos en el servicio o en el proveedor.</w:t>
+          <w:u w:val="single"/>
+        </w:rPr>
+        <w:t xml:space="preserve">, así como su reevaluación anual o ante cambios significativos en el servicio o en el proveedor.</w:t>
       </w:r>
     </w:p>
     <w:p>
@@ -3490,8 +4011,9 @@
         <w:rPr>
           <w:rFonts w:ascii="Arial" w:hAnsi="Arial" w:cs="Arial"/>
           <w:color w:val="000000" w:themeColor="text1"/>
-        </w:rPr>
-        <w:t>tales como</w:t>
+          <w:u w:val="single"/>
+        </w:rPr>
+        <w:t xml:space="preserve">tales como</w:t>
       </w:r>
       <w:r>
         <w:rPr>
@@ -3504,8 +4026,9 @@
         <w:rPr>
           <w:rFonts w:ascii="Arial" w:hAnsi="Arial" w:cs="Arial"/>
           <w:color w:val="000000" w:themeColor="text1"/>
-        </w:rPr>
-        <w:t>s</w:t>
+          <w:u w:val="single"/>
+        </w:rPr>
+        <w:t xml:space="preserve">s</w:t>
       </w:r>
       <w:r>
         <w:rPr>
@@ -3544,6 +4067,7 @@
         <w:rPr>
           <w:rFonts w:ascii="Arial" w:hAnsi="Arial" w:cs="Arial"/>
           <w:color w:val="000000"/>
+          <w:u w:val="single"/>
         </w:rPr>
         <w:t xml:space="preserve">Elaborar la evaluación integral de riesgos previa a la contratación, que incluya riesgo operacional, incluyendo el tecnológico y el legal (NRP-42), riesgo reputacional (NRP-20), riesgo de concentración (NRP-23) y de contraparte del proveedor (NRP-42), impacto en liquidez (NRP-05) y riesgo de continuidad (NRP-24), proponiendo los mecanismos de mitigación correspondientes.</w:t>
       </w:r>
@@ -3577,6 +4101,7 @@
         <w:rPr>
           <w:rFonts w:ascii="Arial" w:hAnsi="Arial" w:cs="Arial"/>
           <w:color w:val="000000"/>
+          <w:u w:val="single"/>
         </w:rPr>
         <w:t xml:space="preserve">Mantener actualizado el análisis de concentración de proveedores (por proveedor, grupo económico, tecnología y ubicación geográfica) y reportar al Comité de Riesgos las exposiciones que superen los límites aprobados.</w:t>
       </w:r>
@@ -3610,8 +4135,9 @@
         <w:rPr>
           <w:rFonts w:ascii="Arial" w:hAnsi="Arial" w:cs="Arial"/>
           <w:color w:val="000000"/>
-        </w:rPr>
-        <w:t>Definir, calcular y reportar semestralmente al Comité de Riesgos los indicadores clave de riesgo (KRI) de tercerización.</w:t>
+          <w:u w:val="single"/>
+        </w:rPr>
+        <w:t xml:space="preserve">Definir, calcular y reportar semestralmente al Comité de Riesgos los indicadores clave de riesgo (KRI) de tercerización.</w:t>
       </w:r>
     </w:p>
     <w:p>
@@ -3643,8 +4169,9 @@
         <w:rPr>
           <w:rFonts w:ascii="Arial" w:hAnsi="Arial" w:cs="Arial"/>
           <w:color w:val="000000" w:themeColor="text1"/>
-        </w:rPr>
-        <w:t>Registrar en la base de datos de eventos de riesgo operacional las pérdidas e incidentes originados en proveedores de servicios críticos tercerizados (NRP-42).</w:t>
+          <w:u w:val="single"/>
+        </w:rPr>
+        <w:t xml:space="preserve">Registrar en la base de datos de eventos de riesgo operacional las pérdidas e incidentes originados en proveedores de servicios críticos tercerizados (NRP-42).</w:t>
       </w:r>
     </w:p>
     <w:p>
@@ -3727,7 +4254,22 @@
           <w:rFonts w:ascii="Arial" w:hAnsi="Arial" w:cs="Arial"/>
           <w:color w:val="000000" w:themeColor="text1"/>
         </w:rPr>
-        <w:t xml:space="preserve">Brindar opinión de seguridad de la información respecto a que los servicios críticos de tecnología a contratar cumplan con las condiciones establecidas en la NRP-23.</w:t>
+        <w:t xml:space="preserve">Brindar opinión de seguridad de la </w:t>
+      </w:r>
+      <w:r>
+        <w:rPr>
+          <w:rFonts w:ascii="Arial" w:hAnsi="Arial" w:cs="Arial"/>
+          <w:color w:val="000000" w:themeColor="text1"/>
+          <w:u w:val="single"/>
+        </w:rPr>
+        <w:t xml:space="preserve">información respecto a</w:t>
+      </w:r>
+      <w:r>
+        <w:rPr>
+          <w:rFonts w:ascii="Arial" w:hAnsi="Arial" w:cs="Arial"/>
+          <w:color w:val="000000" w:themeColor="text1"/>
+        </w:rPr>
+        <w:t xml:space="preserve"> que los servicios críticos de tecnología a contratar cumplan con las condiciones establecidas en la NRP-23.</w:t>
       </w:r>
     </w:p>
     <w:p>
@@ -3764,7 +4306,22 @@
           <w:rFonts w:ascii="Arial" w:hAnsi="Arial" w:cs="Arial"/>
           <w:color w:val="000000" w:themeColor="text1"/>
         </w:rPr>
-        <w:t>Dar seguimiento a los planes de acción que se establezcan para solucionar brechas relacionadas a la seguridad de la información y ciberseguridad.</w:t>
+        <w:t xml:space="preserve">Dar seguimiento a los planes de acción que </w:t>
+      </w:r>
+      <w:r>
+        <w:rPr>
+          <w:rFonts w:ascii="Arial" w:hAnsi="Arial" w:cs="Arial"/>
+          <w:color w:val="000000" w:themeColor="text1"/>
+          <w:u w:val="single"/>
+        </w:rPr>
+        <w:t xml:space="preserve">se</w:t>
+      </w:r>
+      <w:r>
+        <w:rPr>
+          <w:rFonts w:ascii="Arial" w:hAnsi="Arial" w:cs="Arial"/>
+          <w:color w:val="000000" w:themeColor="text1"/>
+        </w:rPr>
+        <w:t xml:space="preserve"> establezcan para solucionar brechas relacionadas a la seguridad de la información y ciberseguridad.</w:t>
       </w:r>
     </w:p>
     <w:p>
@@ -3797,7 +4354,22 @@
           <w:rFonts w:ascii="Arial" w:hAnsi="Arial" w:cs="Arial"/>
           <w:color w:val="000000" w:themeColor="text1"/>
         </w:rPr>
-        <w:t xml:space="preserve">Asesorar a los Gerentes y Jefes en la verificación del servicio a contratar, para que se cumpla con las condiciones establecidas en el Anexo 1 (Condiciones para tercerizar Actividades u Operaciones de Tecnología de la Información relacionadas a productos y servicios financieros) de la presente política, referidas en las Normas Técnicas para la Gestión de la Seguridad de la Información (NRP-23).</w:t>
+        <w:t xml:space="preserve">Asesorar a los Gerentes y Jefes en la verificación del servicio a contratar, para que se cumpla con las condiciones establecidas en el Anexo 1 (Condiciones para tercerizar Actividades u Operaciones de Tecnología de </w:t>
+      </w:r>
+      <w:r>
+        <w:rPr>
+          <w:rFonts w:ascii="Arial" w:hAnsi="Arial" w:cs="Arial"/>
+          <w:color w:val="000000" w:themeColor="text1"/>
+          <w:u w:val="single"/>
+        </w:rPr>
+        <w:t xml:space="preserve">la Información relacionadas a productos y servicios financieros)</w:t>
+      </w:r>
+      <w:r>
+        <w:rPr>
+          <w:rFonts w:ascii="Arial" w:hAnsi="Arial" w:cs="Arial"/>
+          <w:color w:val="000000" w:themeColor="text1"/>
+        </w:rPr>
+        <w:t xml:space="preserve"> de la presente política, referidas en las Normas Técnicas para la Gestión de la Seguridad de la Información (NRP-23).</w:t>
       </w:r>
     </w:p>
     <w:p>
@@ -4035,7 +4607,67 @@
           <w:rFonts w:ascii="Arial" w:hAnsi="Arial" w:cs="Arial"/>
           <w:color w:val="000000" w:themeColor="text1"/>
         </w:rPr>
-        <w:t xml:space="preserve">Proveer la información del resultado de las negociaciones y obligaciones técnicas del proveedor, gestionar el acuerdo del Consejo de Administración (en los casos que aplique), e indicar las garantías o penalizaciones negociadas; asimismo, remitir el informe de criticidad y la Opinión de Seguridad de la Información al Jefe del Departamento Legal y Jefe de Servicios Generales, previo a la elaboración del contrato.</w:t>
+        <w:t xml:space="preserve">Proveer la información del resultado de las negociaciones y obligaciones técnicas del proveedor, gestionar el acuerdo del Consejo de Administración (en los casos que aplique), e indicar las garantías o penalizaciones negociadas; </w:t>
+      </w:r>
+      <w:r>
+        <w:rPr>
+          <w:rFonts w:ascii="Arial" w:hAnsi="Arial" w:cs="Arial"/>
+          <w:color w:val="000000" w:themeColor="text1"/>
+          <w:u w:val="single"/>
+        </w:rPr>
+        <w:t xml:space="preserve">asimismo,</w:t>
+      </w:r>
+      <w:r>
+        <w:rPr>
+          <w:rFonts w:ascii="Arial" w:hAnsi="Arial" w:cs="Arial"/>
+          <w:color w:val="000000" w:themeColor="text1"/>
+        </w:rPr>
+        <w:t xml:space="preserve"> remitir el informe de criticidad </w:t>
+      </w:r>
+      <w:r>
+        <w:rPr>
+          <w:rFonts w:ascii="Arial" w:hAnsi="Arial" w:cs="Arial"/>
+          <w:color w:val="000000" w:themeColor="text1"/>
+          <w:u w:val="single"/>
+        </w:rPr>
+        <w:t xml:space="preserve">y la</w:t>
+      </w:r>
+      <w:r>
+        <w:rPr>
+          <w:rFonts w:ascii="Arial" w:hAnsi="Arial" w:cs="Arial"/>
+          <w:color w:val="000000" w:themeColor="text1"/>
+        </w:rPr>
+        <w:t xml:space="preserve"> Opinión de Seguridad de la Información al Jefe del Departamento </w:t>
+      </w:r>
+      <w:r>
+        <w:rPr>
+          <w:rFonts w:ascii="Arial" w:hAnsi="Arial" w:cs="Arial"/>
+          <w:color w:val="000000" w:themeColor="text1"/>
+          <w:u w:val="single"/>
+        </w:rPr>
+        <w:t xml:space="preserve">Legal</w:t>
+      </w:r>
+      <w:r>
+        <w:rPr>
+          <w:rFonts w:ascii="Arial" w:hAnsi="Arial" w:cs="Arial"/>
+          <w:color w:val="000000" w:themeColor="text1"/>
+        </w:rPr>
+        <w:t xml:space="preserve"> y Jefe de Servicios </w:t>
+      </w:r>
+      <w:r>
+        <w:rPr>
+          <w:rFonts w:ascii="Arial" w:hAnsi="Arial" w:cs="Arial"/>
+          <w:color w:val="000000" w:themeColor="text1"/>
+          <w:u w:val="single"/>
+        </w:rPr>
+        <w:t xml:space="preserve">Generales,</w:t>
+      </w:r>
+      <w:r>
+        <w:rPr>
+          <w:rFonts w:ascii="Arial" w:hAnsi="Arial" w:cs="Arial"/>
+          <w:color w:val="000000" w:themeColor="text1"/>
+        </w:rPr>
+        <w:t xml:space="preserve"> previo a la elaboración del contrato.</w:t>
       </w:r>
     </w:p>
     <w:bookmarkEnd w:id="8"/>
@@ -4107,7 +4739,15 @@
           <w:rFonts w:ascii="Arial" w:hAnsi="Arial" w:cs="Arial"/>
           <w:color w:val="000000" w:themeColor="text1"/>
         </w:rPr>
-        <w:t xml:space="preserve">Solicitar al Departamento de Administración de Riesgos y a la Oficialía de Seguridad de la Información, previo a la contratación de servicios críticos tercerizados, una evaluación de los potenciales riesgos de los servicios a contratar, de acuerdo a lo establecido en las Normas Técnicas correspondientes (NRP-20, NRP-42, NRP-24, NRP-23 y NRP-05).</w:t>
+        <w:t xml:space="preserve">Solicitar al Departamento de Administración de Riesgos y a la Oficialía de Seguridad de la Información, previo a la contratación de servicios críticos tercerizados, una evaluación de los potenciales riesgos de los servicios a contratar, de acuerdo a lo establecido en las Normas Técnicas correspondientes </w:t>
+      </w:r>
+      <w:r>
+        <w:rPr>
+          <w:rFonts w:ascii="Arial" w:hAnsi="Arial" w:cs="Arial"/>
+          <w:color w:val="000000" w:themeColor="text1"/>
+          <w:u w:val="single"/>
+        </w:rPr>
+        <w:t xml:space="preserve">(NRP-20, NRP-42, NRP-24, NRP-23 y NRP-05).</w:t>
       </w:r>
     </w:p>
     <w:p>
@@ -4148,8 +4788,9 @@
         <w:rPr>
           <w:rFonts w:ascii="Arial" w:hAnsi="Arial" w:cs="Arial"/>
           <w:color w:val="000000" w:themeColor="text1"/>
-        </w:rPr>
-        <w:t>el</w:t>
+          <w:u w:val="single"/>
+        </w:rPr>
+        <w:t xml:space="preserve">el</w:t>
       </w:r>
       <w:r>
         <w:rPr>
@@ -4190,8 +4831,84 @@
         <w:rPr>
           <w:rFonts w:ascii="Arial" w:hAnsi="Arial" w:cs="Arial"/>
           <w:color w:val="000000" w:themeColor="text1"/>
-        </w:rPr>
-        <w:t xml:space="preserve">Reportar al Departamento de Administración de Riesgos todo evento de riesgo operacional, incidente, interrupción, incumplimiento o pérdida originada en el proveedor, dentro de los plazos establecidos en la normativa interna de gestión del riesgo operacional.</w:t>
+          <w:u w:val="single"/>
+        </w:rPr>
+        <w:t xml:space="preserve">Reportar</w:t>
+      </w:r>
+      <w:r>
+        <w:rPr>
+          <w:rFonts w:ascii="Arial" w:hAnsi="Arial" w:cs="Arial"/>
+          <w:color w:val="000000" w:themeColor="text1"/>
+        </w:rPr>
+        <w:t xml:space="preserve"> al Departamento de Administración de Riesgos </w:t>
+      </w:r>
+      <w:r>
+        <w:rPr>
+          <w:rFonts w:ascii="Arial" w:hAnsi="Arial" w:cs="Arial"/>
+          <w:color w:val="000000" w:themeColor="text1"/>
+          <w:u w:val="single"/>
+        </w:rPr>
+        <w:t xml:space="preserve">todo evento de riesgo operacional, incidente, interrupción, incumplimiento o pérdida originada</w:t>
+      </w:r>
+      <w:r>
+        <w:rPr>
+          <w:rFonts w:ascii="Arial" w:hAnsi="Arial" w:cs="Arial"/>
+          <w:color w:val="000000" w:themeColor="text1"/>
+        </w:rPr>
+        <w:t xml:space="preserve"> en </w:t>
+      </w:r>
+      <w:r>
+        <w:rPr>
+          <w:rFonts w:ascii="Arial" w:hAnsi="Arial" w:cs="Arial"/>
+          <w:color w:val="000000" w:themeColor="text1"/>
+          <w:u w:val="single"/>
+        </w:rPr>
+        <w:t xml:space="preserve">el proveedor, dentro</w:t>
+      </w:r>
+      <w:r>
+        <w:rPr>
+          <w:rFonts w:ascii="Arial" w:hAnsi="Arial" w:cs="Arial"/>
+          <w:color w:val="000000" w:themeColor="text1"/>
+        </w:rPr>
+        <w:t xml:space="preserve"> de </w:t>
+      </w:r>
+      <w:r>
+        <w:rPr>
+          <w:rFonts w:ascii="Arial" w:hAnsi="Arial" w:cs="Arial"/>
+          <w:color w:val="000000" w:themeColor="text1"/>
+          <w:u w:val="single"/>
+        </w:rPr>
+        <w:t xml:space="preserve">los plazos establecidos en</w:t>
+      </w:r>
+      <w:r>
+        <w:rPr>
+          <w:rFonts w:ascii="Arial" w:hAnsi="Arial" w:cs="Arial"/>
+          <w:color w:val="000000" w:themeColor="text1"/>
+        </w:rPr>
+        <w:t xml:space="preserve"> la </w:t>
+      </w:r>
+      <w:r>
+        <w:rPr>
+          <w:rFonts w:ascii="Arial" w:hAnsi="Arial" w:cs="Arial"/>
+          <w:color w:val="000000" w:themeColor="text1"/>
+          <w:u w:val="single"/>
+        </w:rPr>
+        <w:t xml:space="preserve">normativa interna</w:t>
+      </w:r>
+      <w:r>
+        <w:rPr>
+          <w:rFonts w:ascii="Arial" w:hAnsi="Arial" w:cs="Arial"/>
+          <w:color w:val="000000" w:themeColor="text1"/>
+        </w:rPr>
+        <w:t xml:space="preserve"> de </w:t>
+      </w:r>
+      <w:r>
+        <w:rPr>
+          <w:rFonts w:ascii="Arial" w:hAnsi="Arial" w:cs="Arial"/>
+          <w:color w:val="000000" w:themeColor="text1"/>
+          <w:u w:val="single"/>
+        </w:rPr>
+        <w:t xml:space="preserve">gestión del riesgo operacional.</w:t>
       </w:r>
     </w:p>
     <w:p>
@@ -4227,7 +4944,16 @@
           <w:b/>
           <w:color w:val="000000" w:themeColor="text1"/>
         </w:rPr>
-        <w:t xml:space="preserve">Jefe del Departamento Legal</w:t>
+        <w:t xml:space="preserve">Jefe del Departamento </w:t>
+      </w:r>
+      <w:r>
+        <w:rPr>
+          <w:rFonts w:ascii="Arial" w:hAnsi="Arial" w:cs="Arial"/>
+          <w:b/>
+          <w:color w:val="000000" w:themeColor="text1"/>
+          <w:u w:val="single"/>
+        </w:rPr>
+        <w:t xml:space="preserve">Legal</w:t>
       </w:r>
     </w:p>
     <w:p>
@@ -4287,7 +5013,30 @@
           <w:rFonts w:ascii="Arial" w:hAnsi="Arial" w:cs="Arial"/>
           <w:color w:val="000000"/>
         </w:rPr>
-        <w:t xml:space="preserve">Solicitar al Oficial de Seguridad de la Información las cláusulas del contrato que debe cumplir el servicio de acuerdo al Anexo No. 1, Sección B.</w:t>
+        <w:t xml:space="preserve">Solicitar al Oficial de Seguridad de la Información las cláusulas del contrato que debe cumplir el servicio de acuerdo al </w:t>
+      </w:r>
+      <w:r>
+        <w:rPr>
+          <w:rFonts w:ascii="Arial" w:hAnsi="Arial" w:cs="Arial"/>
+          <w:color w:val="000000"/>
+          <w:u w:val="single"/>
+        </w:rPr>
+        <w:t xml:space="preserve">Anexo</w:t>
+      </w:r>
+      <w:r>
+        <w:rPr>
+          <w:rFonts w:ascii="Arial" w:hAnsi="Arial" w:cs="Arial"/>
+          <w:color w:val="000000"/>
+        </w:rPr>
+        <w:t xml:space="preserve"> No. 1, </w:t>
+      </w:r>
+      <w:r>
+        <w:rPr>
+          <w:rFonts w:ascii="Arial" w:hAnsi="Arial" w:cs="Arial"/>
+          <w:color w:val="000000"/>
+          <w:u w:val="single"/>
+        </w:rPr>
+        <w:t xml:space="preserve">Sección B.</w:t>
       </w:r>
     </w:p>
     <w:p>
@@ -4323,7 +5072,22 @@
           <w:rFonts w:ascii="Arial" w:hAnsi="Arial" w:cs="Arial"/>
           <w:color w:val="000000" w:themeColor="text1"/>
         </w:rPr>
-        <w:t>Asegurar que se complete y firme la declaración jurada, previo a la firma del contrato, en la que el proveedor indique que cuenta con la gestión y planes de continuidad del negocio, y que además se compromete a brindar anualmente a la Cooperativa, o cuando lo requiera algún ente regulador o supervisor, un informe de las pruebas sobre dicha continuidad.</w:t>
+        <w:t xml:space="preserve">Asegurar que se complete y firme la declaración jurada, previo a la firma del contrato, en la que el proveedor indique que cuenta </w:t>
+      </w:r>
+      <w:r>
+        <w:rPr>
+          <w:rFonts w:ascii="Arial" w:hAnsi="Arial" w:cs="Arial"/>
+          <w:color w:val="000000" w:themeColor="text1"/>
+          <w:u w:val="single"/>
+        </w:rPr>
+        <w:t xml:space="preserve">con</w:t>
+      </w:r>
+      <w:r>
+        <w:rPr>
+          <w:rFonts w:ascii="Arial" w:hAnsi="Arial" w:cs="Arial"/>
+          <w:color w:val="000000" w:themeColor="text1"/>
+        </w:rPr>
+        <w:t xml:space="preserve"> la gestión y planes de continuidad del negocio, y que además se compromete a brindar anualmente a la Cooperativa, o cuando lo requiera algún ente regulador o supervisor, un informe de las pruebas sobre dicha continuidad.</w:t>
       </w:r>
     </w:p>
     <w:p>
@@ -4360,7 +5124,22 @@
           <w:rFonts w:ascii="Arial" w:hAnsi="Arial" w:cs="Arial"/>
           <w:color w:val="000000" w:themeColor="text1"/>
         </w:rPr>
-        <w:t>Remitir al Departamento de Servicios Generales una copia en digital del Contrato debidamente firmado para resguardo en el expediente.</w:t>
+        <w:t xml:space="preserve">Remitir al Departamento de Servicios Generales una </w:t>
+      </w:r>
+      <w:r>
+        <w:rPr>
+          <w:rFonts w:ascii="Arial" w:hAnsi="Arial" w:cs="Arial"/>
+          <w:color w:val="000000" w:themeColor="text1"/>
+          <w:u w:val="single"/>
+        </w:rPr>
+        <w:t xml:space="preserve">copia</w:t>
+      </w:r>
+      <w:r>
+        <w:rPr>
+          <w:rFonts w:ascii="Arial" w:hAnsi="Arial" w:cs="Arial"/>
+          <w:color w:val="000000" w:themeColor="text1"/>
+        </w:rPr>
+        <w:t xml:space="preserve"> en digital del Contrato debidamente firmado para resguardo en el expediente.</w:t>
       </w:r>
     </w:p>
     <w:p>
@@ -4516,7 +5295,30 @@
           <w:rFonts w:ascii="Arial" w:hAnsi="Arial" w:cs="Arial"/>
           <w:color w:val="000000"/>
         </w:rPr>
-        <w:t xml:space="preserve">Responsable de completar y actualizar la “Matriz Centralizada de Servicios Críticos Tercerizados” con los campos definidos en las Normas Técnicas para la Gestión del Riesgo Operacional de las Entidades Financieras (NRP-42): nombre del proveedor, tipo de servicio, monto del contrato, contraparte dentro de la Cooperativa y vigencia.</w:t>
+        <w:t xml:space="preserve">Responsable de completar y actualizar la “Matriz Centralizada de Servicios Críticos Tercerizados” con los campos definidos en las Normas </w:t>
+      </w:r>
+      <w:r>
+        <w:rPr>
+          <w:rFonts w:ascii="Arial" w:hAnsi="Arial" w:cs="Arial"/>
+          <w:color w:val="000000"/>
+          <w:u w:val="single"/>
+        </w:rPr>
+        <w:t xml:space="preserve">Técnicas</w:t>
+      </w:r>
+      <w:r>
+        <w:rPr>
+          <w:rFonts w:ascii="Arial" w:hAnsi="Arial" w:cs="Arial"/>
+          <w:color w:val="000000"/>
+        </w:rPr>
+        <w:t xml:space="preserve"> para la Gestión del Riesgo Operacional </w:t>
+      </w:r>
+      <w:r>
+        <w:rPr>
+          <w:rFonts w:ascii="Arial" w:hAnsi="Arial" w:cs="Arial"/>
+          <w:color w:val="000000"/>
+          <w:u w:val="single"/>
+        </w:rPr>
+        <w:t xml:space="preserve">de las Entidades Financieras (NRP-42): nombre del proveedor, tipo de servicio, monto del contrato, contraparte dentro de la Cooperativa y vigencia.</w:t>
       </w:r>
     </w:p>
     <w:p>
@@ -4713,7 +5515,22 @@
           <w:rFonts w:ascii="Arial" w:hAnsi="Arial" w:cs="Arial"/>
           <w:color w:val="000000"/>
         </w:rPr>
-        <w:t xml:space="preserve">Evaluar el cumplimiento de la presente Política.</w:t>
+        <w:t xml:space="preserve">Evaluar el cumplimiento </w:t>
+      </w:r>
+      <w:r>
+        <w:rPr>
+          <w:rFonts w:ascii="Arial" w:hAnsi="Arial" w:cs="Arial"/>
+          <w:color w:val="000000"/>
+          <w:u w:val="single"/>
+        </w:rPr>
+        <w:t xml:space="preserve">de</w:t>
+      </w:r>
+      <w:r>
+        <w:rPr>
+          <w:rFonts w:ascii="Arial" w:hAnsi="Arial" w:cs="Arial"/>
+          <w:color w:val="000000"/>
+        </w:rPr>
+        <w:t xml:space="preserve"> la presente Política.</w:t>
       </w:r>
     </w:p>
     <w:p>
@@ -4814,7 +5631,15 @@
           <w:rFonts w:ascii="Arial" w:hAnsi="Arial" w:cs="Arial"/>
           <w:color w:val="000000" w:themeColor="text1"/>
         </w:rPr>
-        <w:t xml:space="preserve"> y</w:t>
+        <w:t xml:space="preserve"> </w:t>
+      </w:r>
+      <w:r>
+        <w:rPr>
+          <w:rFonts w:ascii="Arial" w:hAnsi="Arial" w:cs="Arial"/>
+          <w:color w:val="000000" w:themeColor="text1"/>
+          <w:u w:val="single"/>
+        </w:rPr>
+        <w:t xml:space="preserve">y</w:t>
       </w:r>
       <w:r>
         <w:rPr>
@@ -4828,7 +5653,15 @@
           <w:rFonts w:ascii="Arial" w:hAnsi="Arial" w:cs="Arial"/>
           <w:color w:val="000000" w:themeColor="text1"/>
         </w:rPr>
-        <w:t xml:space="preserve"> del servicio.</w:t>
+        <w:t xml:space="preserve"> </w:t>
+      </w:r>
+      <w:r>
+        <w:rPr>
+          <w:rFonts w:ascii="Arial" w:hAnsi="Arial" w:cs="Arial"/>
+          <w:color w:val="000000" w:themeColor="text1"/>
+          <w:u w:val="single"/>
+        </w:rPr>
+        <w:t xml:space="preserve">del servicio.</w:t>
       </w:r>
     </w:p>
     <w:p>
@@ -4874,8 +5707,9 @@
         <w:rPr>
           <w:rFonts w:ascii="Arial" w:hAnsi="Arial" w:cs="Arial"/>
           <w:color w:val="000000" w:themeColor="text1"/>
-        </w:rPr>
-        <w:t>Crítico</w:t>
+          <w:u w:val="single"/>
+        </w:rPr>
+        <w:t xml:space="preserve">Crítico</w:t>
       </w:r>
       <w:r>
         <w:rPr>
@@ -4888,8 +5722,9 @@
         <w:rPr>
           <w:rFonts w:ascii="Arial" w:hAnsi="Arial" w:cs="Arial"/>
           <w:color w:val="000000" w:themeColor="text1"/>
-        </w:rPr>
-        <w:t>, afecten la posición de liquidez o comprometan el cumplimiento regulatorio,</w:t>
+          <w:u w:val="single"/>
+        </w:rPr>
+        <w:t xml:space="preserve">, afecten la posición de liquidez o comprometan el cumplimiento regulatorio,</w:t>
       </w:r>
       <w:r>
         <w:rPr>
@@ -5068,7 +5903,30 @@
                 <w:rFonts w:ascii="Arial" w:hAnsi="Arial" w:cs="Arial"/>
                 <w:color w:val="000000"/>
               </w:rPr>
-              <w:t xml:space="preserve">Las demoras o incidentes del proveedor del servicio interrumpen total o parcialmente la operatividad de los procesos críticos, por encima del Máximo Período Tolerable de Disrupción (MTPD) definido en el Análisis de Impacto del Negocio (BIA) (NRP-24).</w:t>
+              <w:t xml:space="preserve">Las demoras o incidentes del proveedor del servicio interrumpen </w:t>
+            </w:r>
+            <w:r>
+              <w:rPr>
+                <w:rFonts w:ascii="Arial" w:hAnsi="Arial" w:cs="Arial"/>
+                <w:color w:val="000000"/>
+                <w:u w:val="single"/>
+              </w:rPr>
+              <w:t xml:space="preserve">total o parcialmente</w:t>
+            </w:r>
+            <w:r>
+              <w:rPr>
+                <w:rFonts w:ascii="Arial" w:hAnsi="Arial" w:cs="Arial"/>
+                <w:color w:val="000000"/>
+              </w:rPr>
+              <w:t xml:space="preserve"> la operatividad de los procesos críticos, </w:t>
+            </w:r>
+            <w:r>
+              <w:rPr>
+                <w:rFonts w:ascii="Arial" w:hAnsi="Arial" w:cs="Arial"/>
+                <w:color w:val="000000"/>
+                <w:u w:val="single"/>
+              </w:rPr>
+              <w:t xml:space="preserve">por encima del Máximo Período Tolerable de Disrupción (MTPD) definido en el Análisis de Impacto del Negocio (BIA) (NRP-24).</w:t>
             </w:r>
           </w:p>
           <w:p>
@@ -5097,8 +5955,9 @@
               <w:rPr>
                 <w:rFonts w:ascii="Arial" w:hAnsi="Arial" w:cs="Arial"/>
                 <w:color w:val="000000"/>
-              </w:rPr>
-              <w:t>, conforme a los umbrales de severidad de la metodología de riesgo operacional (NRP-42).</w:t>
+                <w:u w:val="single"/>
+              </w:rPr>
+              <w:t xml:space="preserve">, conforme a los umbrales de severidad de la metodología de riesgo operacional (NRP-42).</w:t>
             </w:r>
           </w:p>
           <w:p>
@@ -5174,8 +6033,9 @@
               <w:rPr>
                 <w:rFonts w:ascii="Arial" w:hAnsi="Arial" w:cs="Arial"/>
                 <w:color w:val="000000"/>
-              </w:rPr>
-              <w:t>, o el tiempo de sustitución es superior al RTO del proceso (riesgo de concentración).</w:t>
+                <w:u w:val="single"/>
+              </w:rPr>
+              <w:t xml:space="preserve">, o el tiempo de sustitución es superior al RTO del proceso (riesgo de concentración).</w:t>
             </w:r>
           </w:p>
           <w:p>
@@ -5198,6 +6058,7 @@
                 <w:rFonts w:ascii="Arial" w:hAnsi="Arial" w:cs="Arial"/>
                 <w:b/>
                 <w:color w:val="000000"/>
+                <w:u w:val="single"/>
               </w:rPr>
               <w:t xml:space="preserve">Riesgo tecnológico (NRP-42):</w:t>
             </w:r>
@@ -5206,7 +6067,15 @@
                 <w:rFonts w:ascii="Arial" w:hAnsi="Arial" w:cs="Arial"/>
                 <w:color w:val="000000"/>
               </w:rPr>
-              <w:t xml:space="preserve"> el proveedor procesa, almacena o transmite información confidencial de asociados, o tiene acceso a los sistemas principales, bases de datos o infraestructura tecnológica de la Cooperativa.</w:t>
+              <w:t xml:space="preserve"> </w:t>
+            </w:r>
+            <w:r>
+              <w:rPr>
+                <w:rFonts w:ascii="Arial" w:hAnsi="Arial" w:cs="Arial"/>
+                <w:color w:val="000000"/>
+                <w:u w:val="single"/>
+              </w:rPr>
+              <w:t xml:space="preserve">el proveedor procesa, almacena o transmite información confidencial de asociados, o tiene acceso a los sistemas principales, bases de datos o infraestructura tecnológica de la Cooperativa.</w:t>
             </w:r>
           </w:p>
           <w:p>
@@ -5229,6 +6098,7 @@
                 <w:rFonts w:ascii="Arial" w:hAnsi="Arial" w:cs="Arial"/>
                 <w:b/>
                 <w:color w:val="000000"/>
+                <w:u w:val="single"/>
               </w:rPr>
               <w:t xml:space="preserve">Concentración y contraparte (NRP-23 / NRP-42):</w:t>
             </w:r>
@@ -5237,7 +6107,15 @@
                 <w:rFonts w:ascii="Arial" w:hAnsi="Arial" w:cs="Arial"/>
                 <w:color w:val="000000"/>
               </w:rPr>
-              <w:t xml:space="preserve"> el proveedor o su grupo económico presta más de un servicio crítico, o la Cooperativa le entrega anticipos, depósitos o recursos significativos expuestos a su solvencia.</w:t>
+              <w:t xml:space="preserve"> </w:t>
+            </w:r>
+            <w:r>
+              <w:rPr>
+                <w:rFonts w:ascii="Arial" w:hAnsi="Arial" w:cs="Arial"/>
+                <w:color w:val="000000"/>
+                <w:u w:val="single"/>
+              </w:rPr>
+              <w:t xml:space="preserve">el proveedor o su grupo económico presta más de un servicio crítico, o la Cooperativa le entrega anticipos, depósitos o recursos significativos expuestos a su solvencia.</w:t>
             </w:r>
           </w:p>
           <w:p>
@@ -5260,6 +6138,7 @@
                 <w:rFonts w:ascii="Arial" w:hAnsi="Arial" w:cs="Arial"/>
                 <w:b/>
                 <w:color w:val="000000"/>
+                <w:u w:val="single"/>
               </w:rPr>
               <w:t xml:space="preserve">Impacto en liquidez (NRP-05):</w:t>
             </w:r>
@@ -5268,7 +6147,15 @@
                 <w:rFonts w:ascii="Arial" w:hAnsi="Arial" w:cs="Arial"/>
                 <w:color w:val="000000"/>
               </w:rPr>
-              <w:t xml:space="preserve"> el servicio soporta canales de pago, transferencias, compensación, tarjetas, gestión de tesorería o captación de fondos, o su interrupción o terminación genera compromisos de pago relevantes para el flujo de efectivo.</w:t>
+              <w:t xml:space="preserve"> </w:t>
+            </w:r>
+            <w:r>
+              <w:rPr>
+                <w:rFonts w:ascii="Arial" w:hAnsi="Arial" w:cs="Arial"/>
+                <w:color w:val="000000"/>
+                <w:u w:val="single"/>
+              </w:rPr>
+              <w:t xml:space="preserve">el servicio soporta canales de pago, transferencias, compensación, tarjetas, gestión de tesorería o captación de fondos, o su interrupción o terminación genera compromisos de pago relevantes para el flujo de efectivo.</w:t>
             </w:r>
           </w:p>
         </w:tc>
@@ -5343,8 +6230,9 @@
             <w:r>
               <w:rPr>
                 <w:rFonts w:ascii="Arial" w:hAnsi="Arial" w:cs="Arial"/>
-              </w:rPr>
-              <w:t>críticos.</w:t>
+                <w:u w:val="single"/>
+              </w:rPr>
+              <w:t xml:space="preserve">críticos.</w:t>
             </w:r>
           </w:p>
           <w:p>
@@ -5370,8 +6258,9 @@
             <w:r>
               <w:rPr>
                 <w:rFonts w:ascii="Arial" w:hAnsi="Arial" w:cs="Arial"/>
-              </w:rPr>
-              <w:t>significativas.</w:t>
+                <w:u w:val="single"/>
+              </w:rPr>
+              <w:t xml:space="preserve">significativas.</w:t>
             </w:r>
           </w:p>
           <w:p>
@@ -5392,13 +6281,27 @@
               <w:rPr>
                 <w:rFonts w:ascii="Arial" w:hAnsi="Arial" w:cs="Arial"/>
               </w:rPr>
-              <w:t xml:space="preserve">No presenta quejas o reclamos </w:t>
-            </w:r>
-            <w:r>
-              <w:rPr>
-                <w:rFonts w:ascii="Arial" w:hAnsi="Arial" w:cs="Arial"/>
-              </w:rPr>
-              <w:t>relevantes de asociados.</w:t>
+              <w:t xml:space="preserve">No </w:t>
+            </w:r>
+            <w:r>
+              <w:rPr>
+                <w:rFonts w:ascii="Arial" w:hAnsi="Arial" w:cs="Arial"/>
+                <w:u w:val="single"/>
+              </w:rPr>
+              <w:t xml:space="preserve">presenta</w:t>
+            </w:r>
+            <w:r>
+              <w:rPr>
+                <w:rFonts w:ascii="Arial" w:hAnsi="Arial" w:cs="Arial"/>
+              </w:rPr>
+              <w:t xml:space="preserve"> quejas o reclamos </w:t>
+            </w:r>
+            <w:r>
+              <w:rPr>
+                <w:rFonts w:ascii="Arial" w:hAnsi="Arial" w:cs="Arial"/>
+                <w:u w:val="single"/>
+              </w:rPr>
+              <w:t xml:space="preserve">relevantes de asociados.</w:t>
             </w:r>
           </w:p>
           <w:p>
@@ -5460,8 +6363,9 @@
             <w:r>
               <w:rPr>
                 <w:rFonts w:ascii="Arial" w:hAnsi="Arial" w:cs="Arial"/>
-              </w:rPr>
-              <w:t>No tiene acceso a información confidencial ni a sistemas principales de la Cooperativa.</w:t>
+                <w:u w:val="single"/>
+              </w:rPr>
+              <w:t xml:space="preserve">No tiene acceso a información confidencial ni a sistemas principales de la Cooperativa.</w:t>
             </w:r>
           </w:p>
           <w:p>
@@ -5481,8 +6385,9 @@
             <w:r>
               <w:rPr>
                 <w:rFonts w:ascii="Arial" w:hAnsi="Arial" w:cs="Arial"/>
-              </w:rPr>
-              <w:t>No tiene impacto en la posición de liquidez ni en los canales de pago.</w:t>
+                <w:u w:val="single"/>
+              </w:rPr>
+              <w:t xml:space="preserve">No tiene impacto en la posición de liquidez ni en los canales de pago.</w:t>
             </w:r>
           </w:p>
         </w:tc>
@@ -5513,7 +6418,40 @@
         <w:rPr>
           <w:rFonts w:ascii="Arial" w:hAnsi="Arial" w:cs="Arial"/>
         </w:rPr>
-        <w:t xml:space="preserve">Para validar la criticidad de los servicios tercerizados, los Administradores de contratos que identifiquen que el servicio a contratar cumple las condiciones de criticidad y que pueda impactar directamente en los resultados de la Cooperativa deberán solicitar evaluación al Departamento de Administración de Riesgos, quien coordinará reunión para que en conjunto se realice la evaluación a través del formulario “Entrevista para elaborar el Análisis de Servicios Críticos Tercerizados” RP-GG-F-213, considerando los criterios establecidos en el cuadro anterior.</w:t>
+        <w:t xml:space="preserve">Para validar la criticidad de los servicios tercerizados, los Administradores de contratos que identifiquen que el servicio a contratar </w:t>
+      </w:r>
+      <w:r>
+        <w:rPr>
+          <w:rFonts w:ascii="Arial" w:hAnsi="Arial" w:cs="Arial"/>
+          <w:u w:val="single"/>
+        </w:rPr>
+        <w:t xml:space="preserve">cumple</w:t>
+      </w:r>
+      <w:r>
+        <w:rPr>
+          <w:rFonts w:ascii="Arial" w:hAnsi="Arial" w:cs="Arial"/>
+        </w:rPr>
+        <w:t xml:space="preserve"> las condiciones de criticidad y que </w:t>
+      </w:r>
+      <w:r>
+        <w:rPr>
+          <w:rFonts w:ascii="Arial" w:hAnsi="Arial" w:cs="Arial"/>
+          <w:u w:val="single"/>
+        </w:rPr>
+        <w:t xml:space="preserve">pueda</w:t>
+      </w:r>
+      <w:r>
+        <w:rPr>
+          <w:rFonts w:ascii="Arial" w:hAnsi="Arial" w:cs="Arial"/>
+        </w:rPr>
+        <w:t xml:space="preserve"> impactar directamente en los resultados de la Cooperativa deberán solicitar evaluación al Departamento de Administración de Riesgos, quien coordinará reunión para que en conjunto se realice la evaluación a través del formulario “Entrevista para elaborar el Análisis de Servicios Críticos Tercerizados” RP-GG-F-213, </w:t>
+      </w:r>
+      <w:r>
+        <w:rPr>
+          <w:rFonts w:ascii="Arial" w:hAnsi="Arial" w:cs="Arial"/>
+          <w:u w:val="single"/>
+        </w:rPr>
+        <w:t xml:space="preserve">considerando los criterios establecidos en el cuadro anterior.</w:t>
       </w:r>
     </w:p>
     <w:p>
@@ -5542,6 +6480,7 @@
         <w:rPr>
           <w:rFonts w:ascii="Arial" w:hAnsi="Arial" w:cs="Arial"/>
           <w:color w:val="000000"/>
+          <w:u w:val="single"/>
         </w:rPr>
         <w:t xml:space="preserve">El resultado de la evaluación clasificará el servicio en nivel de criticidad Alto, Medio o Bajo dentro de la categoría de Servicio Crítico, a efecto de determinar la profundidad de la debida diligencia y la frecuencia de monitoreo.</w:t>
       </w:r>
@@ -5572,6 +6511,7 @@
         <w:rPr>
           <w:rFonts w:ascii="Arial" w:hAnsi="Arial" w:cs="Arial"/>
           <w:color w:val="000000"/>
+          <w:u w:val="single"/>
         </w:rPr>
         <w:t xml:space="preserve">La criticidad de cada servicio deberá reevaluarse anualmente y cada vez que ocurra un cambio significativo en el alcance del servicio, en el proveedor (cambio de control, deterioro financiero o reubicación) o en los procesos críticos de la Cooperativa.</w:t>
       </w:r>
@@ -5651,7 +6591,66 @@
         <w:rPr>
           <w:rFonts w:ascii="Arial" w:hAnsi="Arial" w:cs="Arial"/>
         </w:rPr>
-        <w:t xml:space="preserve">Cuando cada Gerente y/o Jefatura, en coordinación con la Gerencia de Sistemas, determine la necesidad de efectuar sustituciones, reemplazos o cambios importantes de sistemas informáticos principales, sean estos sistemas gestores de bases de datos o aplicaciones, o la adquisición de infraestructura y/o sistemas informáticos para nuevas operaciones, productos o servicios financieros que la Cooperativa ofrece a sus asociados y clientes, deberán presentar al Consejo de Administración la siguiente información, quien resolverá dejando constancia de su decisión en el Acta de Sesión correspondiente (NRP-23, art. 22):</w:t>
+        <w:t xml:space="preserve">Cuando cada Gerente y/o Jefatura, en coordinación con la Gerencia de Sistemas, </w:t>
+      </w:r>
+      <w:r>
+        <w:rPr>
+          <w:rFonts w:ascii="Arial" w:hAnsi="Arial" w:cs="Arial"/>
+          <w:u w:val="single"/>
+        </w:rPr>
+        <w:t xml:space="preserve">determine</w:t>
+      </w:r>
+      <w:r>
+        <w:rPr>
+          <w:rFonts w:ascii="Arial" w:hAnsi="Arial" w:cs="Arial"/>
+        </w:rPr>
+        <w:t xml:space="preserve"> la necesidad de efectuar sustituciones, </w:t>
+      </w:r>
+      <w:r>
+        <w:rPr>
+          <w:rFonts w:ascii="Arial" w:hAnsi="Arial" w:cs="Arial"/>
+          <w:u w:val="single"/>
+        </w:rPr>
+        <w:t xml:space="preserve">reemplazos</w:t>
+      </w:r>
+      <w:r>
+        <w:rPr>
+          <w:rFonts w:ascii="Arial" w:hAnsi="Arial" w:cs="Arial"/>
+        </w:rPr>
+        <w:t xml:space="preserve"> o </w:t>
+      </w:r>
+      <w:r>
+        <w:rPr>
+          <w:rFonts w:ascii="Arial" w:hAnsi="Arial" w:cs="Arial"/>
+          <w:u w:val="single"/>
+        </w:rPr>
+        <w:t xml:space="preserve">cambios importantes</w:t>
+      </w:r>
+      <w:r>
+        <w:rPr>
+          <w:rFonts w:ascii="Arial" w:hAnsi="Arial" w:cs="Arial"/>
+        </w:rPr>
+        <w:t xml:space="preserve"> de sistemas informáticos principales, sean estos sistemas gestores de bases de datos o aplicaciones, o la adquisición de </w:t>
+      </w:r>
+      <w:r>
+        <w:rPr>
+          <w:rFonts w:ascii="Arial" w:hAnsi="Arial" w:cs="Arial"/>
+          <w:u w:val="single"/>
+        </w:rPr>
+        <w:t xml:space="preserve">infraestructura y/o</w:t>
+      </w:r>
+      <w:r>
+        <w:rPr>
+          <w:rFonts w:ascii="Arial" w:hAnsi="Arial" w:cs="Arial"/>
+        </w:rPr>
+        <w:t xml:space="preserve"> sistemas informáticos para nuevas operaciones, productos o servicios financieros que la Cooperativa ofrece a sus asociados y clientes, deberán presentar al Consejo de Administración la siguiente información, </w:t>
+      </w:r>
+      <w:r>
+        <w:rPr>
+          <w:rFonts w:ascii="Arial" w:hAnsi="Arial" w:cs="Arial"/>
+          <w:u w:val="single"/>
+        </w:rPr>
+        <w:t xml:space="preserve">quien resolverá dejando constancia de su decisión en el Acta de Sesión correspondiente (NRP-23, art. 22):</w:t>
       </w:r>
     </w:p>
     <w:p>
@@ -5833,7 +6832,60 @@
           <w:rFonts w:ascii="Arial" w:eastAsiaTheme="minorEastAsia" w:hAnsi="Arial" w:cs="Arial"/>
           <w:lang w:val="es-MX" w:eastAsia="es-MX"/>
         </w:rPr>
-        <w:t xml:space="preserve">Para la tercerización de actividades como las detalladas en el párrafo anterior, el Administrador de contrato deberá solicitar al proveedor del servicio la documentación descrita en el Anexo No. 1, así como lo establecido en el Manual de Compras de Bienes y Servicios (RP-GA-M-001), la cual deberá consolidarse y enviarse a Servicios Generales para archivarla en el expediente. Conforme a la NRP-23, la información antes detallada deberá remitirse a la Superintendencia con quince días hábiles de anticipación a la puesta en producción; asimismo, las condiciones del Anexo No. 1 deberán documentarse en un informe, acompañado de un cronograma de actividades con plazos, responsables e hitos de control, que se remitirá a la Superintendencia con quince días hábiles de anticipación a la puesta en producción de la actividad tercerizada.</w:t>
+        <w:t xml:space="preserve">Para la tercerización de actividades como las detalladas en el párrafo anterior, el Administrador de contrato deberá solicitar al proveedor del servicio la documentación descrita en el Anexo No. 1, </w:t>
+      </w:r>
+      <w:r>
+        <w:rPr>
+          <w:rFonts w:ascii="Arial" w:eastAsiaTheme="minorEastAsia" w:hAnsi="Arial" w:cs="Arial"/>
+          <w:u w:val="single"/>
+          <w:lang w:val="es-MX" w:eastAsia="es-MX"/>
+        </w:rPr>
+        <w:t xml:space="preserve">así como</w:t>
+      </w:r>
+      <w:r>
+        <w:rPr>
+          <w:rFonts w:ascii="Arial" w:eastAsiaTheme="minorEastAsia" w:hAnsi="Arial" w:cs="Arial"/>
+          <w:lang w:val="es-MX" w:eastAsia="es-MX"/>
+        </w:rPr>
+        <w:t xml:space="preserve"> lo establecido en el Manual de Compras de Bienes y Servicios (RP-GA-M-001), </w:t>
+      </w:r>
+      <w:r>
+        <w:rPr>
+          <w:rFonts w:ascii="Arial" w:eastAsiaTheme="minorEastAsia" w:hAnsi="Arial" w:cs="Arial"/>
+          <w:u w:val="single"/>
+          <w:lang w:val="es-MX" w:eastAsia="es-MX"/>
+        </w:rPr>
+        <w:t xml:space="preserve">la cual</w:t>
+      </w:r>
+      <w:r>
+        <w:rPr>
+          <w:rFonts w:ascii="Arial" w:eastAsiaTheme="minorEastAsia" w:hAnsi="Arial" w:cs="Arial"/>
+          <w:lang w:val="es-MX" w:eastAsia="es-MX"/>
+        </w:rPr>
+        <w:t xml:space="preserve"> deberá consolidarse y enviarse a Servicios Generales para </w:t>
+      </w:r>
+      <w:r>
+        <w:rPr>
+          <w:rFonts w:ascii="Arial" w:eastAsiaTheme="minorEastAsia" w:hAnsi="Arial" w:cs="Arial"/>
+          <w:u w:val="single"/>
+          <w:lang w:val="es-MX" w:eastAsia="es-MX"/>
+        </w:rPr>
+        <w:t xml:space="preserve">archivarla</w:t>
+      </w:r>
+      <w:r>
+        <w:rPr>
+          <w:rFonts w:ascii="Arial" w:eastAsiaTheme="minorEastAsia" w:hAnsi="Arial" w:cs="Arial"/>
+          <w:lang w:val="es-MX" w:eastAsia="es-MX"/>
+        </w:rPr>
+        <w:t xml:space="preserve"> en el expediente. </w:t>
+      </w:r>
+      <w:r>
+        <w:rPr>
+          <w:rFonts w:ascii="Arial" w:eastAsiaTheme="minorEastAsia" w:hAnsi="Arial" w:cs="Arial"/>
+          <w:u w:val="single"/>
+          <w:lang w:val="es-MX" w:eastAsia="es-MX"/>
+        </w:rPr>
+        <w:t xml:space="preserve">Conforme a la NRP-23, la información antes detallada deberá remitirse a la Superintendencia con quince días hábiles de anticipación a la puesta en producción; asimismo, las condiciones del Anexo No. 1 deberán documentarse en un informe, acompañado de un cronograma de actividades con plazos, responsables e hitos de control, que se remitirá a la Superintendencia con quince días hábiles de anticipación a la puesta en producción de la actividad tercerizada.</w:t>
       </w:r>
     </w:p>
     <w:p>
@@ -5946,8 +6998,9 @@
       <w:r>
         <w:rPr>
           <w:rFonts w:ascii="Arial" w:hAnsi="Arial" w:cs="Arial"/>
-        </w:rPr>
-        <w:t>, la cual comprenderá como mínimo:</w:t>
+          <w:u w:val="single"/>
+        </w:rPr>
+        <w:t xml:space="preserve">, la cual comprenderá como mínimo:</w:t>
       </w:r>
     </w:p>
     <w:p>
@@ -5968,14 +7021,22 @@
         <w:rPr>
           <w:rFonts w:ascii="Arial" w:hAnsi="Arial" w:cs="Arial"/>
           <w:b/>
-        </w:rPr>
-        <w:t>Riesgo operacional (NRP-42):</w:t>
-      </w:r>
-      <w:r>
-        <w:rPr>
-          <w:rFonts w:ascii="Arial" w:hAnsi="Arial" w:cs="Arial"/>
-        </w:rPr>
-        <w:t xml:space="preserve"> identificación de los factores de riesgo (procesos, personas, tecnología y eventos externos), estimación de la probabilidad e impacto, y controles mitigantes.</w:t>
+          <w:u w:val="single"/>
+        </w:rPr>
+        <w:t xml:space="preserve">Riesgo operacional (NRP-42):</w:t>
+      </w:r>
+      <w:r>
+        <w:rPr>
+          <w:rFonts w:ascii="Arial" w:hAnsi="Arial" w:cs="Arial"/>
+        </w:rPr>
+        <w:t xml:space="preserve"> </w:t>
+      </w:r>
+      <w:r>
+        <w:rPr>
+          <w:rFonts w:ascii="Arial" w:hAnsi="Arial" w:cs="Arial"/>
+          <w:u w:val="single"/>
+        </w:rPr>
+        <w:t xml:space="preserve">identificación de los factores de riesgo (procesos, personas, tecnología y eventos externos), estimación de la probabilidad e impacto, y controles mitigantes.</w:t>
       </w:r>
     </w:p>
     <w:p>
@@ -5996,6 +7057,7 @@
         <w:rPr>
           <w:rFonts w:ascii="Arial" w:hAnsi="Arial" w:cs="Arial"/>
           <w:b/>
+          <w:u w:val="single"/>
         </w:rPr>
         <w:t xml:space="preserve">Riesgo tecnológico (NRP-42):</w:t>
       </w:r>
@@ -6003,7 +7065,14 @@
         <w:rPr>
           <w:rFonts w:ascii="Arial" w:hAnsi="Arial" w:cs="Arial"/>
         </w:rPr>
-        <w:t xml:space="preserve"> dependencia de la infraestructura del proveedor, obsolescencia, capacidad, integración y seguridad de la solución.</w:t>
+        <w:t xml:space="preserve"> </w:t>
+      </w:r>
+      <w:r>
+        <w:rPr>
+          <w:rFonts w:ascii="Arial" w:hAnsi="Arial" w:cs="Arial"/>
+          <w:u w:val="single"/>
+        </w:rPr>
+        <w:t xml:space="preserve">dependencia de la infraestructura del proveedor, obsolescencia, capacidad, integración y seguridad de la solución.</w:t>
       </w:r>
     </w:p>
     <w:p>
@@ -6024,6 +7093,7 @@
         <w:rPr>
           <w:rFonts w:ascii="Arial" w:hAnsi="Arial" w:cs="Arial"/>
           <w:b/>
+          <w:u w:val="single"/>
         </w:rPr>
         <w:t xml:space="preserve">Riesgo de concentración (NRP-23):</w:t>
       </w:r>
@@ -6031,7 +7101,14 @@
         <w:rPr>
           <w:rFonts w:ascii="Arial" w:hAnsi="Arial" w:cs="Arial"/>
         </w:rPr>
-        <w:t xml:space="preserve"> número de servicios críticos asignados al mismo proveedor o grupo económico, concentración de entidades financieras en el mismo proveedor, dependencia tecnológica, concentración geográfica y disponibilidad de proveedores alternos en el mercado, estableciendo los mecanismos de mitigación y las acciones a realizar si el proveedor falla. Ningún proveedor o grupo económico podrá superar los límites de concentración aprobados por el Consejo de Administración (NRP-20) sin la aprobación expresa de éste.</w:t>
+        <w:t xml:space="preserve"> </w:t>
+      </w:r>
+      <w:r>
+        <w:rPr>
+          <w:rFonts w:ascii="Arial" w:hAnsi="Arial" w:cs="Arial"/>
+          <w:u w:val="single"/>
+        </w:rPr>
+        <w:t xml:space="preserve">número de servicios críticos asignados al mismo proveedor o grupo económico, concentración de entidades financieras en el mismo proveedor, dependencia tecnológica, concentración geográfica y disponibilidad de proveedores alternos en el mercado, estableciendo los mecanismos de mitigación y las acciones a realizar si el proveedor falla. Ningún proveedor o grupo económico podrá superar los límites de concentración aprobados por el Consejo de Administración (NRP-20) sin la aprobación expresa de éste.</w:t>
       </w:r>
     </w:p>
     <w:p>
@@ -6052,6 +7129,7 @@
         <w:rPr>
           <w:rFonts w:ascii="Arial" w:hAnsi="Arial" w:cs="Arial"/>
           <w:b/>
+          <w:u w:val="single"/>
         </w:rPr>
         <w:t xml:space="preserve">Riesgo de contraparte (NRP-42):</w:t>
       </w:r>
@@ -6059,7 +7137,14 @@
         <w:rPr>
           <w:rFonts w:ascii="Arial" w:hAnsi="Arial" w:cs="Arial"/>
         </w:rPr>
-        <w:t xml:space="preserve"> solidez financiera del proveedor, con base en estados financieros auditados de los dos últimos ejercicios, indicadores de solvencia, liquidez y endeudamiento, y calificaciones de riesgo cuando existan; así como la exposición de la Cooperativa por anticipos, depósitos o pagos adelantados, la cual deberá estar cubierta con garantías.</w:t>
+        <w:t xml:space="preserve"> </w:t>
+      </w:r>
+      <w:r>
+        <w:rPr>
+          <w:rFonts w:ascii="Arial" w:hAnsi="Arial" w:cs="Arial"/>
+          <w:u w:val="single"/>
+        </w:rPr>
+        <w:t xml:space="preserve">solidez financiera del proveedor, con base en estados financieros auditados de los dos últimos ejercicios, indicadores de solvencia, liquidez y endeudamiento, y calificaciones de riesgo cuando existan; así como la exposición de la Cooperativa por anticipos, depósitos o pagos adelantados, la cual deberá estar cubierta con garantías.</w:t>
       </w:r>
     </w:p>
     <w:p>
@@ -6080,6 +7165,7 @@
         <w:rPr>
           <w:rFonts w:ascii="Arial" w:hAnsi="Arial" w:cs="Arial"/>
           <w:b/>
+          <w:u w:val="single"/>
         </w:rPr>
         <w:t xml:space="preserve">Impacto en liquidez (NRP-05):</w:t>
       </w:r>
@@ -6087,7 +7173,14 @@
         <w:rPr>
           <w:rFonts w:ascii="Arial" w:hAnsi="Arial" w:cs="Arial"/>
         </w:rPr>
-        <w:t xml:space="preserve"> compromisos de pago, estructura de pagos, penalidades por terminación anticipada y efecto de una eventual interrupción del servicio en los canales de pago y en la gestión de tesorería.</w:t>
+        <w:t xml:space="preserve"> </w:t>
+      </w:r>
+      <w:r>
+        <w:rPr>
+          <w:rFonts w:ascii="Arial" w:hAnsi="Arial" w:cs="Arial"/>
+          <w:u w:val="single"/>
+        </w:rPr>
+        <w:t xml:space="preserve">compromisos de pago, estructura de pagos, penalidades por terminación anticipada y efecto de una eventual interrupción del servicio en los canales de pago y en la gestión de tesorería.</w:t>
       </w:r>
     </w:p>
     <w:p>
@@ -6108,6 +7201,7 @@
         <w:rPr>
           <w:rFonts w:ascii="Arial" w:hAnsi="Arial" w:cs="Arial"/>
           <w:b/>
+          <w:u w:val="single"/>
         </w:rPr>
         <w:t xml:space="preserve">Riesgo de continuidad (NRP-24):</w:t>
       </w:r>
@@ -6115,7 +7209,14 @@
         <w:rPr>
           <w:rFonts w:ascii="Arial" w:hAnsi="Arial" w:cs="Arial"/>
         </w:rPr>
-        <w:t xml:space="preserve"> capacidad del proveedor para cumplir el RTO y RPO requeridos por los procesos críticos que soporta, y existencia y resultados de las pruebas de su plan de continuidad del negocio.</w:t>
+        <w:t xml:space="preserve"> </w:t>
+      </w:r>
+      <w:r>
+        <w:rPr>
+          <w:rFonts w:ascii="Arial" w:hAnsi="Arial" w:cs="Arial"/>
+          <w:u w:val="single"/>
+        </w:rPr>
+        <w:t xml:space="preserve">capacidad del proveedor para cumplir el RTO y RPO requeridos por los procesos críticos que soporta, y existencia y resultados de las pruebas de su plan de continuidad del negocio.</w:t>
       </w:r>
     </w:p>
     <w:p>
@@ -6136,6 +7237,7 @@
         <w:rPr>
           <w:rFonts w:ascii="Arial" w:hAnsi="Arial" w:cs="Arial"/>
           <w:b/>
+          <w:u w:val="single"/>
         </w:rPr>
         <w:t xml:space="preserve">Riesgo legal y reputacional (NRP-20):</w:t>
       </w:r>
@@ -6143,7 +7245,14 @@
         <w:rPr>
           <w:rFonts w:ascii="Arial" w:hAnsi="Arial" w:cs="Arial"/>
         </w:rPr>
-        <w:t xml:space="preserve"> litigios, sanciones regulatorias y noticias adversas relacionadas con el proveedor que puedan afectar a la Cooperativa.</w:t>
+        <w:t xml:space="preserve"> </w:t>
+      </w:r>
+      <w:r>
+        <w:rPr>
+          <w:rFonts w:ascii="Arial" w:hAnsi="Arial" w:cs="Arial"/>
+          <w:u w:val="single"/>
+        </w:rPr>
+        <w:t xml:space="preserve">litigios, sanciones regulatorias y noticias adversas relacionadas con el proveedor que puedan afectar a la Cooperativa.</w:t>
       </w:r>
     </w:p>
     <w:p>
@@ -6178,7 +7287,37 @@
           <w:rFonts w:ascii="Arial" w:eastAsiaTheme="minorEastAsia" w:hAnsi="Arial" w:cs="Arial"/>
           <w:lang w:eastAsia="es-MX"/>
         </w:rPr>
-        <w:t>Para clasificar el nivel de riesgo de Seguridad de la Información de los proveedores que presten servicios críticos tercerizados relacionados a actividades u operaciones de Tecnología de la Información, el administrador del contrato deberá solicitar al proveedor seleccionado completar el cuestionario de “Autoevaluación de la Seguridad de la Información para Proveedores” y remitirlo al Oficial de Seguridad de la Información, quien brindará un informe al área requirente del servicio.</w:t>
+        <w:t xml:space="preserve">Para clasificar el nivel de riesgo de Seguridad de la Información de los proveedores que presten servicios críticos tercerizados relacionados a actividades u operaciones de Tecnología de la Información, el administrador del contrato deberá solicitar al proveedor seleccionado completar el cuestionario de “Autoevaluación de la Seguridad de la Información para Proveedores” y </w:t>
+      </w:r>
+      <w:r>
+        <w:rPr>
+          <w:rFonts w:ascii="Arial" w:eastAsiaTheme="minorEastAsia" w:hAnsi="Arial" w:cs="Arial"/>
+          <w:u w:val="single"/>
+          <w:lang w:eastAsia="es-MX"/>
+        </w:rPr>
+        <w:t xml:space="preserve">remitirlo</w:t>
+      </w:r>
+      <w:r>
+        <w:rPr>
+          <w:rFonts w:ascii="Arial" w:eastAsiaTheme="minorEastAsia" w:hAnsi="Arial" w:cs="Arial"/>
+          <w:lang w:eastAsia="es-MX"/>
+        </w:rPr>
+        <w:t xml:space="preserve"> al Oficial de Seguridad de la </w:t>
+      </w:r>
+      <w:r>
+        <w:rPr>
+          <w:rFonts w:ascii="Arial" w:eastAsiaTheme="minorEastAsia" w:hAnsi="Arial" w:cs="Arial"/>
+          <w:u w:val="single"/>
+          <w:lang w:eastAsia="es-MX"/>
+        </w:rPr>
+        <w:t xml:space="preserve">Información,</w:t>
+      </w:r>
+      <w:r>
+        <w:rPr>
+          <w:rFonts w:ascii="Arial" w:eastAsiaTheme="minorEastAsia" w:hAnsi="Arial" w:cs="Arial"/>
+          <w:lang w:eastAsia="es-MX"/>
+        </w:rPr>
+        <w:t xml:space="preserve"> quien brindará un informe al área requirente del servicio.</w:t>
       </w:r>
     </w:p>
     <w:p>
@@ -6209,6 +7348,7 @@
           <w:rFonts w:ascii="Arial" w:eastAsiaTheme="minorEastAsia" w:hAnsi="Arial" w:cs="Arial"/>
           <w:b/>
           <w:color w:val="000000"/>
+          <w:u w:val="single"/>
           <w:lang w:eastAsia="es-MX"/>
         </w:rPr>
         <w:t xml:space="preserve">Monitoreo continuo:</w:t>
@@ -6219,7 +7359,16 @@
           <w:color w:val="000000"/>
           <w:lang w:eastAsia="es-MX"/>
         </w:rPr>
-        <w:t xml:space="preserve"> la evaluación de riesgos no concluye con la contratación. El Departamento de Administración de Riesgos reevaluará semestralmente a los proveedores de criticidad Alta y anualmente a los de criticidad Media y Baja, considerando la debida diligencia del proveedor, la cual deberá documentarse y revisarse anualmente con la información más reciente (NRP-23), el cumplimiento de los ANS, los eventos de riesgo operacional registrados y los resultados de las pruebas de continuidad y de seguridad de la información. Los resultados se informarán al Comité de Riesgos.</w:t>
+        <w:t xml:space="preserve"> </w:t>
+      </w:r>
+      <w:r>
+        <w:rPr>
+          <w:rFonts w:ascii="Arial" w:eastAsiaTheme="minorEastAsia" w:hAnsi="Arial" w:cs="Arial"/>
+          <w:color w:val="000000"/>
+          <w:u w:val="single"/>
+          <w:lang w:eastAsia="es-MX"/>
+        </w:rPr>
+        <w:t xml:space="preserve">la evaluación de riesgos no concluye con la contratación. El Departamento de Administración de Riesgos reevaluará semestralmente a los proveedores de criticidad Alta y anualmente a los de criticidad Media y Baja, considerando la debida diligencia del proveedor, la cual deberá documentarse y revisarse anualmente con la información más reciente (NRP-23), el cumplimiento de los ANS, los eventos de riesgo operacional registrados y los resultados de las pruebas de continuidad y de seguridad de la información. Los resultados se informarán al Comité de Riesgos.</w:t>
       </w:r>
     </w:p>
     <w:p>
@@ -6315,8 +7464,9 @@
         <w:rPr>
           <w:rFonts w:ascii="Arial" w:hAnsi="Arial" w:cs="Arial"/>
           <w:color w:val="000000" w:themeColor="text1"/>
-        </w:rPr>
-        <w:t>y</w:t>
+          <w:u w:val="single"/>
+        </w:rPr>
+        <w:t xml:space="preserve">y</w:t>
       </w:r>
       <w:r>
         <w:rPr>
@@ -6329,8 +7479,9 @@
         <w:rPr>
           <w:rFonts w:ascii="Arial" w:hAnsi="Arial" w:cs="Arial"/>
           <w:color w:val="000000" w:themeColor="text1"/>
-        </w:rPr>
-        <w:t>los proveedores</w:t>
+          <w:u w:val="single"/>
+        </w:rPr>
+        <w:t xml:space="preserve">los proveedores</w:t>
       </w:r>
       <w:r>
         <w:rPr>
@@ -6343,8 +7494,9 @@
         <w:rPr>
           <w:rFonts w:ascii="Arial" w:hAnsi="Arial" w:cs="Arial"/>
           <w:color w:val="000000" w:themeColor="text1"/>
-        </w:rPr>
-        <w:t>o certificación vigente</w:t>
+          <w:u w:val="single"/>
+        </w:rPr>
+        <w:t xml:space="preserve">o certificación vigente</w:t>
       </w:r>
       <w:r>
         <w:rPr>
@@ -6357,15 +7509,17 @@
         <w:rPr>
           <w:rFonts w:ascii="Arial" w:hAnsi="Arial" w:cs="Arial"/>
           <w:color w:val="000000" w:themeColor="text1"/>
-        </w:rPr>
-        <w:t>, Sección B</w:t>
-      </w:r>
-      <w:r>
-        <w:rPr>
-          <w:rFonts w:ascii="Arial" w:hAnsi="Arial" w:cs="Arial"/>
-          <w:color w:val="000000" w:themeColor="text1"/>
-        </w:rPr>
-        <w:t>).</w:t>
+          <w:u w:val="single"/>
+        </w:rPr>
+        <w:t xml:space="preserve">, Sección B</w:t>
+      </w:r>
+      <w:r>
+        <w:rPr>
+          <w:rFonts w:ascii="Arial" w:hAnsi="Arial" w:cs="Arial"/>
+          <w:color w:val="000000" w:themeColor="text1"/>
+          <w:u w:val="single"/>
+        </w:rPr>
+        <w:t xml:space="preserve">).</w:t>
       </w:r>
     </w:p>
     <w:p>
@@ -6456,6 +7610,7 @@
         <w:rPr>
           <w:rFonts w:ascii="Arial" w:hAnsi="Arial" w:cs="Arial"/>
           <w:color w:val="000000" w:themeColor="text1"/>
+          <w:u w:val="single"/>
         </w:rPr>
         <w:t xml:space="preserve">de R.L.</w:t>
       </w:r>
@@ -6470,8 +7625,9 @@
         <w:rPr>
           <w:rFonts w:ascii="Arial" w:hAnsi="Arial" w:cs="Arial"/>
           <w:color w:val="000000" w:themeColor="text1"/>
-        </w:rPr>
-        <w:t>y que</w:t>
+          <w:u w:val="single"/>
+        </w:rPr>
+        <w:t xml:space="preserve">y que</w:t>
       </w:r>
       <w:r>
         <w:rPr>
@@ -6484,15 +7640,17 @@
         <w:rPr>
           <w:rFonts w:ascii="Arial" w:hAnsi="Arial" w:cs="Arial"/>
           <w:color w:val="000000" w:themeColor="text1"/>
-        </w:rPr>
-        <w:t>, Sección B</w:t>
-      </w:r>
-      <w:r>
-        <w:rPr>
-          <w:rFonts w:ascii="Arial" w:hAnsi="Arial" w:cs="Arial"/>
-          <w:color w:val="000000" w:themeColor="text1"/>
-        </w:rPr>
-        <w:t>).</w:t>
+          <w:u w:val="single"/>
+        </w:rPr>
+        <w:t xml:space="preserve">, Sección B</w:t>
+      </w:r>
+      <w:r>
+        <w:rPr>
+          <w:rFonts w:ascii="Arial" w:hAnsi="Arial" w:cs="Arial"/>
+          <w:color w:val="000000" w:themeColor="text1"/>
+          <w:u w:val="single"/>
+        </w:rPr>
+        <w:t xml:space="preserve">).</w:t>
       </w:r>
     </w:p>
     <w:p>
@@ -6541,7 +7699,82 @@
           <w:rFonts w:ascii="Arial" w:hAnsi="Arial" w:cs="Arial"/>
           <w:color w:val="000000" w:themeColor="text1"/>
         </w:rPr>
-        <w:t xml:space="preserve">En los contratos con proveedores debe quedar establecido el derecho de la Cooperativa a revocar los accesos o interrumpir la conexión a los sistemas o información de COMEDICA de R.L. unilateralmente, si se detecta un ciberataque cuyo origen sea la red o los sistemas del proveedor.</w:t>
+        <w:t xml:space="preserve">En los contratos con proveedores debe quedar </w:t>
+      </w:r>
+      <w:r>
+        <w:rPr>
+          <w:rFonts w:ascii="Arial" w:hAnsi="Arial" w:cs="Arial"/>
+          <w:color w:val="000000" w:themeColor="text1"/>
+          <w:u w:val="single"/>
+        </w:rPr>
+        <w:t xml:space="preserve">establecido</w:t>
+      </w:r>
+      <w:r>
+        <w:rPr>
+          <w:rFonts w:ascii="Arial" w:hAnsi="Arial" w:cs="Arial"/>
+          <w:color w:val="000000" w:themeColor="text1"/>
+        </w:rPr>
+        <w:t xml:space="preserve"> el derecho de la Cooperativa a revocar los accesos o interrumpir la conexión a los sistemas o información de COMEDICA </w:t>
+      </w:r>
+      <w:r>
+        <w:rPr>
+          <w:rFonts w:ascii="Arial" w:hAnsi="Arial" w:cs="Arial"/>
+          <w:color w:val="000000" w:themeColor="text1"/>
+          <w:u w:val="single"/>
+        </w:rPr>
+        <w:t xml:space="preserve">de R.L.</w:t>
+      </w:r>
+      <w:r>
+        <w:rPr>
+          <w:rFonts w:ascii="Arial" w:hAnsi="Arial" w:cs="Arial"/>
+          <w:color w:val="000000" w:themeColor="text1"/>
+        </w:rPr>
+        <w:t xml:space="preserve"> unilateralmente, si </w:t>
+      </w:r>
+      <w:r>
+        <w:rPr>
+          <w:rFonts w:ascii="Arial" w:hAnsi="Arial" w:cs="Arial"/>
+          <w:color w:val="000000" w:themeColor="text1"/>
+          <w:u w:val="single"/>
+        </w:rPr>
+        <w:t xml:space="preserve">se detecta</w:t>
+      </w:r>
+      <w:r>
+        <w:rPr>
+          <w:rFonts w:ascii="Arial" w:hAnsi="Arial" w:cs="Arial"/>
+          <w:color w:val="000000" w:themeColor="text1"/>
+        </w:rPr>
+        <w:t xml:space="preserve"> un ciberataque cuyo origen </w:t>
+      </w:r>
+      <w:r>
+        <w:rPr>
+          <w:rFonts w:ascii="Arial" w:hAnsi="Arial" w:cs="Arial"/>
+          <w:color w:val="000000" w:themeColor="text1"/>
+          <w:u w:val="single"/>
+        </w:rPr>
+        <w:t xml:space="preserve">sea</w:t>
+      </w:r>
+      <w:r>
+        <w:rPr>
+          <w:rFonts w:ascii="Arial" w:hAnsi="Arial" w:cs="Arial"/>
+          <w:color w:val="000000" w:themeColor="text1"/>
+        </w:rPr>
+        <w:t xml:space="preserve"> la red o </w:t>
+      </w:r>
+      <w:r>
+        <w:rPr>
+          <w:rFonts w:ascii="Arial" w:hAnsi="Arial" w:cs="Arial"/>
+          <w:color w:val="000000" w:themeColor="text1"/>
+          <w:u w:val="single"/>
+        </w:rPr>
+        <w:t xml:space="preserve">los</w:t>
+      </w:r>
+      <w:r>
+        <w:rPr>
+          <w:rFonts w:ascii="Arial" w:hAnsi="Arial" w:cs="Arial"/>
+          <w:color w:val="000000" w:themeColor="text1"/>
+        </w:rPr>
+        <w:t xml:space="preserve"> sistemas del proveedor.</w:t>
       </w:r>
     </w:p>
     <w:p>
@@ -6622,8 +7855,46 @@
         <w:rPr>
           <w:rFonts w:ascii="Arial" w:hAnsi="Arial" w:cs="Arial"/>
           <w:color w:val="000000" w:themeColor="text1"/>
-        </w:rPr>
-        <w:t xml:space="preserve">El Jefe de Servicios Generales velará porque los proveedores de Servicios Críticos Tercerizados llenen el formulario de Carta de Compromiso Transparencia en las Relaciones Comerciales, para que confirmen que no poseen conflictos de interés, de conformidad a lo establecido en el Código de Gobierno Corporativo, Código de Conducta y Manual de Compras de Bienes y Servicios (RP-GA-M-001).</w:t>
+          <w:u w:val="single"/>
+        </w:rPr>
+        <w:t xml:space="preserve">El</w:t>
+      </w:r>
+      <w:r>
+        <w:rPr>
+          <w:rFonts w:ascii="Arial" w:hAnsi="Arial" w:cs="Arial"/>
+          <w:color w:val="000000" w:themeColor="text1"/>
+        </w:rPr>
+        <w:t xml:space="preserve"> Jefe de Servicios Generales velará porque los proveedores de Servicios Críticos Tercerizados llenen el formulario de Carta de Compromiso Transparencia en las Relaciones Comerciales, para que </w:t>
+      </w:r>
+      <w:r>
+        <w:rPr>
+          <w:rFonts w:ascii="Arial" w:hAnsi="Arial" w:cs="Arial"/>
+          <w:color w:val="000000" w:themeColor="text1"/>
+          <w:u w:val="single"/>
+        </w:rPr>
+        <w:t xml:space="preserve">confirmen</w:t>
+      </w:r>
+      <w:r>
+        <w:rPr>
+          <w:rFonts w:ascii="Arial" w:hAnsi="Arial" w:cs="Arial"/>
+          <w:color w:val="000000" w:themeColor="text1"/>
+        </w:rPr>
+        <w:t xml:space="preserve"> que no </w:t>
+      </w:r>
+      <w:r>
+        <w:rPr>
+          <w:rFonts w:ascii="Arial" w:hAnsi="Arial" w:cs="Arial"/>
+          <w:color w:val="000000" w:themeColor="text1"/>
+          <w:u w:val="single"/>
+        </w:rPr>
+        <w:t xml:space="preserve">poseen</w:t>
+      </w:r>
+      <w:r>
+        <w:rPr>
+          <w:rFonts w:ascii="Arial" w:hAnsi="Arial" w:cs="Arial"/>
+          <w:color w:val="000000" w:themeColor="text1"/>
+        </w:rPr>
+        <w:t xml:space="preserve"> conflictos de interés, de conformidad a lo establecido en el Código de Gobierno Corporativo, Código de Conducta y Manual de Compras de Bienes y Servicios (RP-GA-M-001).</w:t>
       </w:r>
     </w:p>
     <w:p>
@@ -6674,8 +7945,9 @@
           <w:rFonts w:ascii="Arial" w:hAnsi="Arial" w:cs="Arial"/>
           <w:b/>
           <w:color w:val="000000"/>
-        </w:rPr>
-        <w:t>MONITOREO, INDICADORES CLAVE DE RIESGO Y REPORTES</w:t>
+          <w:u w:val="single"/>
+        </w:rPr>
+        <w:t xml:space="preserve">MONITOREO, INDICADORES CLAVE DE RIESGO Y REPORTES</w:t>
       </w:r>
       <w:bookmarkEnd w:id="29"/>
     </w:p>
@@ -6708,8 +7980,9 @@
         <w:rPr>
           <w:rFonts w:ascii="Arial" w:hAnsi="Arial" w:cs="Arial"/>
           <w:color w:val="000000"/>
-        </w:rPr>
-        <w:t>El Departamento de Administración de Riesgos establecerá y dará seguimiento, como mínimo, a los siguientes indicadores clave de riesgo (KRI) de tercerización:</w:t>
+          <w:u w:val="single"/>
+        </w:rPr>
+        <w:t xml:space="preserve">El Departamento de Administración de Riesgos establecerá y dará seguimiento, como mínimo, a los siguientes indicadores clave de riesgo (KRI) de tercerización:</w:t>
       </w:r>
     </w:p>
     <w:p>
@@ -6731,6 +8004,7 @@
         <w:rPr>
           <w:rFonts w:ascii="Arial" w:hAnsi="Arial" w:cs="Arial"/>
           <w:color w:val="000000"/>
+          <w:u w:val="single"/>
         </w:rPr>
         <w:t xml:space="preserve">Porcentaje de cumplimiento de ANS por proveedor crítico.</w:t>
       </w:r>
@@ -6754,8 +8028,9 @@
         <w:rPr>
           <w:rFonts w:ascii="Arial" w:hAnsi="Arial" w:cs="Arial"/>
           <w:color w:val="000000"/>
-        </w:rPr>
-        <w:t>Número y severidad de incidentes e interrupciones atribuibles a proveedores, y pérdidas asociadas (NRP-42).</w:t>
+          <w:u w:val="single"/>
+        </w:rPr>
+        <w:t xml:space="preserve">Número y severidad de incidentes e interrupciones atribuibles a proveedores, y pérdidas asociadas (NRP-42).</w:t>
       </w:r>
     </w:p>
     <w:p>
@@ -6777,6 +8052,7 @@
         <w:rPr>
           <w:rFonts w:ascii="Arial" w:hAnsi="Arial" w:cs="Arial"/>
           <w:color w:val="000000"/>
+          <w:u w:val="single"/>
         </w:rPr>
         <w:t xml:space="preserve">Índice de concentración: número de servicios críticos y porcentaje del gasto en servicios críticos por proveedor o grupo económico (NRP-23).</w:t>
       </w:r>
@@ -6800,8 +8076,9 @@
         <w:rPr>
           <w:rFonts w:ascii="Arial" w:hAnsi="Arial" w:cs="Arial"/>
           <w:color w:val="000000"/>
-        </w:rPr>
-        <w:t>Proveedores críticos con deterioro en su calificación financiera o de riesgo de contraparte.</w:t>
+          <w:u w:val="single"/>
+        </w:rPr>
+        <w:t xml:space="preserve">Proveedores críticos con deterioro en su calificación financiera o de riesgo de contraparte.</w:t>
       </w:r>
     </w:p>
     <w:p>
@@ -6823,6 +8100,7 @@
         <w:rPr>
           <w:rFonts w:ascii="Arial" w:hAnsi="Arial" w:cs="Arial"/>
           <w:color w:val="000000"/>
+          <w:u w:val="single"/>
         </w:rPr>
         <w:t xml:space="preserve">Monto comprometido con proveedores críticos y su proporción respecto de los gastos operativos, y exposición por anticipos no garantizados (NRP-05).</w:t>
       </w:r>
@@ -6846,6 +8124,7 @@
         <w:rPr>
           <w:rFonts w:ascii="Arial" w:hAnsi="Arial" w:cs="Arial"/>
           <w:color w:val="000000"/>
+          <w:u w:val="single"/>
         </w:rPr>
         <w:t xml:space="preserve">Porcentaje de proveedores críticos con pruebas de continuidad del negocio vigentes (NRP-24).</w:t>
       </w:r>
@@ -6869,8 +8148,9 @@
         <w:rPr>
           <w:rFonts w:ascii="Arial" w:hAnsi="Arial" w:cs="Arial"/>
           <w:color w:val="000000"/>
-        </w:rPr>
-        <w:t>Brechas de seguridad de la información abiertas y vulnerabilidades críticas no corregidas en plazo (NRP-23 / NRP-20).</w:t>
+          <w:u w:val="single"/>
+        </w:rPr>
+        <w:t xml:space="preserve">Brechas de seguridad de la información abiertas y vulnerabilidades críticas no corregidas en plazo (NRP-23 / NRP-20).</w:t>
       </w:r>
     </w:p>
     <w:p>
@@ -6889,8 +8169,54 @@
         <w:rPr>
           <w:rFonts w:ascii="Arial" w:hAnsi="Arial" w:cs="Arial"/>
           <w:color w:val="000000" w:themeColor="text1"/>
-        </w:rPr>
-        <w:t>Los resultados se informarán semestralmente al Comité de Riesgos y anualmente al Consejo de Administración, junto con la Matriz Centralizada de Servicios Críticos Tercerizados actualizada.</w:t>
+          <w:u w:val="single"/>
+        </w:rPr>
+        <w:t xml:space="preserve">Los resultados se informarán semestralmente</w:t>
+      </w:r>
+      <w:r>
+        <w:rPr>
+          <w:rFonts w:ascii="Arial" w:hAnsi="Arial" w:cs="Arial"/>
+          <w:color w:val="000000" w:themeColor="text1"/>
+        </w:rPr>
+        <w:t xml:space="preserve"> al </w:t>
+      </w:r>
+      <w:r>
+        <w:rPr>
+          <w:rFonts w:ascii="Arial" w:hAnsi="Arial" w:cs="Arial"/>
+          <w:color w:val="000000" w:themeColor="text1"/>
+          <w:u w:val="single"/>
+        </w:rPr>
+        <w:t xml:space="preserve">Comité de Riesgos y anualmente al Consejo</w:t>
+      </w:r>
+      <w:r>
+        <w:rPr>
+          <w:rFonts w:ascii="Arial" w:hAnsi="Arial" w:cs="Arial"/>
+          <w:color w:val="000000" w:themeColor="text1"/>
+        </w:rPr>
+        <w:t xml:space="preserve"> de Administración, </w:t>
+      </w:r>
+      <w:r>
+        <w:rPr>
+          <w:rFonts w:ascii="Arial" w:hAnsi="Arial" w:cs="Arial"/>
+          <w:color w:val="000000" w:themeColor="text1"/>
+          <w:u w:val="single"/>
+        </w:rPr>
+        <w:t xml:space="preserve">junto con</w:t>
+      </w:r>
+      <w:r>
+        <w:rPr>
+          <w:rFonts w:ascii="Arial" w:hAnsi="Arial" w:cs="Arial"/>
+          <w:color w:val="000000" w:themeColor="text1"/>
+        </w:rPr>
+        <w:t xml:space="preserve"> la Matriz Centralizada de Servicios Críticos Tercerizados </w:t>
+      </w:r>
+      <w:r>
+        <w:rPr>
+          <w:rFonts w:ascii="Arial" w:hAnsi="Arial" w:cs="Arial"/>
+          <w:color w:val="000000" w:themeColor="text1"/>
+          <w:u w:val="single"/>
+        </w:rPr>
+        <w:t xml:space="preserve">actualizada.</w:t>
       </w:r>
     </w:p>
     <w:p>
@@ -6928,6 +8254,7 @@
           <w:rFonts w:ascii="Arial" w:hAnsi="Arial" w:cs="Arial"/>
           <w:b/>
           <w:color w:val="000000" w:themeColor="text1"/>
+          <w:u w:val="single"/>
         </w:rPr>
         <w:t xml:space="preserve">GESTIÓN DE EVENTOS DE RIESGO OPERACIONAL ORIGINADOS EN PROVEEDORES</w:t>
       </w:r>
@@ -6962,6 +8289,7 @@
         <w:rPr>
           <w:rFonts w:ascii="Arial" w:hAnsi="Arial" w:cs="Arial"/>
           <w:color w:val="000000"/>
+          <w:u w:val="single"/>
         </w:rPr>
         <w:t xml:space="preserve">Todo evento de riesgo operacional, interrupción, incumplimiento o incidente originado en un proveedor de servicios críticos tercerizados deberá ser reportado por el Administrador de Contrato al Departamento de Administración de Riesgos, para su registro en la base de datos de eventos de riesgo operacional, análisis de causa raíz y seguimiento de planes de acción, conforme a la NRP-42.</w:t>
       </w:r>
@@ -6982,6 +8310,7 @@
         <w:rPr>
           <w:rFonts w:ascii="Arial" w:hAnsi="Arial" w:cs="Arial"/>
           <w:color w:val="000000"/>
+          <w:u w:val="single"/>
         </w:rPr>
         <w:t xml:space="preserve">Cuando el evento sea ocasionado por fallas de las personas o errores operativos en los procesos y afecte de forma masiva cualquier producto financiero que ofrece la Cooperativa, deberá reportarse a la Superintendencia en el momento de su ocurrencia, por medio del responsable designado por el Consejo de Administración, conforme al artículo 21 de la NRP-42.</w:t>
       </w:r>
@@ -7060,22 +8389,54 @@
         <w:rPr>
           <w:rFonts w:ascii="Arial" w:hAnsi="Arial" w:cs="Arial"/>
           <w:color w:val="000000" w:themeColor="text1"/>
-        </w:rPr>
-        <w:t>al menos una vez al año</w:t>
-      </w:r>
-      <w:r>
-        <w:rPr>
-          <w:rFonts w:ascii="Arial" w:hAnsi="Arial" w:cs="Arial"/>
-          <w:color w:val="000000" w:themeColor="text1"/>
-        </w:rPr>
-        <w:t xml:space="preserve"> y se actualizará cuando existan modificaciones en la normativa interna y externa aplicable a la Cooperativa</w:t>
-      </w:r>
-      <w:r>
-        <w:rPr>
-          <w:rFonts w:ascii="Arial" w:hAnsi="Arial" w:cs="Arial"/>
-          <w:color w:val="000000" w:themeColor="text1"/>
-        </w:rPr>
-        <w:t>, cambios significativos en el perfil de riesgo de tercerización, o a requerimiento de la Superintendencia, del Comité de Riesgos o de Auditoría Interna.</w:t>
+          <w:u w:val="single"/>
+        </w:rPr>
+        <w:t xml:space="preserve">al menos una vez al año</w:t>
+      </w:r>
+      <w:r>
+        <w:rPr>
+          <w:rFonts w:ascii="Arial" w:hAnsi="Arial" w:cs="Arial"/>
+          <w:color w:val="000000" w:themeColor="text1"/>
+        </w:rPr>
+        <w:t xml:space="preserve"> y </w:t>
+      </w:r>
+      <w:r>
+        <w:rPr>
+          <w:rFonts w:ascii="Arial" w:hAnsi="Arial" w:cs="Arial"/>
+          <w:color w:val="000000" w:themeColor="text1"/>
+          <w:u w:val="single"/>
+        </w:rPr>
+        <w:t xml:space="preserve">se</w:t>
+      </w:r>
+      <w:r>
+        <w:rPr>
+          <w:rFonts w:ascii="Arial" w:hAnsi="Arial" w:cs="Arial"/>
+          <w:color w:val="000000" w:themeColor="text1"/>
+        </w:rPr>
+        <w:t xml:space="preserve"> actualizará cuando existan modificaciones en la normativa interna y externa </w:t>
+      </w:r>
+      <w:r>
+        <w:rPr>
+          <w:rFonts w:ascii="Arial" w:hAnsi="Arial" w:cs="Arial"/>
+          <w:color w:val="000000" w:themeColor="text1"/>
+          <w:u w:val="single"/>
+        </w:rPr>
+        <w:t xml:space="preserve">aplicable</w:t>
+      </w:r>
+      <w:r>
+        <w:rPr>
+          <w:rFonts w:ascii="Arial" w:hAnsi="Arial" w:cs="Arial"/>
+          <w:color w:val="000000" w:themeColor="text1"/>
+        </w:rPr>
+        <w:t xml:space="preserve"> a la Cooperativa</w:t>
+      </w:r>
+      <w:r>
+        <w:rPr>
+          <w:rFonts w:ascii="Arial" w:hAnsi="Arial" w:cs="Arial"/>
+          <w:color w:val="000000" w:themeColor="text1"/>
+          <w:u w:val="single"/>
+        </w:rPr>
+        <w:t xml:space="preserve">, cambios significativos en el perfil de riesgo de tercerización, o a requerimiento de la Superintendencia, del Comité de Riesgos o de Auditoría Interna.</w:t>
       </w:r>
     </w:p>
     <w:p>
@@ -7171,7 +8532,30 @@
           <w:rFonts w:ascii="Arial" w:hAnsi="Arial" w:cs="Arial"/>
           <w:color w:val="000000" w:themeColor="text1"/>
         </w:rPr>
-        <w:t xml:space="preserve">La presente política debe ser actualizada por el Departamento de Administración de Riesgos para someterla a validación del Comité de Riesgos y posterior aprobación del Consejo de Administración. Una vez aprobada, deberá remitirse a la Superintendencia dentro de los diez días hábiles siguientes a su aprobación (NRP-20, art. 8).</w:t>
+        <w:t xml:space="preserve">La presente política debe ser actualizada por el Departamento de Administración de Riesgos para </w:t>
+      </w:r>
+      <w:r>
+        <w:rPr>
+          <w:rFonts w:ascii="Arial" w:hAnsi="Arial" w:cs="Arial"/>
+          <w:color w:val="000000" w:themeColor="text1"/>
+          <w:u w:val="single"/>
+        </w:rPr>
+        <w:t xml:space="preserve">someterla</w:t>
+      </w:r>
+      <w:r>
+        <w:rPr>
+          <w:rFonts w:ascii="Arial" w:hAnsi="Arial" w:cs="Arial"/>
+          <w:color w:val="000000" w:themeColor="text1"/>
+        </w:rPr>
+        <w:t xml:space="preserve"> a validación del Comité de Riesgos y posterior aprobación del Consejo de Administración. </w:t>
+      </w:r>
+      <w:r>
+        <w:rPr>
+          <w:rFonts w:ascii="Arial" w:hAnsi="Arial" w:cs="Arial"/>
+          <w:color w:val="000000" w:themeColor="text1"/>
+          <w:u w:val="single"/>
+        </w:rPr>
+        <w:t xml:space="preserve">Una vez aprobada, deberá remitirse a la Superintendencia dentro de los diez días hábiles siguientes a su aprobación (NRP-20, art. 8).</w:t>
       </w:r>
     </w:p>
     <w:p>
@@ -7255,7 +8639,22 @@
           <w:rFonts w:ascii="Arial" w:hAnsi="Arial" w:cs="Arial"/>
           <w:color w:val="000000" w:themeColor="text1"/>
         </w:rPr>
-        <w:t>La presente Política estará vigente a partir de su aprobación por parte del Consejo de Administración.</w:t>
+        <w:t xml:space="preserve">La </w:t>
+      </w:r>
+      <w:r>
+        <w:rPr>
+          <w:rFonts w:ascii="Arial" w:hAnsi="Arial" w:cs="Arial"/>
+          <w:color w:val="000000" w:themeColor="text1"/>
+          <w:u w:val="single"/>
+        </w:rPr>
+        <w:t xml:space="preserve">presente</w:t>
+      </w:r>
+      <w:r>
+        <w:rPr>
+          <w:rFonts w:ascii="Arial" w:hAnsi="Arial" w:cs="Arial"/>
+          <w:color w:val="000000" w:themeColor="text1"/>
+        </w:rPr>
+        <w:t xml:space="preserve"> Política estará vigente a partir de su aprobación por parte del Consejo de Administración.</w:t>
       </w:r>
     </w:p>
     <w:p>
@@ -7343,8 +8742,9 @@
         <w:rPr>
           <w:rFonts w:ascii="Arial" w:hAnsi="Arial" w:cs="Arial"/>
           <w:color w:val="000000" w:themeColor="text1"/>
-        </w:rPr>
-        <w:t>, previa opinión del Comité de Riesgos.</w:t>
+          <w:u w:val="single"/>
+        </w:rPr>
+        <w:t xml:space="preserve">, previa opinión del Comité de Riesgos.</w:t>
       </w:r>
     </w:p>
     <w:p>
@@ -7391,7 +8791,15 @@
           <w:rFonts w:ascii="Arial" w:hAnsi="Arial" w:cs="Arial"/>
           <w:b/>
         </w:rPr>
-        <w:t xml:space="preserve">Condiciones para tercerizar Actividades u Operaciones de Tecnología de la Información relacionadas a productos y servicios financieros.</w:t>
+        <w:t xml:space="preserve">Condiciones para tercerizar Actividades u Operaciones de Tecnología de </w:t>
+      </w:r>
+      <w:r>
+        <w:rPr>
+          <w:rFonts w:ascii="Arial" w:hAnsi="Arial" w:cs="Arial"/>
+          <w:b/>
+          <w:u w:val="single"/>
+        </w:rPr>
+        <w:t xml:space="preserve">la Información relacionadas a productos y servicios financieros.</w:t>
       </w:r>
     </w:p>
     <w:p>
@@ -7419,7 +8827,22 @@
           <w:rFonts w:ascii="Arial" w:hAnsi="Arial" w:cs="Arial"/>
           <w:sz w:val="20"/>
         </w:rPr>
-        <w:t xml:space="preserve">Los departamentos o áreas que soliciten tercerizar actividades y operaciones de tecnología de información relacionadas a productos o servicios financieros, deberán gestionar con el proveedor y las áreas relacionadas los siguientes requerimientos establecidos en la NRP-23.</w:t>
+        <w:t xml:space="preserve">Los departamentos o áreas que soliciten tercerizar actividades y operaciones de tecnología de información </w:t>
+      </w:r>
+      <w:r>
+        <w:rPr>
+          <w:rFonts w:ascii="Arial" w:hAnsi="Arial" w:cs="Arial"/>
+          <w:sz w:val="20"/>
+          <w:u w:val="single"/>
+        </w:rPr>
+        <w:t xml:space="preserve">relacionadas</w:t>
+      </w:r>
+      <w:r>
+        <w:rPr>
+          <w:rFonts w:ascii="Arial" w:hAnsi="Arial" w:cs="Arial"/>
+          <w:sz w:val="20"/>
+        </w:rPr>
+        <w:t xml:space="preserve"> a productos o servicios financieros, deberán gestionar con el proveedor y las áreas relacionadas los siguientes requerimientos establecidos en la NRP-23.</w:t>
       </w:r>
     </w:p>
     <w:bookmarkEnd w:id="28"/>
@@ -7638,7 +9061,79 @@
               <w:rPr>
                 <w:rFonts w:ascii="Arial" w:hAnsi="Arial" w:cs="Arial"/>
               </w:rPr>
-              <w:t xml:space="preserve">Realizar una evaluación integral de riesgos a efecto de identificar aquellos riesgos derivados de los servicios a contratar y establecer los mecanismos de mitigación apropiados. La evaluación deberá considerar los riesgos operacionales (incluyendo los tecnológicos y legales), riesgos reputacionales y riesgos financieros, así como la continuidad (NRP-24), la contraparte y el impacto en liquidez (NRP-05). Evaluar los riesgos que se generan como consecuencia de la concentración de entidades financieras en el proveedor, así como la concentración de la propia Cooperativa en dicho proveedor y su grupo económico, estableciendo los mecanismos de mitigación y las acciones a realizar si dicho proveedor falla, considerando, en la medida de lo posible, contratar otros proveedores o contar con otras garantías.</w:t>
+              <w:t xml:space="preserve">Realizar una evaluación </w:t>
+            </w:r>
+            <w:r>
+              <w:rPr>
+                <w:rFonts w:ascii="Arial" w:hAnsi="Arial" w:cs="Arial"/>
+                <w:u w:val="single"/>
+              </w:rPr>
+              <w:t xml:space="preserve">integral</w:t>
+            </w:r>
+            <w:r>
+              <w:rPr>
+                <w:rFonts w:ascii="Arial" w:hAnsi="Arial" w:cs="Arial"/>
+              </w:rPr>
+              <w:t xml:space="preserve"> de riesgos a efecto de identificar aquellos riesgos derivados de los servicios a contratar y establecer los mecanismos de mitigación apropiados. </w:t>
+            </w:r>
+            <w:r>
+              <w:rPr>
+                <w:rFonts w:ascii="Arial" w:hAnsi="Arial" w:cs="Arial"/>
+                <w:u w:val="single"/>
+              </w:rPr>
+              <w:t xml:space="preserve">La evaluación deberá considerar los riesgos operacionales (incluyendo los tecnológicos y legales), riesgos reputacionales y riesgos financieros, así como la continuidad (NRP-24), la contraparte y el impacto en liquidez (NRP-05).</w:t>
+            </w:r>
+            <w:r>
+              <w:rPr>
+                <w:rFonts w:ascii="Arial" w:hAnsi="Arial" w:cs="Arial"/>
+              </w:rPr>
+              <w:t xml:space="preserve"> Evaluar </w:t>
+            </w:r>
+            <w:r>
+              <w:rPr>
+                <w:rFonts w:ascii="Arial" w:hAnsi="Arial" w:cs="Arial"/>
+                <w:u w:val="single"/>
+              </w:rPr>
+              <w:t xml:space="preserve">los</w:t>
+            </w:r>
+            <w:r>
+              <w:rPr>
+                <w:rFonts w:ascii="Arial" w:hAnsi="Arial" w:cs="Arial"/>
+              </w:rPr>
+              <w:t xml:space="preserve"> riesgos </w:t>
+            </w:r>
+            <w:r>
+              <w:rPr>
+                <w:rFonts w:ascii="Arial" w:hAnsi="Arial" w:cs="Arial"/>
+                <w:u w:val="single"/>
+              </w:rPr>
+              <w:t xml:space="preserve">que se generan como consecuencia</w:t>
+            </w:r>
+            <w:r>
+              <w:rPr>
+                <w:rFonts w:ascii="Arial" w:hAnsi="Arial" w:cs="Arial"/>
+              </w:rPr>
+              <w:t xml:space="preserve"> de la concentración de </w:t>
+            </w:r>
+            <w:r>
+              <w:rPr>
+                <w:rFonts w:ascii="Arial" w:hAnsi="Arial" w:cs="Arial"/>
+                <w:u w:val="single"/>
+              </w:rPr>
+              <w:t xml:space="preserve">entidades financieras en</w:t>
+            </w:r>
+            <w:r>
+              <w:rPr>
+                <w:rFonts w:ascii="Arial" w:hAnsi="Arial" w:cs="Arial"/>
+              </w:rPr>
+              <w:t xml:space="preserve"> el proveedor, </w:t>
+            </w:r>
+            <w:r>
+              <w:rPr>
+                <w:rFonts w:ascii="Arial" w:hAnsi="Arial" w:cs="Arial"/>
+                <w:u w:val="single"/>
+              </w:rPr>
+              <w:t xml:space="preserve">así como la concentración de la propia Cooperativa en dicho proveedor y su grupo económico, estableciendo los mecanismos de mitigación y las acciones a realizar si dicho proveedor falla, considerando, en la medida de lo posible, contratar otros proveedores o contar con otras garantías.</w:t>
             </w:r>
           </w:p>
         </w:tc>
@@ -7669,8 +9164,9 @@
             <w:r>
               <w:rPr>
                 <w:rFonts w:ascii="Arial" w:hAnsi="Arial" w:cs="Arial"/>
-              </w:rPr>
-              <w:t>Administración de</w:t>
+                <w:u w:val="single"/>
+              </w:rPr>
+              <w:t xml:space="preserve">Administración de</w:t>
             </w:r>
             <w:r>
               <w:rPr>
@@ -7837,7 +9333,15 @@
                 <w:rFonts w:ascii="Arial" w:hAnsi="Arial" w:cs="Arial"/>
                 <w:color w:val="000000"/>
               </w:rPr>
-              <w:t xml:space="preserve">Denominación o Razón social y giro del negocio, experiencia, servicios, clientes (personas jurídicas), periodos de servicio, entre otros. Para el caso de un proveedor local, nómina de accionistas y principales funcionarios.</w:t>
+              <w:t xml:space="preserve">Denominación o Razón social y giro del negocio, experiencia, servicios, clientes (personas jurídicas), periodos de servicio, entre otros. </w:t>
+            </w:r>
+            <w:r>
+              <w:rPr>
+                <w:rFonts w:ascii="Arial" w:hAnsi="Arial" w:cs="Arial"/>
+                <w:color w:val="000000"/>
+                <w:u w:val="single"/>
+              </w:rPr>
+              <w:t xml:space="preserve">Para el caso de un proveedor local, nómina de accionistas y principales funcionarios.</w:t>
             </w:r>
           </w:p>
         </w:tc>
@@ -8025,6 +9529,7 @@
               <w:rPr>
                 <w:rFonts w:ascii="Arial" w:hAnsi="Arial" w:cs="Arial"/>
                 <w:color w:val="000000" w:themeColor="text1"/>
+                <w:u w:val="single"/>
               </w:rPr>
               <w:t xml:space="preserve">La entidad deberá realizar la debida diligencia de dicho proveedor, la cual deberá documentarse y revisarse anualmente utilizando la información más reciente, sobre:</w:t>
               <w:br/>
@@ -8115,7 +9620,22 @@
                 <w:rFonts w:ascii="Arial" w:hAnsi="Arial" w:cs="Arial"/>
                 <w:color w:val="000000" w:themeColor="text1"/>
               </w:rPr>
-              <w:t xml:space="preserve">2. Experiencia en la prestación del servicio.</w:t>
+              <w:t xml:space="preserve">2. </w:t>
+            </w:r>
+            <w:r>
+              <w:rPr>
+                <w:rFonts w:ascii="Arial" w:hAnsi="Arial" w:cs="Arial"/>
+                <w:color w:val="000000" w:themeColor="text1"/>
+                <w:u w:val="single"/>
+              </w:rPr>
+              <w:t xml:space="preserve">Experiencia</w:t>
+            </w:r>
+            <w:r>
+              <w:rPr>
+                <w:rFonts w:ascii="Arial" w:hAnsi="Arial" w:cs="Arial"/>
+                <w:color w:val="000000" w:themeColor="text1"/>
+              </w:rPr>
+              <w:t xml:space="preserve"> en la prestación del servicio.</w:t>
             </w:r>
           </w:p>
         </w:tc>
@@ -8654,6 +10174,7 @@
               <w:rPr>
                 <w:rFonts w:ascii="Arial" w:hAnsi="Arial" w:cs="Arial"/>
                 <w:color w:val="000000"/>
+                <w:u w:val="single"/>
               </w:rPr>
               <w:t xml:space="preserve">Análisis de concentración de proveedores (proveedor, grupo económico, tecnología y ubicación geográfica) y verificación de los límites aprobados por el Consejo de Administración (NRP-20).</w:t>
             </w:r>
@@ -8682,8 +10203,16 @@
               <w:rPr>
                 <w:rFonts w:ascii="Arial" w:hAnsi="Arial" w:cs="Arial"/>
                 <w:color w:val="000000"/>
-              </w:rPr>
-              <w:t>Depto. de Administración de Riesgos.</w:t>
+                <w:u w:val="single"/>
+              </w:rPr>
+              <w:t xml:space="preserve">Depto.</w:t>
+            </w:r>
+            <w:r>
+              <w:rPr>
+                <w:rFonts w:ascii="Arial" w:hAnsi="Arial" w:cs="Arial"/>
+                <w:color w:val="000000"/>
+              </w:rPr>
+              <w:t xml:space="preserve"> de Administración de Riesgos.</w:t>
             </w:r>
           </w:p>
         </w:tc>
@@ -8748,6 +10277,7 @@
               <w:rPr>
                 <w:rFonts w:ascii="Arial" w:hAnsi="Arial" w:cs="Arial"/>
                 <w:color w:val="000000"/>
+                <w:u w:val="single"/>
               </w:rPr>
               <w:t xml:space="preserve">Verificar que se puede requerir al proveedor del servicio informes de auditoría vigentes y asociados a los servicios prestados, los cuales deberán ser provistos a requerimiento de la Superintendencia.</w:t>
             </w:r>
@@ -8956,7 +10486,45 @@
                 <w:rFonts w:ascii="Arial" w:hAnsi="Arial" w:cs="Arial"/>
                 <w:color w:val="000000" w:themeColor="text1"/>
               </w:rPr>
-              <w:t xml:space="preserve">Indicar claramente que COMEDICA de R.L. es la que tiene la propiedad exclusiva sobre todos sus datos o información relacionada con la actividad o proceso a tercerizar; que el proveedor no adquiere ningún tipo de derechos o licencias a través del contrato para utilizar los datos o información que COMEDICA de R.L. le proporcione para sus propios fines; y que el proveedor no adquiere y no puede reclamar ningún interés en los datos o información debido a la confidencialidad y seguridad que se debe guardar sobre los mismos.</w:t>
+              <w:t xml:space="preserve">Indicar claramente que COMEDICA </w:t>
+            </w:r>
+            <w:r>
+              <w:rPr>
+                <w:rFonts w:ascii="Arial" w:hAnsi="Arial" w:cs="Arial"/>
+                <w:color w:val="000000" w:themeColor="text1"/>
+                <w:u w:val="single"/>
+              </w:rPr>
+              <w:t xml:space="preserve">de R.L.</w:t>
+            </w:r>
+            <w:r>
+              <w:rPr>
+                <w:rFonts w:ascii="Arial" w:hAnsi="Arial" w:cs="Arial"/>
+                <w:color w:val="000000" w:themeColor="text1"/>
+              </w:rPr>
+              <w:t xml:space="preserve"> es la que tiene la propiedad exclusiva sobre todos sus datos o información relacionada con la actividad o proceso a tercerizar; que el proveedor no adquiere ningún tipo de derechos o licencias a través del contrato para utilizar los datos o información que COMEDICA </w:t>
+            </w:r>
+            <w:r>
+              <w:rPr>
+                <w:rFonts w:ascii="Arial" w:hAnsi="Arial" w:cs="Arial"/>
+                <w:color w:val="000000" w:themeColor="text1"/>
+                <w:u w:val="single"/>
+              </w:rPr>
+              <w:t xml:space="preserve">de R.L.</w:t>
+            </w:r>
+            <w:r>
+              <w:rPr>
+                <w:rFonts w:ascii="Arial" w:hAnsi="Arial" w:cs="Arial"/>
+                <w:color w:val="000000" w:themeColor="text1"/>
+              </w:rPr>
+              <w:t xml:space="preserve"> le proporcione para sus propios fines; y que el proveedor no adquiere y no puede reclamar ningún interés en los datos o información debido a la confidencialidad y seguridad que se debe guardar sobre los </w:t>
+            </w:r>
+            <w:r>
+              <w:rPr>
+                <w:rFonts w:ascii="Arial" w:hAnsi="Arial" w:cs="Arial"/>
+                <w:color w:val="000000" w:themeColor="text1"/>
+                <w:u w:val="single"/>
+              </w:rPr>
+              <w:t xml:space="preserve">mismos.</w:t>
             </w:r>
           </w:p>
         </w:tc>
@@ -9157,7 +10725,22 @@
                 <w:rFonts w:ascii="Arial" w:hAnsi="Arial" w:cs="Arial"/>
                 <w:color w:val="000000" w:themeColor="text1"/>
               </w:rPr>
-              <w:t xml:space="preserve">Establecer claramente el alcance del servicio, las responsabilidades de la entidad y las de su(s) proveedor(es) de servicios sobre cada servicio que se proporcione.</w:t>
+              <w:t xml:space="preserve">Establecer claramente el alcance del servicio, las responsabilidades de la entidad y las de </w:t>
+            </w:r>
+            <w:r>
+              <w:rPr>
+                <w:rFonts w:ascii="Arial" w:hAnsi="Arial" w:cs="Arial"/>
+                <w:color w:val="000000" w:themeColor="text1"/>
+                <w:u w:val="single"/>
+              </w:rPr>
+              <w:t xml:space="preserve">su(s) proveedor(es)</w:t>
+            </w:r>
+            <w:r>
+              <w:rPr>
+                <w:rFonts w:ascii="Arial" w:hAnsi="Arial" w:cs="Arial"/>
+                <w:color w:val="000000" w:themeColor="text1"/>
+              </w:rPr>
+              <w:t xml:space="preserve"> de servicios sobre cada servicio que se proporcione.</w:t>
             </w:r>
           </w:p>
         </w:tc>
@@ -9224,7 +10807,52 @@
                 <w:rFonts w:ascii="Arial" w:hAnsi="Arial" w:cs="Arial"/>
                 <w:color w:val="000000" w:themeColor="text1"/>
               </w:rPr>
-              <w:t xml:space="preserve">Establecer los niveles de servicio en condiciones normales y de contingencia tras una interrupción; para esto último se deberá garantizar el establecimiento de planes de contingencia y de continuidad del servicio, de tal forma que el proveedor, y contratistas si los hubiere, garanticen el cumplimiento de la actividad u operación tercerizada y que el riesgo de tercerización está dentro del nivel determinado como aceptable para la entidad contratante.</w:t>
+              <w:t xml:space="preserve">Establecer los niveles de </w:t>
+            </w:r>
+            <w:r>
+              <w:rPr>
+                <w:rFonts w:ascii="Arial" w:hAnsi="Arial" w:cs="Arial"/>
+                <w:color w:val="000000" w:themeColor="text1"/>
+                <w:u w:val="single"/>
+              </w:rPr>
+              <w:t xml:space="preserve">servicio</w:t>
+            </w:r>
+            <w:r>
+              <w:rPr>
+                <w:rFonts w:ascii="Arial" w:hAnsi="Arial" w:cs="Arial"/>
+                <w:color w:val="000000" w:themeColor="text1"/>
+              </w:rPr>
+              <w:t xml:space="preserve"> en condiciones normales y de contingencia tras una interrupción; para esto último se deberá garantizar el establecimiento de planes de contingencia y de continuidad del servicio, de tal forma que el proveedor, y </w:t>
+            </w:r>
+            <w:r>
+              <w:rPr>
+                <w:rFonts w:ascii="Arial" w:hAnsi="Arial" w:cs="Arial"/>
+                <w:color w:val="000000" w:themeColor="text1"/>
+                <w:u w:val="single"/>
+              </w:rPr>
+              <w:t xml:space="preserve">contratistas</w:t>
+            </w:r>
+            <w:r>
+              <w:rPr>
+                <w:rFonts w:ascii="Arial" w:hAnsi="Arial" w:cs="Arial"/>
+                <w:color w:val="000000" w:themeColor="text1"/>
+              </w:rPr>
+              <w:t xml:space="preserve"> si </w:t>
+            </w:r>
+            <w:r>
+              <w:rPr>
+                <w:rFonts w:ascii="Arial" w:hAnsi="Arial" w:cs="Arial"/>
+                <w:color w:val="000000" w:themeColor="text1"/>
+                <w:u w:val="single"/>
+              </w:rPr>
+              <w:t xml:space="preserve">los hubiere,</w:t>
+            </w:r>
+            <w:r>
+              <w:rPr>
+                <w:rFonts w:ascii="Arial" w:hAnsi="Arial" w:cs="Arial"/>
+                <w:color w:val="000000" w:themeColor="text1"/>
+              </w:rPr>
+              <w:t xml:space="preserve"> garanticen el cumplimiento de la actividad u operación tercerizada y que el riesgo de tercerización está dentro del nivel determinado como aceptable para la entidad contratante.</w:t>
             </w:r>
           </w:p>
         </w:tc>
@@ -9291,7 +10919,15 @@
                 <w:rFonts w:ascii="Arial" w:hAnsi="Arial" w:cs="Arial"/>
                 <w:color w:val="000000" w:themeColor="text1"/>
               </w:rPr>
-              <w:t xml:space="preserve">Procedimiento planeado de comunicación entre los proveedores y COMEDICA de R.L.</w:t>
+              <w:t xml:space="preserve">Procedimiento planeado de comunicación entre los proveedores y COMEDICA </w:t>
+            </w:r>
+            <w:r>
+              <w:rPr>
+                <w:rFonts w:ascii="Arial" w:hAnsi="Arial" w:cs="Arial"/>
+                <w:color w:val="000000" w:themeColor="text1"/>
+                <w:u w:val="single"/>
+              </w:rPr>
+              <w:t xml:space="preserve">de R.L.</w:t>
             </w:r>
           </w:p>
         </w:tc>
@@ -9424,7 +11060,52 @@
                 <w:rFonts w:ascii="Arial" w:hAnsi="Arial" w:cs="Arial"/>
                 <w:color w:val="000000" w:themeColor="text1"/>
               </w:rPr>
-              <w:t xml:space="preserve">COMEDICA de R.L. debe requerir al proveedor de servicios prestados una declaración jurada o certificación vigente que indique que cuenta con un programa o gestión de la seguridad de la información, planes de continuidad del negocio, pruebas desarrolladas y resultados de las pruebas; asimismo, verificar la capacidad para recuperar y reanudar el servicio ante interrupciones.</w:t>
+              <w:t xml:space="preserve">COMEDICA </w:t>
+            </w:r>
+            <w:r>
+              <w:rPr>
+                <w:rFonts w:ascii="Arial" w:hAnsi="Arial" w:cs="Arial"/>
+                <w:color w:val="000000" w:themeColor="text1"/>
+                <w:u w:val="single"/>
+              </w:rPr>
+              <w:t xml:space="preserve">de R.L.</w:t>
+            </w:r>
+            <w:r>
+              <w:rPr>
+                <w:rFonts w:ascii="Arial" w:hAnsi="Arial" w:cs="Arial"/>
+                <w:color w:val="000000" w:themeColor="text1"/>
+              </w:rPr>
+              <w:t xml:space="preserve"> debe requerir al proveedor de servicios prestados una declaración jurada o certificación vigente que indique que </w:t>
+            </w:r>
+            <w:r>
+              <w:rPr>
+                <w:rFonts w:ascii="Arial" w:hAnsi="Arial" w:cs="Arial"/>
+                <w:color w:val="000000" w:themeColor="text1"/>
+                <w:u w:val="single"/>
+              </w:rPr>
+              <w:t xml:space="preserve">cuenta</w:t>
+            </w:r>
+            <w:r>
+              <w:rPr>
+                <w:rFonts w:ascii="Arial" w:hAnsi="Arial" w:cs="Arial"/>
+                <w:color w:val="000000" w:themeColor="text1"/>
+              </w:rPr>
+              <w:t xml:space="preserve"> con un programa o gestión de la seguridad de la información, planes de continuidad del negocio, pruebas desarrolladas y resultados de las pruebas; </w:t>
+            </w:r>
+            <w:r>
+              <w:rPr>
+                <w:rFonts w:ascii="Arial" w:hAnsi="Arial" w:cs="Arial"/>
+                <w:color w:val="000000" w:themeColor="text1"/>
+                <w:u w:val="single"/>
+              </w:rPr>
+              <w:t xml:space="preserve">asimismo,</w:t>
+            </w:r>
+            <w:r>
+              <w:rPr>
+                <w:rFonts w:ascii="Arial" w:hAnsi="Arial" w:cs="Arial"/>
+                <w:color w:val="000000" w:themeColor="text1"/>
+              </w:rPr>
+              <w:t xml:space="preserve"> verificar la capacidad para recuperar y reanudar el servicio ante interrupciones.</w:t>
             </w:r>
           </w:p>
         </w:tc>
@@ -9491,7 +11172,22 @@
                 <w:rFonts w:ascii="Arial" w:hAnsi="Arial" w:cs="Arial"/>
                 <w:color w:val="000000" w:themeColor="text1"/>
               </w:rPr>
-              <w:t xml:space="preserve">La obligación del proveedor del servicio de informar, en cuanto le sea posible, a COMEDICA de R.L. sobre cualquier evento o situación que pudiera afectar significativamente la prestación del servicio.</w:t>
+              <w:t xml:space="preserve">La obligación del proveedor del servicio de informar, en cuanto le sea posible, a COMEDICA </w:t>
+            </w:r>
+            <w:r>
+              <w:rPr>
+                <w:rFonts w:ascii="Arial" w:hAnsi="Arial" w:cs="Arial"/>
+                <w:color w:val="000000" w:themeColor="text1"/>
+                <w:u w:val="single"/>
+              </w:rPr>
+              <w:t xml:space="preserve">de R.L.</w:t>
+            </w:r>
+            <w:r>
+              <w:rPr>
+                <w:rFonts w:ascii="Arial" w:hAnsi="Arial" w:cs="Arial"/>
+                <w:color w:val="000000" w:themeColor="text1"/>
+              </w:rPr>
+              <w:t xml:space="preserve"> sobre cualquier evento o situación que pudiera afectar significativamente la prestación del servicio.</w:t>
             </w:r>
           </w:p>
         </w:tc>
@@ -9625,7 +11321,22 @@
                 <w:rFonts w:ascii="Arial" w:hAnsi="Arial" w:cs="Arial"/>
                 <w:color w:val="000000" w:themeColor="text1"/>
               </w:rPr>
-              <w:t xml:space="preserve">Definición de mecanismos de control por parte de COMEDICA de R.L. en la revisión y monitoreo de los servicios prestados, así como el procedimiento de escalamiento.</w:t>
+              <w:t xml:space="preserve">Definición de mecanismos de control por parte de COMEDICA </w:t>
+            </w:r>
+            <w:r>
+              <w:rPr>
+                <w:rFonts w:ascii="Arial" w:hAnsi="Arial" w:cs="Arial"/>
+                <w:color w:val="000000" w:themeColor="text1"/>
+                <w:u w:val="single"/>
+              </w:rPr>
+              <w:t xml:space="preserve">de R.L.</w:t>
+            </w:r>
+            <w:r>
+              <w:rPr>
+                <w:rFonts w:ascii="Arial" w:hAnsi="Arial" w:cs="Arial"/>
+                <w:color w:val="000000" w:themeColor="text1"/>
+              </w:rPr>
+              <w:t xml:space="preserve"> en la revisión y monitoreo de los servicios prestados, así como el procedimiento de escalamiento.</w:t>
             </w:r>
           </w:p>
         </w:tc>
@@ -9692,7 +11403,30 @@
                 <w:rFonts w:ascii="Arial" w:hAnsi="Arial" w:cs="Arial"/>
                 <w:color w:val="000000" w:themeColor="text1"/>
               </w:rPr>
-              <w:t xml:space="preserve">Obligación de establecer acuerdos de no revelación, de ser el caso, por el personal contratado por el proveedor relacionados con el manejo de la información de COMEDICA de R.L.</w:t>
+              <w:t xml:space="preserve">Obligación de establecer acuerdos de no revelación, de ser el caso, por el personal </w:t>
+            </w:r>
+            <w:r>
+              <w:rPr>
+                <w:rFonts w:ascii="Arial" w:hAnsi="Arial" w:cs="Arial"/>
+                <w:color w:val="000000" w:themeColor="text1"/>
+                <w:u w:val="single"/>
+              </w:rPr>
+              <w:t xml:space="preserve">contratado</w:t>
+            </w:r>
+            <w:r>
+              <w:rPr>
+                <w:rFonts w:ascii="Arial" w:hAnsi="Arial" w:cs="Arial"/>
+                <w:color w:val="000000" w:themeColor="text1"/>
+              </w:rPr>
+              <w:t xml:space="preserve"> por el proveedor relacionados con el manejo de la información de COMEDICA </w:t>
+            </w:r>
+            <w:r>
+              <w:rPr>
+                <w:rFonts w:ascii="Arial" w:hAnsi="Arial" w:cs="Arial"/>
+                <w:color w:val="000000" w:themeColor="text1"/>
+                <w:u w:val="single"/>
+              </w:rPr>
+              <w:t xml:space="preserve">de R.L.</w:t>
             </w:r>
           </w:p>
         </w:tc>
@@ -10028,7 +11762,37 @@
                 <w:rFonts w:ascii="Arial" w:hAnsi="Arial" w:cs="Arial"/>
                 <w:color w:val="000000" w:themeColor="text1"/>
               </w:rPr>
-              <w:t xml:space="preserve">Para el caso de que el proveedor realice contrataciones en los servicios que está ofreciendo a COMEDICA de R.L. deberá considerar los riesgos operacionales (incluyendo los tecnológicos y legales), riesgos reputacionales y riesgos financieros.</w:t>
+              <w:t xml:space="preserve">Para el caso de que el proveedor realice </w:t>
+            </w:r>
+            <w:r>
+              <w:rPr>
+                <w:rFonts w:ascii="Arial" w:hAnsi="Arial" w:cs="Arial"/>
+                <w:color w:val="000000" w:themeColor="text1"/>
+                <w:u w:val="single"/>
+              </w:rPr>
+              <w:t xml:space="preserve">contrataciones</w:t>
+            </w:r>
+            <w:r>
+              <w:rPr>
+                <w:rFonts w:ascii="Arial" w:hAnsi="Arial" w:cs="Arial"/>
+                <w:color w:val="000000" w:themeColor="text1"/>
+              </w:rPr>
+              <w:t xml:space="preserve"> en los servicios que está ofreciendo a COMEDICA </w:t>
+            </w:r>
+            <w:r>
+              <w:rPr>
+                <w:rFonts w:ascii="Arial" w:hAnsi="Arial" w:cs="Arial"/>
+                <w:color w:val="000000" w:themeColor="text1"/>
+                <w:u w:val="single"/>
+              </w:rPr>
+              <w:t xml:space="preserve">de R.L.</w:t>
+            </w:r>
+            <w:r>
+              <w:rPr>
+                <w:rFonts w:ascii="Arial" w:hAnsi="Arial" w:cs="Arial"/>
+                <w:color w:val="000000" w:themeColor="text1"/>
+              </w:rPr>
+              <w:t xml:space="preserve"> deberá considerar los riesgos operacionales (incluyendo los tecnológicos y legales), riesgos reputacionales y riesgos financieros.</w:t>
             </w:r>
           </w:p>
         </w:tc>
@@ -10095,7 +11859,15 @@
                 <w:rFonts w:ascii="Arial" w:hAnsi="Arial" w:cs="Arial"/>
                 <w:color w:val="000000" w:themeColor="text1"/>
               </w:rPr>
-              <w:t xml:space="preserve">Cuando sea aplicable, el proveedor debe hacer constar que la información y el procesamiento o almacenamiento objeto de la contratación se encuentran efectivamente aislados en todo momento, de tal forma que no exista comunicación o conectividad con la información de otros clientes del proveedor contratado.</w:t>
+              <w:t xml:space="preserve">Cuando sea aplicable, el proveedor debe hacer constar que la información y el procesamiento o almacenamiento objeto de la contratación se encuentran efectivamente aislados en todo momento, de tal forma que no exista comunicación o conectividad con la información de otros clientes del proveedor </w:t>
+            </w:r>
+            <w:r>
+              <w:rPr>
+                <w:rFonts w:ascii="Arial" w:hAnsi="Arial" w:cs="Arial"/>
+                <w:color w:val="000000" w:themeColor="text1"/>
+                <w:u w:val="single"/>
+              </w:rPr>
+              <w:t xml:space="preserve">contratado.</w:t>
             </w:r>
           </w:p>
         </w:tc>
@@ -10162,12 +11934,28 @@
                 <w:rFonts w:ascii="Arial" w:hAnsi="Arial" w:cs="Arial"/>
                 <w:color w:val="000000" w:themeColor="text1"/>
               </w:rPr>
-              <w:t xml:space="preserve">El proveedor deberá indicar claramente al contratista que COMEDICA </w:t>
+              <w:t xml:space="preserve">El proveedor deberá indicar claramente al </w:t>
             </w:r>
             <w:r>
               <w:rPr>
                 <w:rFonts w:ascii="Arial" w:hAnsi="Arial" w:cs="Arial"/>
                 <w:color w:val="000000" w:themeColor="text1"/>
+                <w:u w:val="single"/>
+              </w:rPr>
+              <w:t xml:space="preserve">contratista</w:t>
+            </w:r>
+            <w:r>
+              <w:rPr>
+                <w:rFonts w:ascii="Arial" w:hAnsi="Arial" w:cs="Arial"/>
+                <w:color w:val="000000" w:themeColor="text1"/>
+              </w:rPr>
+              <w:t xml:space="preserve"> que COMEDICA </w:t>
+            </w:r>
+            <w:r>
+              <w:rPr>
+                <w:rFonts w:ascii="Arial" w:hAnsi="Arial" w:cs="Arial"/>
+                <w:color w:val="000000" w:themeColor="text1"/>
+                <w:u w:val="single"/>
               </w:rPr>
               <w:t xml:space="preserve">de R.L.</w:t>
             </w:r>
@@ -10176,7 +11964,37 @@
                 <w:rFonts w:ascii="Arial" w:hAnsi="Arial" w:cs="Arial"/>
                 <w:color w:val="000000" w:themeColor="text1"/>
               </w:rPr>
-              <w:t xml:space="preserve"> es la que tiene la propiedad exclusiva sobre todos sus datos o información relacionada con la actividad o proceso a tercerizar; que el proveedor contratado no adquiere ningún tipo de derechos o licencias a través del contrato para utilizar los datos o información que el proveedor le proporcione para sus propios fines; y que el proveedor contratado no adquiere y no puede reclamar ningún interés en los datos o información debido a la confidencialidad y seguridad que se debe guardar sobre los mismos.</w:t>
+              <w:t xml:space="preserve"> es la que tiene la propiedad exclusiva sobre todos sus datos o información relacionada con la actividad o proceso a tercerizar; que el proveedor </w:t>
+            </w:r>
+            <w:r>
+              <w:rPr>
+                <w:rFonts w:ascii="Arial" w:hAnsi="Arial" w:cs="Arial"/>
+                <w:color w:val="000000" w:themeColor="text1"/>
+                <w:u w:val="single"/>
+              </w:rPr>
+              <w:t xml:space="preserve">contratado</w:t>
+            </w:r>
+            <w:r>
+              <w:rPr>
+                <w:rFonts w:ascii="Arial" w:hAnsi="Arial" w:cs="Arial"/>
+                <w:color w:val="000000" w:themeColor="text1"/>
+              </w:rPr>
+              <w:t xml:space="preserve"> no adquiere ningún tipo de derechos o licencias a través del contrato para utilizar los datos o información que el proveedor le proporcione para sus propios fines; y que el proveedor </w:t>
+            </w:r>
+            <w:r>
+              <w:rPr>
+                <w:rFonts w:ascii="Arial" w:hAnsi="Arial" w:cs="Arial"/>
+                <w:color w:val="000000" w:themeColor="text1"/>
+                <w:u w:val="single"/>
+              </w:rPr>
+              <w:t xml:space="preserve">contratado</w:t>
+            </w:r>
+            <w:r>
+              <w:rPr>
+                <w:rFonts w:ascii="Arial" w:hAnsi="Arial" w:cs="Arial"/>
+                <w:color w:val="000000" w:themeColor="text1"/>
+              </w:rPr>
+              <w:t xml:space="preserve"> no adquiere y no puede reclamar ningún interés en los datos o información debido a la confidencialidad y seguridad que se debe guardar sobre los mismos.</w:t>
             </w:r>
           </w:p>
         </w:tc>
@@ -10244,7 +12062,82 @@
                 <w:rFonts w:ascii="Arial" w:hAnsi="Arial" w:cs="Arial"/>
                 <w:color w:val="000000" w:themeColor="text1"/>
               </w:rPr>
-              <w:t xml:space="preserve">COMEDICA de R.L. debe asegurarse de que puede dar por finalizado el servicio contratado sin interrupción indebida a sus servicios u operaciones, o a su cumplimiento con el marco regulatorio, por lo que deberá contar con planes de salida y arreglos de terminación, todo debidamente documentado y probado.</w:t>
+              <w:t xml:space="preserve">COMEDICA </w:t>
+            </w:r>
+            <w:r>
+              <w:rPr>
+                <w:rFonts w:ascii="Arial" w:hAnsi="Arial" w:cs="Arial"/>
+                <w:color w:val="000000" w:themeColor="text1"/>
+                <w:u w:val="single"/>
+              </w:rPr>
+              <w:t xml:space="preserve">de R.L.</w:t>
+            </w:r>
+            <w:r>
+              <w:rPr>
+                <w:rFonts w:ascii="Arial" w:hAnsi="Arial" w:cs="Arial"/>
+                <w:color w:val="000000" w:themeColor="text1"/>
+              </w:rPr>
+              <w:t xml:space="preserve"> debe asegurarse </w:t>
+            </w:r>
+            <w:r>
+              <w:rPr>
+                <w:rFonts w:ascii="Arial" w:hAnsi="Arial" w:cs="Arial"/>
+                <w:color w:val="000000" w:themeColor="text1"/>
+                <w:u w:val="single"/>
+              </w:rPr>
+              <w:t xml:space="preserve">de</w:t>
+            </w:r>
+            <w:r>
+              <w:rPr>
+                <w:rFonts w:ascii="Arial" w:hAnsi="Arial" w:cs="Arial"/>
+                <w:color w:val="000000" w:themeColor="text1"/>
+              </w:rPr>
+              <w:t xml:space="preserve"> que puede dar por finalizado el servicio contratado sin interrupción indebida a </w:t>
+            </w:r>
+            <w:r>
+              <w:rPr>
+                <w:rFonts w:ascii="Arial" w:hAnsi="Arial" w:cs="Arial"/>
+                <w:color w:val="000000" w:themeColor="text1"/>
+                <w:u w:val="single"/>
+              </w:rPr>
+              <w:t xml:space="preserve">sus</w:t>
+            </w:r>
+            <w:r>
+              <w:rPr>
+                <w:rFonts w:ascii="Arial" w:hAnsi="Arial" w:cs="Arial"/>
+                <w:color w:val="000000" w:themeColor="text1"/>
+              </w:rPr>
+              <w:t xml:space="preserve"> servicios u operaciones, o </w:t>
+            </w:r>
+            <w:r>
+              <w:rPr>
+                <w:rFonts w:ascii="Arial" w:hAnsi="Arial" w:cs="Arial"/>
+                <w:color w:val="000000" w:themeColor="text1"/>
+                <w:u w:val="single"/>
+              </w:rPr>
+              <w:t xml:space="preserve">a</w:t>
+            </w:r>
+            <w:r>
+              <w:rPr>
+                <w:rFonts w:ascii="Arial" w:hAnsi="Arial" w:cs="Arial"/>
+                <w:color w:val="000000" w:themeColor="text1"/>
+              </w:rPr>
+              <w:t xml:space="preserve"> su cumplimiento con el marco regulatorio, por lo que </w:t>
+            </w:r>
+            <w:r>
+              <w:rPr>
+                <w:rFonts w:ascii="Arial" w:hAnsi="Arial" w:cs="Arial"/>
+                <w:color w:val="000000" w:themeColor="text1"/>
+                <w:u w:val="single"/>
+              </w:rPr>
+              <w:t xml:space="preserve">deberá</w:t>
+            </w:r>
+            <w:r>
+              <w:rPr>
+                <w:rFonts w:ascii="Arial" w:hAnsi="Arial" w:cs="Arial"/>
+                <w:color w:val="000000" w:themeColor="text1"/>
+              </w:rPr>
+              <w:t xml:space="preserve"> contar con planes de salida y arreglos de terminación, todo debidamente documentado y probado.</w:t>
             </w:r>
           </w:p>
         </w:tc>
@@ -10302,7 +12195,52 @@
                 <w:rFonts w:ascii="Arial" w:hAnsi="Arial" w:cs="Arial"/>
                 <w:color w:val="000000" w:themeColor="text1"/>
               </w:rPr>
-              <w:t xml:space="preserve">Establecer que la Superintendencia, cuando ésta lo estime pertinente, tendrá el acceso y disposición de los datos o información relacionada con el servicio tercerizado sin restricciones, manteniendo en el territorio nacional los mecanismos apropiados y el personal idóneo y necesario para tales efectos; asimismo, garantizar las condiciones del acceso para la auditoría interna, el Departamento de Administración de Riesgos y las firmas de auditoría externa que deben efectuar sus evaluaciones en cumplimiento al marco regulatorio vigente.</w:t>
+              <w:t xml:space="preserve">Establecer que la Superintendencia, cuando ésta lo estime pertinente, </w:t>
+            </w:r>
+            <w:r>
+              <w:rPr>
+                <w:rFonts w:ascii="Arial" w:hAnsi="Arial" w:cs="Arial"/>
+                <w:color w:val="000000" w:themeColor="text1"/>
+                <w:u w:val="single"/>
+              </w:rPr>
+              <w:t xml:space="preserve">tendrá</w:t>
+            </w:r>
+            <w:r>
+              <w:rPr>
+                <w:rFonts w:ascii="Arial" w:hAnsi="Arial" w:cs="Arial"/>
+                <w:color w:val="000000" w:themeColor="text1"/>
+              </w:rPr>
+              <w:t xml:space="preserve"> el acceso y disposición de los datos o información relacionada con el servicio tercerizado sin restricciones, manteniendo en el territorio nacional los mecanismos apropiados y el personal idóneo y necesario para tales efectos; </w:t>
+            </w:r>
+            <w:r>
+              <w:rPr>
+                <w:rFonts w:ascii="Arial" w:hAnsi="Arial" w:cs="Arial"/>
+                <w:color w:val="000000" w:themeColor="text1"/>
+                <w:u w:val="single"/>
+              </w:rPr>
+              <w:t xml:space="preserve">asimismo,</w:t>
+            </w:r>
+            <w:r>
+              <w:rPr>
+                <w:rFonts w:ascii="Arial" w:hAnsi="Arial" w:cs="Arial"/>
+                <w:color w:val="000000" w:themeColor="text1"/>
+              </w:rPr>
+              <w:t xml:space="preserve"> garantizar las condiciones del acceso para la auditoría interna, </w:t>
+            </w:r>
+            <w:r>
+              <w:rPr>
+                <w:rFonts w:ascii="Arial" w:hAnsi="Arial" w:cs="Arial"/>
+                <w:color w:val="000000" w:themeColor="text1"/>
+                <w:u w:val="single"/>
+              </w:rPr>
+              <w:t xml:space="preserve">el Departamento de Administración de Riesgos</w:t>
+            </w:r>
+            <w:r>
+              <w:rPr>
+                <w:rFonts w:ascii="Arial" w:hAnsi="Arial" w:cs="Arial"/>
+                <w:color w:val="000000" w:themeColor="text1"/>
+              </w:rPr>
+              <w:t xml:space="preserve"> y las firmas de auditoría externa que deben efectuar sus evaluaciones en cumplimiento al marco regulatorio vigente.</w:t>
             </w:r>
           </w:p>
         </w:tc>
@@ -10369,7 +12307,22 @@
                 <w:rFonts w:ascii="Arial" w:hAnsi="Arial" w:cs="Arial"/>
                 <w:color w:val="000000" w:themeColor="text1"/>
               </w:rPr>
-              <w:t xml:space="preserve">En caso de resolución, intervención o liquidación de COMEDICA de R.L., establecer los procesos para garantizar que la Superintendencia tenga acceso a los datos o información.</w:t>
+              <w:t xml:space="preserve">En caso de resolución, intervención o liquidación </w:t>
+            </w:r>
+            <w:r>
+              <w:rPr>
+                <w:rFonts w:ascii="Arial" w:hAnsi="Arial" w:cs="Arial"/>
+                <w:color w:val="000000" w:themeColor="text1"/>
+                <w:u w:val="single"/>
+              </w:rPr>
+              <w:t xml:space="preserve">de COMEDICA de R.L., establecer los procesos</w:t>
+            </w:r>
+            <w:r>
+              <w:rPr>
+                <w:rFonts w:ascii="Arial" w:hAnsi="Arial" w:cs="Arial"/>
+                <w:color w:val="000000" w:themeColor="text1"/>
+              </w:rPr>
+              <w:t xml:space="preserve"> para garantizar que la Superintendencia tenga acceso a los datos o información.</w:t>
             </w:r>
           </w:p>
         </w:tc>
@@ -10405,6 +12358,7 @@
               <w:rPr>
                 <w:rFonts w:ascii="Arial" w:hAnsi="Arial" w:cs="Arial"/>
                 <w:color w:val="FFFFFF" w:themeColor="background1"/>
+                <w:u w:val="single"/>
               </w:rPr>
               <w:t xml:space="preserve">22</w:t>
             </w:r>
@@ -10435,6 +12389,7 @@
               <w:rPr>
                 <w:rFonts w:ascii="Arial" w:hAnsi="Arial" w:cs="Arial"/>
                 <w:color w:val="000000"/>
+                <w:u w:val="single"/>
               </w:rPr>
               <w:t xml:space="preserve">Garantizar la devolución y destrucción o borrado seguro de la información involucrada en la prestación del servicio en caso de que lo solicite COMEDICA de R.L. o ante la terminación del contrato, y tratamiento de la misma, a fin de proteger los derechos de los asociados.</w:t>
             </w:r>
@@ -10472,6 +12427,7 @@
               <w:rPr>
                 <w:rFonts w:ascii="Arial" w:hAnsi="Arial" w:cs="Arial"/>
                 <w:color w:val="FFFFFF" w:themeColor="background1"/>
+                <w:u w:val="single"/>
               </w:rPr>
               <w:t xml:space="preserve">23</w:t>
             </w:r>
@@ -10503,6 +12459,7 @@
                 <w:rFonts w:ascii="Arial" w:hAnsi="Arial" w:cs="Arial"/>
                 <w:b/>
                 <w:color w:val="000000"/>
+                <w:u w:val="single"/>
               </w:rPr>
               <w:t xml:space="preserve">Reporte de eventos de riesgo operacional (NRP-42):</w:t>
             </w:r>
@@ -10511,7 +12468,15 @@
                 <w:rFonts w:ascii="Arial" w:hAnsi="Arial" w:cs="Arial"/>
                 <w:color w:val="000000"/>
               </w:rPr>
-              <w:t xml:space="preserve"> obligación del proveedor de reportar a COMEDICA de R.L. los incidentes, interrupciones y fallas que afecten el servicio, con su causa raíz, impacto y acciones correctivas, para su registro en la base de datos de eventos de riesgo operacional de la Cooperativa.</w:t>
+              <w:t xml:space="preserve"> </w:t>
+            </w:r>
+            <w:r>
+              <w:rPr>
+                <w:rFonts w:ascii="Arial" w:hAnsi="Arial" w:cs="Arial"/>
+                <w:color w:val="000000"/>
+                <w:u w:val="single"/>
+              </w:rPr>
+              <w:t xml:space="preserve">obligación del proveedor de reportar a COMEDICA de R.L. los incidentes, interrupciones y fallas que afecten el servicio, con su causa raíz, impacto y acciones correctivas, para su registro en la base de datos de eventos de riesgo operacional de la Cooperativa.</w:t>
             </w:r>
           </w:p>
         </w:tc>
@@ -10857,8 +12822,9 @@
                 <w:rFonts w:ascii="Arial" w:hAnsi="Arial" w:cs="Arial"/>
                 <w:color w:val="000000"/>
                 <w:sz w:val="20"/>
-              </w:rPr>
-              <w:t>__/__/____</w:t>
+                <w:u w:val="single"/>
+              </w:rPr>
+              <w:t xml:space="preserve">__/__/____</w:t>
             </w:r>
           </w:p>
         </w:tc>
@@ -10883,8 +12849,9 @@
                 <w:rFonts w:ascii="Arial" w:hAnsi="Arial" w:cs="Arial"/>
                 <w:color w:val="000000"/>
                 <w:sz w:val="20"/>
-              </w:rPr>
-              <w:t>__/__/____</w:t>
+                <w:u w:val="single"/>
+              </w:rPr>
+              <w:t xml:space="preserve">__/__/____</w:t>
             </w:r>
           </w:p>
         </w:tc>
@@ -10967,8 +12934,9 @@
                 <w:rFonts w:ascii="Arial" w:hAnsi="Arial" w:cs="Arial"/>
                 <w:color w:val="000000"/>
                 <w:sz w:val="20"/>
-              </w:rPr>
-              <w:t>______</w:t>
+                <w:u w:val="single"/>
+              </w:rPr>
+              <w:t xml:space="preserve">______</w:t>
             </w:r>
           </w:p>
         </w:tc>
@@ -11860,8 +13828,9 @@
                 <w:rFonts w:ascii="Arial" w:hAnsi="Arial" w:cs="Arial"/>
                 <w:color w:val="000000"/>
                 <w:sz w:val="20"/>
-              </w:rPr>
-              <w:t>__/__/____</w:t>
+                <w:u w:val="single"/>
+              </w:rPr>
+              <w:t xml:space="preserve">__/__/____</w:t>
             </w:r>
           </w:p>
         </w:tc>
@@ -11888,8 +13857,9 @@
                 <w:rFonts w:ascii="Arial" w:hAnsi="Arial" w:cs="Arial"/>
                 <w:color w:val="000000"/>
                 <w:sz w:val="20"/>
-              </w:rPr>
-              <w:t>______</w:t>
+                <w:u w:val="single"/>
+              </w:rPr>
+              <w:t xml:space="preserve">______</w:t>
             </w:r>
           </w:p>
         </w:tc>
@@ -11917,6 +13887,7 @@
                 <w:color w:val="000000"/>
                 <w:sz w:val="20"/>
                 <w:szCs w:val="20"/>
+                <w:u w:val="single"/>
               </w:rPr>
               <w:t xml:space="preserve">Se realizan las siguientes modificaciones: Se sustituye Comité de Administración de Riesgos por Comité de Riesgos y NPB4-50 por NRP-42. I. PROPÓSITO: se amplía y se incorpora la alineación con NRP-20, NRP-42, NRP-24, NRP-23, NRP-17 y NRP-05. II. ALCANCE: se amplía al ciclo de vida del servicio y a servicios de otra naturaleza, y se incorporan nuevas normativas. III. DEFINICIONES: se actualizan definiciones conforme a NRP-20, NRP-24 y NRP-42, y se incorporan riesgo tecnológico, riesgo operacional, riesgo de tercerización, riesgo de concentración de proveedores, riesgo de contraparte, impacto en liquidez, ANS, RTO/RPO/MTPD, apetito y tolerancia al riesgo y Matriz Centralizada de Servicios Críticos Tercerizados. IV. RESPONSABILIDADES: se incorporan responsabilidades del Consejo de Administración, Comité de Riesgos y Jefe de Administración de Riesgos en la gestión de riesgos de tercerización; se actualizan las del Administrador de Contrato en lo relativo al reporte de eventos de riesgo operacional y las del Jefe de Servicios Generales en lo relativo a los campos de la Matriz Centralizada (NRP-42, art. 4). V. CRITERIOS: se incorporan criterios de riesgo tecnológico, concentración y contraparte e impacto en liquidez, niveles de criticidad y reevaluación. VI. se actualiza conforme a la NRP-23 (arts. 22 y 26). VII. se amplía la evaluación de riesgos y se establece el monitoreo continuo. Se incorporan los apartados XI. Monitoreo, Indicadores Clave de Riesgo y Reportes, y XII. Gestión de Eventos de Riesgo Operacional Originados en Proveedores. XIII. ACTUALIZACIÓN: se establece revisión al menos anual. XIV. APROBACIÓN: se incorpora la remisión a la Superintendencia (NRP-20, art. 8). XVI. DISPOSICIÓN FINAL: se incorpora la opinión previa del Comité de Riesgos. ANEXO 1: se actualiza conforme a la NRP-23; Sección A, se actualizan los numerales 1, 3 y 5 y se incorporan los numerales 6 y 7; Sección B, se incorpora el acceso del Departamento de Administración de Riesgos en el numeral 20 y se incorporan los numerales 22 y 23.</w:t>
             </w:r>

</xml_diff>

<commit_message>
Use only normative terms in RP-GG-PL-003 V04; drop KRI; strengthen custody
Definitions now reproduce NRP-20/23/24/42 terms literally with article
citations ('Tecnología de información' replaces 'Riesgo Tecnológico',
'Riesgo de liquidez' replaces 'Impacto en liquidez'; contraparte,
concentración de proveedores and riesgo de tercerización definitions
removed). SLA kept and defined on NRP-23 Annex 1 B.5. KRI section
removed and later sections renumbered. Custody duties itemized on
NRP-42 arts. 4-5 and NRP-23 Annex 1 A.5.

Co-Authored-By: Claude Opus 5.5 <noreply@anthropic.com>
Claude-Session: https://claude.ai/code/session_01PyMC4LRxqsjjU8zCw9m9SH
</commit_message>
<xml_diff>
--- a/politicas/RP-GG-PL-003_Contrat.Servicios_Criticos_Terce_V04_Final.docx
+++ b/politicas/RP-GG-PL-003_Contrat.Servicios_Criticos_Terce_V04_Final.docx
@@ -755,7 +755,7 @@
           <w:fldChar w:fldCharType="begin"/>
           <w:instrText xml:space="preserve"> PAGEREF _Toc144550021 \h </w:instrText>
           <w:fldChar w:fldCharType="separate"/>
-          <w:t>11</w:t>
+          <w:t>12</w:t>
           <w:fldChar w:fldCharType="end"/>
         </w:r>
       </w:hyperlink>
@@ -1090,7 +1090,7 @@
           <w:lang w:val="es-SV" w:bidi="ar-SA"/>
         </w:rPr>
       </w:pPr>
-      <w:hyperlink w:anchor="_Toc144550030" w:history="1">
+      <w:hyperlink w:anchor="_Toc144550031" w:history="1">
         <w:r>
           <w:rPr>
             <w:rStyle w:val="Hipervnculo"/>
@@ -1099,69 +1099,6 @@
             <w:color w:val="000000"/>
           </w:rPr>
           <w:t>XI.</w:t>
-        </w:r>
-        <w:r>
-          <w:rPr>
-            <w:rFonts w:asciiTheme="minorHAnsi" w:eastAsiaTheme="minorEastAsia" w:hAnsiTheme="minorHAnsi" w:cstheme="minorBidi"/>
-            <w:b w:val="0"/>
-            <w:bCs w:val="0"/>
-            <w:caps w:val="0"/>
-            <w:noProof/>
-            <w:color w:val="000000"/>
-            <w:sz w:val="22"/>
-            <w:szCs w:val="22"/>
-            <w:lang w:val="es-SV" w:bidi="ar-SA"/>
-          </w:rPr>
-          <w:tab/>
-        </w:r>
-        <w:r>
-          <w:rPr>
-            <w:rStyle w:val="Hipervnculo"/>
-            <w:rFonts w:ascii="Arial" w:hAnsi="Arial" w:cs="Arial"/>
-            <w:noProof/>
-            <w:color w:val="000000"/>
-          </w:rPr>
-          <w:t>MONITOREO, INDICADORES CLAVE DE RIESGO Y REPORTES</w:t>
-        </w:r>
-        <w:r>
-          <w:rPr>
-            <w:noProof/>
-            <w:webHidden/>
-            <w:color w:val="000000"/>
-          </w:rPr>
-          <w:tab/>
-          <w:fldChar w:fldCharType="begin"/>
-          <w:instrText xml:space="preserve"> PAGEREF _Toc144550030 \h </w:instrText>
-          <w:fldChar w:fldCharType="separate"/>
-          <w:t>17</w:t>
-          <w:fldChar w:fldCharType="end"/>
-        </w:r>
-      </w:hyperlink>
-    </w:p>
-    <w:p>
-      <w:pPr>
-        <w:pStyle w:val="TDC1"/>
-        <w:rPr>
-          <w:rFonts w:asciiTheme="minorHAnsi" w:eastAsiaTheme="minorEastAsia" w:hAnsiTheme="minorHAnsi" w:cstheme="minorBidi"/>
-          <w:b w:val="0"/>
-          <w:bCs w:val="0"/>
-          <w:caps w:val="0"/>
-          <w:noProof/>
-          <w:color w:val="000000"/>
-          <w:sz w:val="22"/>
-          <w:szCs w:val="22"/>
-          <w:lang w:val="es-SV" w:bidi="ar-SA"/>
-        </w:rPr>
-      </w:pPr>
-      <w:hyperlink w:anchor="_Toc144550031" w:history="1">
-        <w:r>
-          <w:rPr>
-            <w:rStyle w:val="Hipervnculo"/>
-            <w:rFonts w:ascii="Arial" w:hAnsi="Arial" w:cs="Arial"/>
-            <w:noProof/>
-            <w:color w:val="000000"/>
-          </w:rPr>
-          <w:t>XII.</w:t>
         </w:r>
         <w:r>
           <w:rPr>
@@ -1224,7 +1161,7 @@
             <w:noProof/>
             <w:color w:val="000000"/>
           </w:rPr>
-          <w:t>XIII.</w:t>
+          <w:t>XII.</w:t>
         </w:r>
         <w:r>
           <w:rPr>
@@ -1287,7 +1224,7 @@
             <w:noProof/>
             <w:color w:val="000000"/>
           </w:rPr>
-          <w:t>XIV.</w:t>
+          <w:t>XIII.</w:t>
         </w:r>
         <w:r>
           <w:rPr>
@@ -1350,7 +1287,7 @@
             <w:noProof/>
             <w:color w:val="000000"/>
           </w:rPr>
-          <w:t>XV.</w:t>
+          <w:t>XIV.</w:t>
         </w:r>
         <w:r>
           <w:rPr>
@@ -1413,7 +1350,7 @@
             <w:noProof/>
             <w:color w:val="000000"/>
           </w:rPr>
-          <w:t>XVI.</w:t>
+          <w:t>XV.</w:t>
         </w:r>
         <w:r>
           <w:rPr>
@@ -2483,30 +2420,16 @@
           <w:rFonts w:ascii="Arial" w:hAnsi="Arial" w:cs="Arial"/>
           <w:b/>
           <w:color w:val="000000" w:themeColor="text1"/>
-        </w:rPr>
-        <w:t>Tercerización de actividades:</w:t>
-      </w:r>
-      <w:r>
-        <w:rPr>
-          <w:rFonts w:ascii="Arial" w:hAnsi="Arial" w:cs="Arial"/>
-          <w:color w:val="000000" w:themeColor="text1"/>
-        </w:rPr>
-        <w:t xml:space="preserve"> Es cuando la realización de una o más partes de la actividad principal del negocio</w:t>
-      </w:r>
-      <w:r>
-        <w:rPr>
-          <w:rFonts w:ascii="Arial" w:hAnsi="Arial" w:cs="Arial"/>
-          <w:color w:val="000000" w:themeColor="text1"/>
           <w:u w:val="single"/>
         </w:rPr>
-        <w:t xml:space="preserve">, o de procesos de soporte que la habilitan,</w:t>
-      </w:r>
-      <w:r>
-        <w:rPr>
-          <w:rFonts w:ascii="Arial" w:hAnsi="Arial" w:cs="Arial"/>
-          <w:color w:val="000000" w:themeColor="text1"/>
-        </w:rPr>
-        <w:t xml:space="preserve"> se delega a un tercero, quien asume las actividades por su cuenta y riesgo, y que además cuenta con sus propios recursos financieros, técnicos y materiales. En consecuencia, es responsable de los resultados de sus actividades y del personal a su cargo</w:t>
+        <w:t xml:space="preserve">Tercerización de servicios (NRP-24, art. 3, lit. y):</w:t>
+      </w:r>
+      <w:r>
+        <w:rPr>
+          <w:rFonts w:ascii="Arial" w:hAnsi="Arial" w:cs="Arial"/>
+          <w:color w:val="000000" w:themeColor="text1"/>
+        </w:rPr>
+        <w:t xml:space="preserve"> </w:t>
       </w:r>
       <w:r>
         <w:rPr>
@@ -2514,7 +2437,7 @@
           <w:color w:val="000000" w:themeColor="text1"/>
           <w:u w:val="single"/>
         </w:rPr>
-        <w:t xml:space="preserve">, sin que ello traslade a dicho tercero la responsabilidad que la Cooperativa mantiene frente a sus asociados y al ente supervisor.</w:t>
+        <w:t xml:space="preserve">Se produce cuando la entidad encarga la realización de un proceso a un tercero, es decir, a una persona natural o jurídica distinta a la entidad.</w:t>
       </w:r>
     </w:p>
     <w:p>
@@ -2551,22 +2474,14 @@
           <w:color w:val="000000" w:themeColor="text1"/>
           <w:u w:val="single"/>
         </w:rPr>
-        <w:t xml:space="preserve">Servicios</w:t>
-      </w:r>
-      <w:r>
-        <w:rPr>
-          <w:rFonts w:ascii="Arial" w:hAnsi="Arial" w:cs="Arial"/>
-          <w:b/>
-          <w:color w:val="000000" w:themeColor="text1"/>
-        </w:rPr>
-        <w:t xml:space="preserve"> Críticos:</w:t>
-      </w:r>
-      <w:r>
-        <w:rPr>
-          <w:rFonts w:ascii="Arial" w:hAnsi="Arial" w:cs="Arial"/>
-          <w:color w:val="000000" w:themeColor="text1"/>
-        </w:rPr>
-        <w:t xml:space="preserve"> Son un conjunto de actividades o procedimientos definidos como prioritarios, cuya no disponibilidad compromete la existencia de la entidad, </w:t>
+        <w:t xml:space="preserve">Tercerización de actividades, operaciones o procesos de tecnologías de la información (NRP-23, art. 3):</w:t>
+      </w:r>
+      <w:r>
+        <w:rPr>
+          <w:rFonts w:ascii="Arial" w:hAnsi="Arial" w:cs="Arial"/>
+          <w:color w:val="000000" w:themeColor="text1"/>
+        </w:rPr>
+        <w:t xml:space="preserve"> </w:t>
       </w:r>
       <w:r>
         <w:rPr>
@@ -2574,7 +2489,7 @@
           <w:color w:val="000000" w:themeColor="text1"/>
           <w:u w:val="single"/>
         </w:rPr>
-        <w:t xml:space="preserve">la continuidad de sus procesos críticos identificados en el Análisis de Impacto del Negocio (BIA), su posición de liquidez o el cumplimiento de sus obligaciones regulatorias.</w:t>
+        <w:t xml:space="preserve">Se produce cuando la entidad encarga la realización de actividades, operaciones o procesos de tecnologías de la información, relacionados a servicios o productos financieros de la entidad, a un tercero, es decir, a una persona natural o jurídica distinta a la entidad.</w:t>
       </w:r>
     </w:p>
     <w:p>
@@ -2609,30 +2524,16 @@
           <w:rFonts w:ascii="Arial" w:hAnsi="Arial" w:cs="Arial"/>
           <w:b/>
           <w:color w:val="000000" w:themeColor="text1"/>
-        </w:rPr>
-        <w:t xml:space="preserve">Procesos Críticos:</w:t>
-      </w:r>
-      <w:r>
-        <w:rPr>
-          <w:rFonts w:ascii="Arial" w:hAnsi="Arial" w:cs="Arial"/>
-          <w:color w:val="000000" w:themeColor="text1"/>
-        </w:rPr>
-        <w:t xml:space="preserve"> Son los procesos dentro de la Cooperativa que se han </w:t>
-      </w:r>
-      <w:r>
-        <w:rPr>
-          <w:rFonts w:ascii="Arial" w:hAnsi="Arial" w:cs="Arial"/>
-          <w:color w:val="000000" w:themeColor="text1"/>
           <w:u w:val="single"/>
         </w:rPr>
-        <w:t xml:space="preserve">definido</w:t>
-      </w:r>
-      <w:r>
-        <w:rPr>
-          <w:rFonts w:ascii="Arial" w:hAnsi="Arial" w:cs="Arial"/>
-          <w:color w:val="000000" w:themeColor="text1"/>
-        </w:rPr>
-        <w:t xml:space="preserve"> como prioritarios para la entrega de productos y servicios y </w:t>
+        <w:t xml:space="preserve">Servicios críticos (NRP-23, art. 3 y NRP-24, art. 3, lit. v):</w:t>
+      </w:r>
+      <w:r>
+        <w:rPr>
+          <w:rFonts w:ascii="Arial" w:hAnsi="Arial" w:cs="Arial"/>
+          <w:color w:val="000000" w:themeColor="text1"/>
+        </w:rPr>
+        <w:t xml:space="preserve"> Son </w:t>
       </w:r>
       <w:r>
         <w:rPr>
@@ -2640,22 +2541,14 @@
           <w:color w:val="000000" w:themeColor="text1"/>
           <w:u w:val="single"/>
         </w:rPr>
-        <w:t xml:space="preserve">cuya</w:t>
-      </w:r>
-      <w:r>
-        <w:rPr>
-          <w:rFonts w:ascii="Arial" w:hAnsi="Arial" w:cs="Arial"/>
-          <w:color w:val="000000" w:themeColor="text1"/>
-        </w:rPr>
-        <w:t xml:space="preserve"> interrupción detiene la continuidad del negocio, </w:t>
-      </w:r>
-      <w:r>
-        <w:rPr>
-          <w:rFonts w:ascii="Arial" w:hAnsi="Arial" w:cs="Arial"/>
-          <w:color w:val="000000" w:themeColor="text1"/>
-          <w:u w:val="single"/>
-        </w:rPr>
-        <w:t xml:space="preserve">conforme al Análisis de Impacto del Negocio (BIA) del Sistema de Gestión de la Continuidad del Negocio (NRP-24).</w:t>
+        <w:t xml:space="preserve">los servicios y</w:t>
+      </w:r>
+      <w:r>
+        <w:rPr>
+          <w:rFonts w:ascii="Arial" w:hAnsi="Arial" w:cs="Arial"/>
+          <w:color w:val="000000" w:themeColor="text1"/>
+        </w:rPr>
+        <w:t xml:space="preserve"> actividades prioritarios cuya no disponibilidad compromete la existencia de la entidad.</w:t>
       </w:r>
     </w:p>
     <w:p>
@@ -2690,29 +2583,23 @@
           <w:b/>
           <w:color w:val="000000" w:themeColor="text1"/>
         </w:rPr>
-        <w:t>Servicios Críticos Tercerizados:</w:t>
-      </w:r>
-      <w:r>
-        <w:rPr>
-          <w:rFonts w:ascii="Arial" w:hAnsi="Arial" w:cs="Arial"/>
-          <w:color w:val="000000" w:themeColor="text1"/>
-        </w:rPr>
-        <w:t xml:space="preserve"> </w:t>
-      </w:r>
-      <w:r>
-        <w:rPr>
-          <w:rFonts w:ascii="Arial" w:hAnsi="Arial" w:cs="Arial"/>
+        <w:t xml:space="preserve">Procesos </w:t>
+      </w:r>
+      <w:r>
+        <w:rPr>
+          <w:rFonts w:ascii="Arial" w:hAnsi="Arial" w:cs="Arial"/>
+          <w:b/>
           <w:color w:val="000000" w:themeColor="text1"/>
           <w:u w:val="single"/>
         </w:rPr>
-        <w:t xml:space="preserve">Son los servicios cuya ejecución</w:t>
-      </w:r>
-      <w:r>
-        <w:rPr>
-          <w:rFonts w:ascii="Arial" w:hAnsi="Arial" w:cs="Arial"/>
-          <w:color w:val="000000" w:themeColor="text1"/>
-        </w:rPr>
-        <w:t xml:space="preserve"> se delega </w:t>
+        <w:t xml:space="preserve">críticos (NRP-24, arts. 6, lit. c y 13):</w:t>
+      </w:r>
+      <w:r>
+        <w:rPr>
+          <w:rFonts w:ascii="Arial" w:hAnsi="Arial" w:cs="Arial"/>
+          <w:color w:val="000000" w:themeColor="text1"/>
+        </w:rPr>
+        <w:t xml:space="preserve"> Son los procesos de la Cooperativa </w:t>
       </w:r>
       <w:r>
         <w:rPr>
@@ -2720,14 +2607,14 @@
           <w:color w:val="000000" w:themeColor="text1"/>
           <w:u w:val="single"/>
         </w:rPr>
-        <w:t xml:space="preserve">en un proveedor externo y que cumplen uno o más de los criterios de criticidad establecidos en el apartado V</w:t>
-      </w:r>
-      <w:r>
-        <w:rPr>
-          <w:rFonts w:ascii="Arial" w:hAnsi="Arial" w:cs="Arial"/>
-          <w:color w:val="000000" w:themeColor="text1"/>
-        </w:rPr>
-        <w:t xml:space="preserve"> de la </w:t>
+        <w:t xml:space="preserve">identificados y priorizados</w:t>
+      </w:r>
+      <w:r>
+        <w:rPr>
+          <w:rFonts w:ascii="Arial" w:hAnsi="Arial" w:cs="Arial"/>
+          <w:color w:val="000000" w:themeColor="text1"/>
+        </w:rPr>
+        <w:t xml:space="preserve"> como </w:t>
       </w:r>
       <w:r>
         <w:rPr>
@@ -2735,14 +2622,14 @@
           <w:color w:val="000000" w:themeColor="text1"/>
           <w:u w:val="single"/>
         </w:rPr>
-        <w:t xml:space="preserve">presente política,</w:t>
-      </w:r>
-      <w:r>
-        <w:rPr>
-          <w:rFonts w:ascii="Arial" w:hAnsi="Arial" w:cs="Arial"/>
-          <w:color w:val="000000" w:themeColor="text1"/>
-        </w:rPr>
-        <w:t xml:space="preserve"> de </w:t>
+        <w:t xml:space="preserve">críticos en el Análisis de Impacto del Negocio (BIA), relacionados con</w:t>
+      </w:r>
+      <w:r>
+        <w:rPr>
+          <w:rFonts w:ascii="Arial" w:hAnsi="Arial" w:cs="Arial"/>
+          <w:color w:val="000000" w:themeColor="text1"/>
+        </w:rPr>
+        <w:t xml:space="preserve"> la entrega de productos </w:t>
       </w:r>
       <w:r>
         <w:rPr>
@@ -2750,16 +2637,14 @@
           <w:color w:val="000000" w:themeColor="text1"/>
           <w:u w:val="single"/>
         </w:rPr>
-        <w:t xml:space="preserve">tal forma que su</w:t>
-      </w:r>
-      <w:r>
-        <w:rPr>
-          <w:rFonts w:ascii="Arial" w:hAnsi="Arial" w:cs="Arial"/>
-          <w:color w:val="000000" w:themeColor="text1"/>
-        </w:rPr>
-        <w:t xml:space="preserve"> no disponibilidad </w:t>
-        <w:lastRenderedPageBreak/>
-        <w:t>interrumpe la prestación de productos y servicios</w:t>
+        <w:t xml:space="preserve">o</w:t>
+      </w:r>
+      <w:r>
+        <w:rPr>
+          <w:rFonts w:ascii="Arial" w:hAnsi="Arial" w:cs="Arial"/>
+          <w:color w:val="000000" w:themeColor="text1"/>
+        </w:rPr>
+        <w:t xml:space="preserve"> servicios </w:t>
       </w:r>
       <w:r>
         <w:rPr>
@@ -2767,7 +2652,7 @@
           <w:color w:val="000000" w:themeColor="text1"/>
           <w:u w:val="single"/>
         </w:rPr>
-        <w:t xml:space="preserve">, o afecta materialmente el perfil de riesgo de la Cooperativa.</w:t>
+        <w:t xml:space="preserve">críticos.</w:t>
       </w:r>
     </w:p>
     <w:p>
@@ -2804,15 +2689,7 @@
           <w:color w:val="000000" w:themeColor="text1"/>
           <w:u w:val="single"/>
         </w:rPr>
-        <w:t xml:space="preserve">Proveedor de</w:t>
-      </w:r>
-      <w:r>
-        <w:rPr>
-          <w:rFonts w:ascii="Arial" w:hAnsi="Arial" w:cs="Arial"/>
-          <w:b/>
-          <w:color w:val="000000" w:themeColor="text1"/>
-        </w:rPr>
-        <w:t xml:space="preserve"> Servicios Críticos Tercerizados:</w:t>
+        <w:t xml:space="preserve">Servicios Críticos Tercerizados (NRP-42, art. 4):</w:t>
       </w:r>
       <w:r>
         <w:rPr>
@@ -2825,38 +2702,9 @@
         <w:rPr>
           <w:rFonts w:ascii="Arial" w:hAnsi="Arial" w:cs="Arial"/>
           <w:color w:val="000000" w:themeColor="text1"/>
-        </w:rPr>
-        <w:t>Es</w:t>
-      </w:r>
-      <w:r>
-        <w:rPr>
-          <w:rFonts w:ascii="Arial" w:hAnsi="Arial" w:cs="Arial"/>
-          <w:color w:val="000000" w:themeColor="text1"/>
-        </w:rPr>
-        <w:t xml:space="preserve"> una persona natural o jurídica a quien se delega operaciones de la actividad o giro principal de la Cooperativa</w:t>
-      </w:r>
-      <w:r>
-        <w:rPr>
-          <w:rFonts w:ascii="Arial" w:hAnsi="Arial" w:cs="Arial"/>
-          <w:color w:val="000000" w:themeColor="text1"/>
           <w:u w:val="single"/>
         </w:rPr>
-        <w:t xml:space="preserve">, o de procesos que</w:t>
-      </w:r>
-      <w:r>
-        <w:rPr>
-          <w:rFonts w:ascii="Arial" w:hAnsi="Arial" w:cs="Arial"/>
-          <w:color w:val="000000" w:themeColor="text1"/>
-        </w:rPr>
-        <w:t xml:space="preserve"> la </w:t>
-      </w:r>
-      <w:r>
-        <w:rPr>
-          <w:rFonts w:ascii="Arial" w:hAnsi="Arial" w:cs="Arial"/>
-          <w:color w:val="000000" w:themeColor="text1"/>
-          <w:u w:val="single"/>
-        </w:rPr>
-        <w:t xml:space="preserve">soportan, calificadas como críticas.</w:t>
+        <w:t xml:space="preserve">Son los servicios críticos brindados por terceros, es decir aquellos que puedan interrumpir el normal desarrollo de las operaciones de la Cooperativa, identificados conforme a los criterios del apartado V de la presente política.</w:t>
       </w:r>
     </w:p>
     <w:p>
@@ -2903,45 +2751,33 @@
           <w:rFonts w:ascii="Arial" w:hAnsi="Arial" w:cs="Arial"/>
           <w:b/>
           <w:color w:val="000000" w:themeColor="text1"/>
-        </w:rPr>
-        <w:t>Servicio No Crítico Tercerizado:</w:t>
-      </w:r>
-      <w:r>
-        <w:rPr>
-          <w:rFonts w:ascii="Arial" w:hAnsi="Arial" w:cs="Arial"/>
-          <w:color w:val="000000" w:themeColor="text1"/>
-        </w:rPr>
-        <w:t xml:space="preserve"> Es </w:t>
-      </w:r>
-      <w:r>
-        <w:rPr>
-          <w:rFonts w:ascii="Arial" w:hAnsi="Arial" w:cs="Arial"/>
-          <w:color w:val="000000" w:themeColor="text1"/>
           <w:u w:val="single"/>
         </w:rPr>
-        <w:t xml:space="preserve">el servicio prestado por</w:t>
-      </w:r>
-      <w:r>
-        <w:rPr>
-          <w:rFonts w:ascii="Arial" w:hAnsi="Arial" w:cs="Arial"/>
-          <w:color w:val="000000" w:themeColor="text1"/>
-        </w:rPr>
-        <w:t xml:space="preserve"> una persona natural o jurídica </w:t>
-      </w:r>
-      <w:r>
-        <w:rPr>
-          <w:rFonts w:ascii="Arial" w:hAnsi="Arial" w:cs="Arial"/>
+        <w:t xml:space="preserve">Proveedor de</w:t>
+      </w:r>
+      <w:r>
+        <w:rPr>
+          <w:rFonts w:ascii="Arial" w:hAnsi="Arial" w:cs="Arial"/>
+          <w:b/>
+          <w:color w:val="000000" w:themeColor="text1"/>
+        </w:rPr>
+        <w:t xml:space="preserve"> Servicios Críticos Tercerizados </w:t>
+      </w:r>
+      <w:r>
+        <w:rPr>
+          <w:rFonts w:ascii="Arial" w:hAnsi="Arial" w:cs="Arial"/>
+          <w:b/>
           <w:color w:val="000000" w:themeColor="text1"/>
           <w:u w:val="single"/>
         </w:rPr>
-        <w:t xml:space="preserve">cuya</w:t>
-      </w:r>
-      <w:r>
-        <w:rPr>
-          <w:rFonts w:ascii="Arial" w:hAnsi="Arial" w:cs="Arial"/>
-          <w:color w:val="000000" w:themeColor="text1"/>
-        </w:rPr>
-        <w:t xml:space="preserve"> no disponibilidad no detiene la continuidad del negocio de la Cooperativa</w:t>
+        <w:t xml:space="preserve">(NRP-24, art. 3, lit. y):</w:t>
+      </w:r>
+      <w:r>
+        <w:rPr>
+          <w:rFonts w:ascii="Arial" w:hAnsi="Arial" w:cs="Arial"/>
+          <w:color w:val="000000" w:themeColor="text1"/>
+        </w:rPr>
+        <w:t xml:space="preserve"> </w:t>
       </w:r>
       <w:r>
         <w:rPr>
@@ -2949,7 +2785,52 @@
           <w:color w:val="000000" w:themeColor="text1"/>
           <w:u w:val="single"/>
         </w:rPr>
-        <w:t xml:space="preserve">, no afecta su posición de liquidez ni genera incumplimientos regulatorios, y para el cual existen alternativas de sustitución inmediata.</w:t>
+        <w:t xml:space="preserve">Persona</w:t>
+      </w:r>
+      <w:r>
+        <w:rPr>
+          <w:rFonts w:ascii="Arial" w:hAnsi="Arial" w:cs="Arial"/>
+          <w:color w:val="000000" w:themeColor="text1"/>
+        </w:rPr>
+        <w:t xml:space="preserve"> natural o jurídica </w:t>
+      </w:r>
+      <w:r>
+        <w:rPr>
+          <w:rFonts w:ascii="Arial" w:hAnsi="Arial" w:cs="Arial"/>
+          <w:color w:val="000000" w:themeColor="text1"/>
+          <w:u w:val="single"/>
+        </w:rPr>
+        <w:t xml:space="preserve">distinta a la Cooperativa</w:t>
+      </w:r>
+      <w:r>
+        <w:rPr>
+          <w:rFonts w:ascii="Arial" w:hAnsi="Arial" w:cs="Arial"/>
+          <w:color w:val="000000" w:themeColor="text1"/>
+        </w:rPr>
+        <w:t xml:space="preserve"> a quien se </w:t>
+      </w:r>
+      <w:r>
+        <w:rPr>
+          <w:rFonts w:ascii="Arial" w:hAnsi="Arial" w:cs="Arial"/>
+          <w:color w:val="000000" w:themeColor="text1"/>
+          <w:u w:val="single"/>
+        </w:rPr>
+        <w:t xml:space="preserve">encarga</w:t>
+      </w:r>
+      <w:r>
+        <w:rPr>
+          <w:rFonts w:ascii="Arial" w:hAnsi="Arial" w:cs="Arial"/>
+          <w:color w:val="000000" w:themeColor="text1"/>
+        </w:rPr>
+        <w:t xml:space="preserve"> la prestación de </w:t>
+      </w:r>
+      <w:r>
+        <w:rPr>
+          <w:rFonts w:ascii="Arial" w:hAnsi="Arial" w:cs="Arial"/>
+          <w:color w:val="000000" w:themeColor="text1"/>
+          <w:u w:val="single"/>
+        </w:rPr>
+        <w:t xml:space="preserve">un Servicio Crítico Tercerizado.</w:t>
       </w:r>
     </w:p>
     <w:p>
@@ -2984,14 +2865,29 @@
           <w:b/>
           <w:color w:val="000000" w:themeColor="text1"/>
         </w:rPr>
-        <w:t xml:space="preserve">Administrador de Contrato:</w:t>
-      </w:r>
-      <w:r>
-        <w:rPr>
-          <w:rFonts w:ascii="Arial" w:hAnsi="Arial" w:cs="Arial"/>
-          <w:color w:val="000000" w:themeColor="text1"/>
-        </w:rPr>
-        <w:t xml:space="preserve"> es el Gerente o Jefe solicitante del servicio a contratar, que será el contacto o enlace entre la Cooperativa y el Proveedor.</w:t>
+        <w:t xml:space="preserve">Servicio No Crítico Tercerizado:</w:t>
+      </w:r>
+      <w:r>
+        <w:rPr>
+          <w:rFonts w:ascii="Arial" w:hAnsi="Arial" w:cs="Arial"/>
+          <w:color w:val="000000" w:themeColor="text1"/>
+        </w:rPr>
+        <w:t xml:space="preserve"> Es </w:t>
+      </w:r>
+      <w:r>
+        <w:rPr>
+          <w:rFonts w:ascii="Arial" w:hAnsi="Arial" w:cs="Arial"/>
+          <w:color w:val="000000" w:themeColor="text1"/>
+          <w:u w:val="single"/>
+        </w:rPr>
+        <w:t xml:space="preserve">el servicio prestado por un tercero cuya</w:t>
+      </w:r>
+      <w:r>
+        <w:rPr>
+          <w:rFonts w:ascii="Arial" w:hAnsi="Arial" w:cs="Arial"/>
+          <w:color w:val="000000" w:themeColor="text1"/>
+        </w:rPr>
+        <w:t xml:space="preserve"> no disponibilidad no detiene la continuidad del negocio de la Cooperativa.</w:t>
       </w:r>
     </w:p>
     <w:p>
@@ -3025,24 +2921,15 @@
           <w:rFonts w:ascii="Arial" w:hAnsi="Arial" w:cs="Arial"/>
           <w:b/>
           <w:color w:val="000000" w:themeColor="text1"/>
-          <w:u w:val="single"/>
-        </w:rPr>
-        <w:t xml:space="preserve">Riesgo Tecnológico:</w:t>
-      </w:r>
-      <w:r>
-        <w:rPr>
-          <w:rFonts w:ascii="Arial" w:hAnsi="Arial" w:cs="Arial"/>
-          <w:color w:val="000000" w:themeColor="text1"/>
-        </w:rPr>
-        <w:t xml:space="preserve"> </w:t>
-      </w:r>
-      <w:r>
-        <w:rPr>
-          <w:rFonts w:ascii="Arial" w:hAnsi="Arial" w:cs="Arial"/>
-          <w:color w:val="000000" w:themeColor="text1"/>
-          <w:u w:val="single"/>
-        </w:rPr>
-        <w:t xml:space="preserve">Posibilidad de incurrir en pérdidas derivadas de fallas, deficiencias, obsolescencia o uso inadecuado de la infraestructura tecnológica, sistemas de información, aplicaciones, redes y demás canales tecnológicos, incluyendo los provistos o administrados por terceros. Forma parte del riesgo operacional, como factor de tecnología de información (NRP-42).</w:t>
+        </w:rPr>
+        <w:t xml:space="preserve">Administrador de Contrato:</w:t>
+      </w:r>
+      <w:r>
+        <w:rPr>
+          <w:rFonts w:ascii="Arial" w:hAnsi="Arial" w:cs="Arial"/>
+          <w:color w:val="000000" w:themeColor="text1"/>
+        </w:rPr>
+        <w:t xml:space="preserve"> es el Gerente o Jefe solicitante del servicio a contratar, que será el contacto o enlace entre la Cooperativa y el Proveedor.</w:t>
       </w:r>
     </w:p>
     <w:p>
@@ -3078,7 +2965,7 @@
           <w:color w:val="000000" w:themeColor="text1"/>
           <w:u w:val="single"/>
         </w:rPr>
-        <w:t xml:space="preserve">Riesgo Operacional (NRP-20 y NRP-42):</w:t>
+        <w:t xml:space="preserve">Riesgo operacional (NRP-20, art. 6, lit. d y NRP-42, art. 3, lit. p):</w:t>
       </w:r>
       <w:r>
         <w:rPr>
@@ -3093,7 +2980,7 @@
           <w:color w:val="000000" w:themeColor="text1"/>
           <w:u w:val="single"/>
         </w:rPr>
-        <w:t xml:space="preserve">Posibilidad de incurrir en pérdidas debido a fallas en los procesos, en las personas, en los sistemas de información y a causa de acontecimientos externos; incluye el riesgo legal.</w:t>
+        <w:t xml:space="preserve">Posibilidad de incurrir en pérdidas debido a fallas en los procesos, en las personas, en los sistemas de información y a causa de acontecimientos externos; incluye el riesgo legal que consiste en la posibilidad de ocurrencia de pérdidas debido a fallas en la ejecución de contratos o acuerdos, al incumplimiento de normas, así como a factores externos tales como cambios regulatorios, procesos judiciales, entre otros.</w:t>
       </w:r>
     </w:p>
     <w:p>
@@ -3129,7 +3016,7 @@
           <w:color w:val="000000" w:themeColor="text1"/>
           <w:u w:val="single"/>
         </w:rPr>
-        <w:t xml:space="preserve">Riesgo de Tercerización:</w:t>
+        <w:t xml:space="preserve">Factor de riesgo operacional (NRP-42, art. 3, lit. h):</w:t>
       </w:r>
       <w:r>
         <w:rPr>
@@ -3144,7 +3031,7 @@
           <w:color w:val="000000" w:themeColor="text1"/>
           <w:u w:val="single"/>
         </w:rPr>
-        <w:t xml:space="preserve">Posibilidad de pérdidas, interrupciones o incumplimientos derivados de la falla, deficiencia, insolvencia o incumplimiento de un proveedor en la prestación de un servicio tercerizado.</w:t>
+        <w:t xml:space="preserve">Es la causa primaria o el origen de un evento operacional, los cuales pueden ser causados por los factores, tales como, procesos, personas, tecnología de información y acontecimientos externos.</w:t>
       </w:r>
     </w:p>
     <w:p>
@@ -3180,7 +3067,7 @@
           <w:color w:val="000000" w:themeColor="text1"/>
           <w:u w:val="single"/>
         </w:rPr>
-        <w:t xml:space="preserve">Riesgo de Concentración de Proveedores:</w:t>
+        <w:t xml:space="preserve">Tecnología de información (factor de riesgo operacional, NRP-42, art. 8, lit. c):</w:t>
       </w:r>
       <w:r>
         <w:rPr>
@@ -3195,7 +3082,7 @@
           <w:color w:val="000000" w:themeColor="text1"/>
           <w:u w:val="single"/>
         </w:rPr>
-        <w:t xml:space="preserve">Exposición derivada de la dependencia de la Cooperativa respecto de un mismo proveedor, grupo económico, tecnología o ubicación geográfica para la prestación de uno o varios servicios críticos, o de la existencia de un número limitado de proveedores alternos en el mercado.</w:t>
+        <w:t xml:space="preserve">Comprende los riesgos asociados a la tecnología de información, entre otros, los relacionados a fallas en la seguridad y continuidad operativa de los sistemas informáticos, los errores en el desarrollo e implementación de dichos sistemas y la compatibilidad e integración de los mismos, así como la calidad de la información y una adecuada inversión en tecnología.</w:t>
       </w:r>
     </w:p>
     <w:p>
@@ -3231,8 +3118,7 @@
           <w:color w:val="000000" w:themeColor="text1"/>
           <w:u w:val="single"/>
         </w:rPr>
-        <w:lastRenderedPageBreak/>
-        <w:t>Riesgo de Contraparte:</w:t>
+        <w:t xml:space="preserve">Evento de riesgo operacional (NRP-42, art. 3, lit. g):</w:t>
       </w:r>
       <w:r>
         <w:rPr>
@@ -3247,7 +3133,7 @@
           <w:color w:val="000000" w:themeColor="text1"/>
           <w:u w:val="single"/>
         </w:rPr>
-        <w:t xml:space="preserve">Posibilidad de pérdida derivada de que el proveedor no cumpla sus obligaciones contractuales por deterioro de su solvencia financiera, incluyendo la pérdida de anticipos, depósitos en garantía, licencias prepagadas u otros recursos entregados por la Cooperativa.</w:t>
+        <w:t xml:space="preserve">Es un suceso o serie de sucesos, de origen interno o externo, los cuales incluyen los incidentes ocurridos y eventos potenciales que pudieren generar pérdidas económicas y pueden o no afectar el estado de resultados.</w:t>
       </w:r>
     </w:p>
     <w:p>
@@ -3283,7 +3169,7 @@
           <w:color w:val="000000" w:themeColor="text1"/>
           <w:u w:val="single"/>
         </w:rPr>
-        <w:t xml:space="preserve">Impacto en Liquidez (NRP-05):</w:t>
+        <w:t xml:space="preserve">Riesgo de liquidez (NRP-20, art. 6, lit. c):</w:t>
       </w:r>
       <w:r>
         <w:rPr>
@@ -3298,7 +3184,7 @@
           <w:color w:val="000000" w:themeColor="text1"/>
           <w:u w:val="single"/>
         </w:rPr>
-        <w:t xml:space="preserve">Efecto que la contratación, interrupción o terminación de un servicio tercerizado puede generar sobre los flujos de efectivo, los compromisos de pago y la capacidad de la Cooperativa para atender oportunamente sus obligaciones, incluyendo la afectación de canales de pago, transferencias, compensación y gestión de tesorería.</w:t>
+        <w:t xml:space="preserve">Es la posibilidad de incurrir en pérdidas por no disponer de los recursos suficientes para cumplir con las obligaciones asumidas, incurrir en costos excesivos y no poder desarrollar el negocio en las condiciones previstas.</w:t>
       </w:r>
     </w:p>
     <w:p>
@@ -3334,7 +3220,7 @@
           <w:color w:val="000000" w:themeColor="text1"/>
           <w:u w:val="single"/>
         </w:rPr>
-        <w:t xml:space="preserve">Acuerdo de Niveles de Servicio (ANS):</w:t>
+        <w:t xml:space="preserve">Riesgo reputacional (NRP-20, art. 6, lit. e):</w:t>
       </w:r>
       <w:r>
         <w:rPr>
@@ -3349,7 +3235,7 @@
           <w:color w:val="000000" w:themeColor="text1"/>
           <w:u w:val="single"/>
         </w:rPr>
-        <w:t xml:space="preserve">Compromisos medibles de calidad, disponibilidad, capacidad, tiempos de respuesta y de recuperación pactados con el proveedor, en condiciones normales y de contingencia.</w:t>
+        <w:t xml:space="preserve">Es la posibilidad de incurrir en pérdidas, producto del deterioro de imagen de la entidad, debido al incumplimiento de leyes, normas internas, códigos de gobierno corporativo, códigos de conducta, lavado de activos, financiamiento del terrorismo y financiamiento de la proliferación de armas de destrucción masiva, entre otros.</w:t>
       </w:r>
     </w:p>
     <w:p>
@@ -3385,7 +3271,7 @@
           <w:color w:val="000000" w:themeColor="text1"/>
           <w:u w:val="single"/>
         </w:rPr>
-        <w:t xml:space="preserve">Tiempo Objetivo de Recuperación (RTO), Punto Objetivo de Recuperación (RPO) y Máximo Período Tolerable de Disrupción (MTPD):</w:t>
+        <w:t xml:space="preserve">Acuerdo de Niveles de Servicio (SLA, por sus siglas en inglés) (NRP-23, Anexo No. 1, Sección B, num. 5):</w:t>
       </w:r>
       <w:r>
         <w:rPr>
@@ -3400,7 +3286,7 @@
           <w:color w:val="000000" w:themeColor="text1"/>
           <w:u w:val="single"/>
         </w:rPr>
-        <w:t xml:space="preserve">Parámetros definidos en el Análisis de Impacto del Negocio (BIA) conforme a la NRP-24. El RTO es el tiempo establecido para reanudar la entrega de un producto o servicio luego de un incidente de interrupción; el RPO es la máxima pérdida de datos admisible para que continúe siendo factible reanudar una operación; y el MTPD es el tiempo que le tomaría a los impactos adversos volverse inaceptables para la Cooperativa. El servicio tercerizado y el plan de continuidad del proveedor deben ser consistentes con estos parámetros.</w:t>
+        <w:t xml:space="preserve">Compromisos medibles de calidad, disponibilidad, capacidad, tiempos de respuesta y de recuperación pactados con el proveedor, que establecen los niveles de servicio en condiciones normales y de contingencia tras una interrupción.</w:t>
       </w:r>
     </w:p>
     <w:p>
@@ -3436,7 +3322,7 @@
           <w:color w:val="000000" w:themeColor="text1"/>
           <w:u w:val="single"/>
         </w:rPr>
-        <w:t xml:space="preserve">Apetito y Tolerancia al Riesgo:</w:t>
+        <w:t xml:space="preserve">Análisis de Impacto del Negocio (BIA), Tiempo Objetivo de Recuperación (RTO), Punto Objetivo de Recuperación (RPO) y Máximo Período Tolerable de Disrupción (MTPD) (NRP-24, art. 3, lits. c, z, u y n):</w:t>
       </w:r>
       <w:r>
         <w:rPr>
@@ -3451,7 +3337,7 @@
           <w:color w:val="000000" w:themeColor="text1"/>
           <w:u w:val="single"/>
         </w:rPr>
-        <w:t xml:space="preserve">El apetito de riesgo es el nivel y los tipos de riesgos que la Cooperativa está dispuesta a asumir en relación a sus actividades, para alcanzar sus objetivos estratégicos y planes de negocio; la tolerancia al riesgo son los niveles de toma de riesgos aceptables para lograr un objetivo específico o administrar una categoría de riesgo. Ambos son aprobados por el Consejo de Administración (NRP-20).</w:t>
+        <w:t xml:space="preserve">El BIA es el proceso en el que se analizan los procesos, las funciones y actividades del negocio y las consecuencias de una interrupción sobre ellas; el RTO es el tiempo establecido por la entidad para reanudar la entrega de un producto o servicio luego de un incidente de interrupción, y es menor que el respectivo MTPD; el RPO representa la máxima pérdida de datos admisible para que continúe siendo factible reanudar una operación y es expresado en unidades de tiempo de información perdida; y el MTPD es el tiempo que le tomaría a impactos adversos volverse inaceptables para la entidad.</w:t>
       </w:r>
     </w:p>
     <w:p>
@@ -3487,7 +3373,7 @@
           <w:color w:val="000000" w:themeColor="text1"/>
           <w:u w:val="single"/>
         </w:rPr>
-        <w:t xml:space="preserve">Matriz Centralizada de Servicios Críticos Tercerizados:</w:t>
+        <w:t xml:space="preserve">Apetito de riesgo y tolerancia al riesgo (NRP-20, art. 3, lits. b y m):</w:t>
       </w:r>
       <w:r>
         <w:rPr>
@@ -3502,7 +3388,58 @@
           <w:color w:val="000000" w:themeColor="text1"/>
           <w:u w:val="single"/>
         </w:rPr>
-        <w:t xml:space="preserve">Control centralizado de los servicios prestados por terceros que, conforme a la NRP-42, contiene como mínimo el nombre del proveedor, el tipo de servicio, el monto del contrato, la contraparte dentro de la Cooperativa y su vigencia, y que debe estar a disposición de la Superintendencia en el momento que ésta lo requiera.</w:t>
+        <w:t xml:space="preserve">El apetito de riesgo es el nivel y los tipos de riesgos que una entidad está dispuesta a asumir en relación a sus actividades, para alcanzar sus objetivos estratégicos y planes de negocio. La tolerancia al riesgo son los niveles de toma de riesgos aceptables para lograr un objetivo específico o administrar una categoría de riesgo; representa la aplicación práctica del apetito por el riesgo.</w:t>
+      </w:r>
+    </w:p>
+    <w:p>
+      <w:pPr>
+        <w:pStyle w:val="Prrafodelista"/>
+        <w:spacing w:line="276" w:lineRule="auto"/>
+        <w:jc w:val="both"/>
+        <w:rPr>
+          <w:rFonts w:ascii="Arial" w:hAnsi="Arial" w:cs="Arial"/>
+          <w:color w:val="000000"/>
+        </w:rPr>
+      </w:pPr>
+    </w:p>
+    <w:p>
+      <w:pPr>
+        <w:pStyle w:val="Prrafodelista"/>
+        <w:numPr>
+          <w:ilvl w:val="0"/>
+          <w:numId w:val="4"/>
+        </w:numPr>
+        <w:spacing w:line="276" w:lineRule="auto"/>
+        <w:ind w:left="360"/>
+        <w:jc w:val="both"/>
+        <w:rPr>
+          <w:rFonts w:ascii="Arial" w:hAnsi="Arial" w:cs="Arial"/>
+          <w:color w:val="000000" w:themeColor="text1"/>
+        </w:rPr>
+      </w:pPr>
+      <w:r>
+        <w:rPr>
+          <w:rFonts w:ascii="Arial" w:hAnsi="Arial" w:cs="Arial"/>
+          <w:b/>
+          <w:color w:val="000000" w:themeColor="text1"/>
+          <w:u w:val="single"/>
+        </w:rPr>
+        <w:t xml:space="preserve">Matriz Centralizada de Servicios Críticos Tercerizados (NRP-42, art. 4):</w:t>
+      </w:r>
+      <w:r>
+        <w:rPr>
+          <w:rFonts w:ascii="Arial" w:hAnsi="Arial" w:cs="Arial"/>
+          <w:color w:val="000000" w:themeColor="text1"/>
+        </w:rPr>
+        <w:t xml:space="preserve"> </w:t>
+      </w:r>
+      <w:r>
+        <w:rPr>
+          <w:rFonts w:ascii="Arial" w:hAnsi="Arial" w:cs="Arial"/>
+          <w:color w:val="000000" w:themeColor="text1"/>
+          <w:u w:val="single"/>
+        </w:rPr>
+        <w:t xml:space="preserve">Control centralizado de los servicios prestados por terceros que contiene como mínimo el nombre del proveedor, el tipo de servicio, el monto del contrato, la contraparte dentro de la Cooperativa y su vigencia, y que debe estar a disposición de la Superintendencia en el momento que ésta lo requiera.</w:t>
       </w:r>
     </w:p>
     <w:p>
@@ -3649,7 +3586,7 @@
           <w:color w:val="000000"/>
           <w:u w:val="single"/>
         </w:rPr>
-        <w:t xml:space="preserve">Aprobar el apetito y la tolerancia al riesgo aplicables a la tercerización, incluyendo los límites de concentración por proveedor y los criterios de exposición de contraparte (NRP-20).</w:t>
+        <w:t xml:space="preserve">Aprobar el apetito y la tolerancia al riesgo aplicables a la tercerización de servicios críticos, así como los límites de exposición, incluyendo la exposición por proveedor o grupo económico (NRP-20, art. 8, lit. a).</w:t>
       </w:r>
     </w:p>
     <w:p>
@@ -3774,7 +3711,7 @@
           <w:color w:val="000000"/>
           <w:u w:val="single"/>
         </w:rPr>
-        <w:t xml:space="preserve">Proponer al Consejo de Administración los límites de concentración de proveedores y los criterios de exposición de contraparte e impacto en liquidez aplicables a los servicios críticos tercerizados.</w:t>
+        <w:t xml:space="preserve">Evaluar, avalar y proponer al Consejo de Administración los límites de tolerancia a la exposición aplicables a los servicios críticos tercerizados, incluyendo la exposición por proveedor o grupo económico (NRP-20, art. 10, lit. c).</w:t>
       </w:r>
     </w:p>
     <w:p>
@@ -3788,29 +3725,6 @@
         <w:jc w:val="both"/>
         <w:rPr>
           <w:rFonts w:ascii="Arial" w:hAnsi="Arial" w:cs="Arial"/>
-          <w:color w:val="000000" w:themeColor="text1"/>
-        </w:rPr>
-      </w:pPr>
-      <w:r>
-        <w:rPr>
-          <w:rFonts w:ascii="Arial" w:hAnsi="Arial" w:cs="Arial"/>
-          <w:color w:val="000000" w:themeColor="text1"/>
-          <w:u w:val="single"/>
-        </w:rPr>
-        <w:t xml:space="preserve">Dar seguimiento semestral a los indicadores clave de riesgo (KRI) de tercerización, a los eventos de riesgo operacional originados en proveedores de servicios críticos tercerizados y a sus planes de acción.</w:t>
-      </w:r>
-    </w:p>
-    <w:p>
-      <w:pPr>
-        <w:pStyle w:val="Prrafodelista"/>
-        <w:numPr>
-          <w:ilvl w:val="0"/>
-          <w:numId w:val="12"/>
-        </w:numPr>
-        <w:spacing w:line="276" w:lineRule="auto"/>
-        <w:jc w:val="both"/>
-        <w:rPr>
-          <w:rFonts w:ascii="Arial" w:hAnsi="Arial" w:cs="Arial"/>
           <w:color w:val="000000"/>
         </w:rPr>
       </w:pPr>
@@ -4069,7 +3983,7 @@
           <w:color w:val="000000"/>
           <w:u w:val="single"/>
         </w:rPr>
-        <w:t xml:space="preserve">Elaborar la evaluación integral de riesgos previa a la contratación, que incluya riesgo operacional, incluyendo el tecnológico y el legal (NRP-42), riesgo reputacional (NRP-20), riesgo de concentración (NRP-23) y de contraparte del proveedor (NRP-42), impacto en liquidez (NRP-05) y riesgo de continuidad (NRP-24), proponiendo los mecanismos de mitigación correspondientes.</w:t>
+        <w:t xml:space="preserve">Elaborar la evaluación de riesgos previa a la contratación, que considere los riesgos operacionales (incluyendo los tecnológicos y legales), riesgos reputacionales y riesgos financieros (NRP-23, Anexo No. 1, Sección A, num. 2), la concentración de entidades financieras en el proveedor (NRP-23, Anexo No. 1, Sección A, num. 1), el riesgo de liquidez (NRP-05) y la continuidad del negocio (NRP-24), proponiendo los mecanismos de mitigación correspondientes.</w:t>
       </w:r>
     </w:p>
     <w:p>
@@ -4104,40 +4018,6 @@
           <w:u w:val="single"/>
         </w:rPr>
         <w:t xml:space="preserve">Mantener actualizado el análisis de concentración de proveedores (por proveedor, grupo económico, tecnología y ubicación geográfica) y reportar al Comité de Riesgos las exposiciones que superen los límites aprobados.</w:t>
-      </w:r>
-    </w:p>
-    <w:p>
-      <w:pPr>
-        <w:pStyle w:val="Prrafodelista"/>
-        <w:spacing w:line="276" w:lineRule="auto"/>
-        <w:jc w:val="both"/>
-        <w:rPr>
-          <w:rFonts w:ascii="Arial" w:hAnsi="Arial" w:cs="Arial"/>
-          <w:color w:val="000000"/>
-        </w:rPr>
-      </w:pPr>
-    </w:p>
-    <w:p>
-      <w:pPr>
-        <w:pStyle w:val="Prrafodelista"/>
-        <w:numPr>
-          <w:ilvl w:val="0"/>
-          <w:numId w:val="3"/>
-        </w:numPr>
-        <w:spacing w:line="276" w:lineRule="auto"/>
-        <w:jc w:val="both"/>
-        <w:rPr>
-          <w:rFonts w:ascii="Arial" w:hAnsi="Arial" w:cs="Arial"/>
-          <w:color w:val="000000"/>
-        </w:rPr>
-      </w:pPr>
-      <w:r>
-        <w:rPr>
-          <w:rFonts w:ascii="Arial" w:hAnsi="Arial" w:cs="Arial"/>
-          <w:color w:val="000000"/>
-          <w:u w:val="single"/>
-        </w:rPr>
-        <w:t xml:space="preserve">Definir, calcular y reportar semestralmente al Comité de Riesgos los indicadores clave de riesgo (KRI) de tercerización.</w:t>
       </w:r>
     </w:p>
     <w:p>
@@ -5004,7 +4884,6 @@
         <w:jc w:val="both"/>
         <w:rPr>
           <w:rFonts w:ascii="Arial" w:hAnsi="Arial" w:cs="Arial"/>
-          <w:b/>
           <w:color w:val="000000"/>
         </w:rPr>
       </w:pPr>
@@ -5238,7 +5117,125 @@
           <w:rFonts w:ascii="Arial" w:hAnsi="Arial" w:cs="Arial"/>
           <w:color w:val="000000" w:themeColor="text1"/>
         </w:rPr>
-        <w:t xml:space="preserve">Responsable de resguardar los contratos, garantías y adendas de Servicios Críticos Tercerizados, así como llevar el control de los resguardos respectivos.</w:t>
+        <w:t xml:space="preserve">Responsable de resguardar los contratos </w:t>
+      </w:r>
+      <w:r>
+        <w:rPr>
+          <w:rFonts w:ascii="Arial" w:hAnsi="Arial" w:cs="Arial"/>
+          <w:color w:val="000000" w:themeColor="text1"/>
+          <w:u w:val="single"/>
+        </w:rPr>
+        <w:t xml:space="preserve">originales,</w:t>
+      </w:r>
+      <w:r>
+        <w:rPr>
+          <w:rFonts w:ascii="Arial" w:hAnsi="Arial" w:cs="Arial"/>
+          <w:color w:val="000000" w:themeColor="text1"/>
+        </w:rPr>
+        <w:t xml:space="preserve"> garantías y adendas de Servicios Críticos Tercerizados, </w:t>
+      </w:r>
+      <w:r>
+        <w:rPr>
+          <w:rFonts w:ascii="Arial" w:hAnsi="Arial" w:cs="Arial"/>
+          <w:color w:val="000000" w:themeColor="text1"/>
+          <w:u w:val="single"/>
+        </w:rPr>
+        <w:t xml:space="preserve">asegurando su conservación ordenada, completa, íntegra y oportuna, conforme al artículo 5</w:t>
+      </w:r>
+      <w:r>
+        <w:rPr>
+          <w:rFonts w:ascii="Arial" w:hAnsi="Arial" w:cs="Arial"/>
+          <w:color w:val="000000" w:themeColor="text1"/>
+        </w:rPr>
+        <w:t xml:space="preserve"> de </w:t>
+      </w:r>
+      <w:r>
+        <w:rPr>
+          <w:rFonts w:ascii="Arial" w:hAnsi="Arial" w:cs="Arial"/>
+          <w:color w:val="000000" w:themeColor="text1"/>
+          <w:u w:val="single"/>
+        </w:rPr>
+        <w:t xml:space="preserve">las Normas Técnicas para la Gestión del Riesgo Operacional de las Entidades Financieras (NRP-42). Para ello deberá:</w:t>
+      </w:r>
+    </w:p>
+    <w:p>
+      <w:pPr>
+        <w:spacing w:line="276" w:lineRule="auto"/>
+        <w:ind w:left="709" w:hanging="283"/>
+        <w:contextualSpacing/>
+        <w:jc w:val="both"/>
+        <w:rPr>
+          <w:rFonts w:ascii="Arial" w:hAnsi="Arial" w:cs="Arial"/>
+          <w:color w:val="000000" w:themeColor="text1"/>
+        </w:rPr>
+      </w:pPr>
+      <w:r>
+        <w:rPr>
+          <w:rFonts w:ascii="Arial" w:hAnsi="Arial" w:cs="Arial"/>
+          <w:color w:val="000000" w:themeColor="text1"/>
+          <w:u w:val="single"/>
+        </w:rPr>
+        <w:t xml:space="preserve">a) Registrar cada documento recibido en el control de resguardos, indicando como mínimo la fecha de recepción, el proveedor, el número y la vigencia del contrato, y el tipo y la vigencia de la garantía.</w:t>
+      </w:r>
+    </w:p>
+    <w:p>
+      <w:pPr>
+        <w:spacing w:line="276" w:lineRule="auto"/>
+        <w:ind w:left="709" w:hanging="283"/>
+        <w:contextualSpacing/>
+        <w:jc w:val="both"/>
+        <w:rPr>
+          <w:rFonts w:ascii="Arial" w:hAnsi="Arial" w:cs="Arial"/>
+          <w:color w:val="000000" w:themeColor="text1"/>
+        </w:rPr>
+      </w:pPr>
+      <w:r>
+        <w:rPr>
+          <w:rFonts w:ascii="Arial" w:hAnsi="Arial" w:cs="Arial"/>
+          <w:color w:val="000000" w:themeColor="text1"/>
+          <w:u w:val="single"/>
+        </w:rPr>
+        <w:t xml:space="preserve">b) Informar por escrito al Administrador de Contrato y al Departamento de Administración de Riesgos, con al menos treinta (30) días calendario de anticipación, el vencimiento de los contratos y de las garantías bajo su resguardo.</w:t>
+      </w:r>
+    </w:p>
+    <w:p>
+      <w:pPr>
+        <w:spacing w:line="276" w:lineRule="auto"/>
+        <w:ind w:left="709" w:hanging="283"/>
+        <w:contextualSpacing/>
+        <w:jc w:val="both"/>
+        <w:rPr>
+          <w:rFonts w:ascii="Arial" w:hAnsi="Arial" w:cs="Arial"/>
+          <w:color w:val="000000" w:themeColor="text1"/>
+        </w:rPr>
+      </w:pPr>
+      <w:r>
+        <w:rPr>
+          <w:rFonts w:ascii="Arial" w:hAnsi="Arial" w:cs="Arial"/>
+          <w:color w:val="000000" w:themeColor="text1"/>
+          <w:u w:val="single"/>
+        </w:rPr>
+        <w:t xml:space="preserve">c) Mantener los documentos resguardados a disposición de la Superintendencia, de la Auditoría Interna y de los auditores externos en el momento que éstos lo requieran (NRP-42, art. 4 y NRP-23, Anexo No. 1, Sección A, num. 5).</w:t>
+      </w:r>
+    </w:p>
+    <w:p>
+      <w:pPr>
+        <w:spacing w:line="276" w:lineRule="auto"/>
+        <w:ind w:left="709" w:hanging="283"/>
+        <w:contextualSpacing/>
+        <w:jc w:val="both"/>
+        <w:rPr>
+          <w:rFonts w:ascii="Arial" w:hAnsi="Arial" w:cs="Arial"/>
+          <w:color w:val="000000" w:themeColor="text1"/>
+        </w:rPr>
+      </w:pPr>
+      <w:r>
+        <w:rPr>
+          <w:rFonts w:ascii="Arial" w:hAnsi="Arial" w:cs="Arial"/>
+          <w:color w:val="000000" w:themeColor="text1"/>
+          <w:u w:val="single"/>
+        </w:rPr>
+        <w:t xml:space="preserve">d) Entregar documentos originales únicamente con autorización por escrito del Administrador de Contrato o del Jefe del Departamento Legal, dejando registro de la fecha de salida y de devolución.</w:t>
       </w:r>
     </w:p>
     <w:p>
@@ -6027,7 +6024,7 @@
                 <w:rFonts w:ascii="Arial" w:hAnsi="Arial" w:cs="Arial"/>
                 <w:color w:val="000000"/>
               </w:rPr>
-              <w:t>El cambio de proveedor del servicio implica grandes costos para la Cooperativa o no existe otro proveedor</w:t>
+              <w:t xml:space="preserve">El cambio de proveedor del servicio implica grandes costos para la Cooperativa o no existe otro proveedor, </w:t>
             </w:r>
             <w:r>
               <w:rPr>
@@ -6035,7 +6032,7 @@
                 <w:color w:val="000000"/>
                 <w:u w:val="single"/>
               </w:rPr>
-              <w:t xml:space="preserve">, o el tiempo de sustitución es superior al RTO del proceso (riesgo de concentración).</w:t>
+              <w:t xml:space="preserve">o el tiempo de sustitución es superior al RTO del proceso.</w:t>
             </w:r>
           </w:p>
           <w:p>
@@ -6060,7 +6057,7 @@
                 <w:color w:val="000000"/>
                 <w:u w:val="single"/>
               </w:rPr>
-              <w:t xml:space="preserve">Riesgo tecnológico (NRP-42):</w:t>
+              <w:t xml:space="preserve">Tecnología de información (NRP-42, art. 8, lit. c):</w:t>
             </w:r>
             <w:r>
               <w:rPr>
@@ -6100,7 +6097,7 @@
                 <w:color w:val="000000"/>
                 <w:u w:val="single"/>
               </w:rPr>
-              <w:t xml:space="preserve">Concentración y contraparte (NRP-23 / NRP-42):</w:t>
+              <w:t xml:space="preserve">Concentración en el proveedor (NRP-23, Anexo No. 1, Sección A, num. 1):</w:t>
             </w:r>
             <w:r>
               <w:rPr>
@@ -6115,7 +6112,7 @@
                 <w:color w:val="000000"/>
                 <w:u w:val="single"/>
               </w:rPr>
-              <w:t xml:space="preserve">el proveedor o su grupo económico presta más de un servicio crítico, o la Cooperativa le entrega anticipos, depósitos o recursos significativos expuestos a su solvencia.</w:t>
+              <w:t xml:space="preserve">el proveedor o su grupo económico presta más de un servicio crítico a la Cooperativa o concentra la prestación de servicios a varias entidades financieras, o la Cooperativa le entrega anticipos, depósitos o recursos significativos expuestos a su solidez financiera.</w:t>
             </w:r>
           </w:p>
           <w:p>
@@ -6140,7 +6137,7 @@
                 <w:color w:val="000000"/>
                 <w:u w:val="single"/>
               </w:rPr>
-              <w:t xml:space="preserve">Impacto en liquidez (NRP-05):</w:t>
+              <w:t xml:space="preserve">Riesgo de liquidez (NRP-05):</w:t>
             </w:r>
             <w:r>
               <w:rPr>
@@ -7036,7 +7033,7 @@
           <w:rFonts w:ascii="Arial" w:hAnsi="Arial" w:cs="Arial"/>
           <w:u w:val="single"/>
         </w:rPr>
-        <w:t xml:space="preserve">identificación de los factores de riesgo (procesos, personas, tecnología y eventos externos), estimación de la probabilidad e impacto, y controles mitigantes.</w:t>
+        <w:t xml:space="preserve">identificación de los factores de riesgo (procesos, personas, tecnología de información y acontecimientos externos), estimación de la probabilidad de ocurrencia y el impacto económico, y controles mitigantes.</w:t>
       </w:r>
     </w:p>
     <w:p>
@@ -7059,7 +7056,7 @@
           <w:b/>
           <w:u w:val="single"/>
         </w:rPr>
-        <w:t xml:space="preserve">Riesgo tecnológico (NRP-42):</w:t>
+        <w:t xml:space="preserve">Tecnología de información (NRP-42, art. 8, lit. c):</w:t>
       </w:r>
       <w:r>
         <w:rPr>
@@ -7072,7 +7069,7 @@
           <w:rFonts w:ascii="Arial" w:hAnsi="Arial" w:cs="Arial"/>
           <w:u w:val="single"/>
         </w:rPr>
-        <w:t xml:space="preserve">dependencia de la infraestructura del proveedor, obsolescencia, capacidad, integración y seguridad de la solución.</w:t>
+        <w:t xml:space="preserve">dependencia de la infraestructura del proveedor, seguridad y continuidad operativa de los sistemas, compatibilidad e integración, y calidad de la información.</w:t>
       </w:r>
     </w:p>
     <w:p>
@@ -7095,7 +7092,7 @@
           <w:b/>
           <w:u w:val="single"/>
         </w:rPr>
-        <w:t xml:space="preserve">Riesgo de concentración (NRP-23):</w:t>
+        <w:t xml:space="preserve">Concentración en el proveedor (NRP-23, Anexo No. 1, Sección A, num. 1):</w:t>
       </w:r>
       <w:r>
         <w:rPr>
@@ -7108,7 +7105,7 @@
           <w:rFonts w:ascii="Arial" w:hAnsi="Arial" w:cs="Arial"/>
           <w:u w:val="single"/>
         </w:rPr>
-        <w:t xml:space="preserve">número de servicios críticos asignados al mismo proveedor o grupo económico, concentración de entidades financieras en el mismo proveedor, dependencia tecnológica, concentración geográfica y disponibilidad de proveedores alternos en el mercado, estableciendo los mecanismos de mitigación y las acciones a realizar si el proveedor falla. Ningún proveedor o grupo económico podrá superar los límites de concentración aprobados por el Consejo de Administración (NRP-20) sin la aprobación expresa de éste.</w:t>
+        <w:t xml:space="preserve">número de servicios críticos asignados al mismo proveedor o grupo económico, concentración de entidades financieras en el mismo proveedor, dependencia tecnológica, concentración geográfica y disponibilidad de proveedores alternos en el mercado, estableciendo los mecanismos de mitigación y las acciones a realizar si el proveedor falla. Ningún proveedor o grupo económico podrá superar los límites de exposición aprobados por el Consejo de Administración (NRP-20, art. 8, lit. a) sin la aprobación expresa de éste.</w:t>
       </w:r>
     </w:p>
     <w:p>
@@ -7131,7 +7128,7 @@
           <w:b/>
           <w:u w:val="single"/>
         </w:rPr>
-        <w:t xml:space="preserve">Riesgo de contraparte (NRP-42):</w:t>
+        <w:t xml:space="preserve">Solidez financiera del proveedor (NRP-23, Anexo No. 1, Sección A, num. 3, lit. c):</w:t>
       </w:r>
       <w:r>
         <w:rPr>
@@ -7144,7 +7141,7 @@
           <w:rFonts w:ascii="Arial" w:hAnsi="Arial" w:cs="Arial"/>
           <w:u w:val="single"/>
         </w:rPr>
-        <w:t xml:space="preserve">solidez financiera del proveedor, con base en estados financieros auditados de los dos últimos ejercicios, indicadores de solvencia, liquidez y endeudamiento, y calificaciones de riesgo cuando existan; así como la exposición de la Cooperativa por anticipos, depósitos o pagos adelantados, la cual deberá estar cubierta con garantías.</w:t>
+        <w:t xml:space="preserve">con base en estados financieros auditados de los dos últimos ejercicios, indicadores de solvencia, liquidez y endeudamiento, y calificaciones de riesgo cuando existan; así como la exposición de la Cooperativa por anticipos, depósitos o pagos adelantados, la cual deberá estar cubierta con garantías.</w:t>
       </w:r>
     </w:p>
     <w:p>
@@ -7167,7 +7164,7 @@
           <w:b/>
           <w:u w:val="single"/>
         </w:rPr>
-        <w:t xml:space="preserve">Impacto en liquidez (NRP-05):</w:t>
+        <w:t xml:space="preserve">Riesgo de liquidez (NRP-05):</w:t>
       </w:r>
       <w:r>
         <w:rPr>
@@ -7203,7 +7200,7 @@
           <w:b/>
           <w:u w:val="single"/>
         </w:rPr>
-        <w:t xml:space="preserve">Riesgo de continuidad (NRP-24):</w:t>
+        <w:t xml:space="preserve">Continuidad del negocio (NRP-24, art. 20):</w:t>
       </w:r>
       <w:r>
         <w:rPr>
@@ -7239,7 +7236,7 @@
           <w:b/>
           <w:u w:val="single"/>
         </w:rPr>
-        <w:t xml:space="preserve">Riesgo legal y reputacional (NRP-20):</w:t>
+        <w:t xml:space="preserve">Riesgo legal y riesgo reputacional (NRP-20, art. 6, lits. d y e):</w:t>
       </w:r>
       <w:r>
         <w:rPr>
@@ -7351,7 +7348,7 @@
           <w:u w:val="single"/>
           <w:lang w:eastAsia="es-MX"/>
         </w:rPr>
-        <w:t xml:space="preserve">Monitoreo continuo:</w:t>
+        <w:t xml:space="preserve">Monitoreo (NRP-23, Anexo No. 1, Sección A, num. 3, lit. c):</w:t>
       </w:r>
       <w:r>
         <w:rPr>
@@ -7368,7 +7365,7 @@
           <w:u w:val="single"/>
           <w:lang w:eastAsia="es-MX"/>
         </w:rPr>
-        <w:t xml:space="preserve">la evaluación de riesgos no concluye con la contratación. El Departamento de Administración de Riesgos reevaluará semestralmente a los proveedores de criticidad Alta y anualmente a los de criticidad Media y Baja, considerando la debida diligencia del proveedor, la cual deberá documentarse y revisarse anualmente con la información más reciente (NRP-23), el cumplimiento de los ANS, los eventos de riesgo operacional registrados y los resultados de las pruebas de continuidad y de seguridad de la información. Los resultados se informarán al Comité de Riesgos.</w:t>
+        <w:t xml:space="preserve">la evaluación de riesgos no concluye con la contratación. El Departamento de Administración de Riesgos reevaluará semestralmente a los proveedores de criticidad Alta y anualmente a los de criticidad Media y Baja, considerando la debida diligencia del proveedor, la cual deberá documentarse y revisarse anualmente con la información más reciente, el cumplimiento de los SLA, los eventos de riesgo operacional registrados y los resultados de las pruebas de continuidad y de seguridad de la información. Los resultados se informarán al Comité de Riesgos.</w:t>
       </w:r>
     </w:p>
     <w:p>
@@ -7920,315 +7917,6 @@
         <w:rPr>
           <w:rFonts w:ascii="Arial" w:hAnsi="Arial" w:cs="Arial"/>
           <w:color w:val="000000"/>
-        </w:rPr>
-      </w:pPr>
-    </w:p>
-    <w:p>
-      <w:pPr>
-        <w:pStyle w:val="Prrafodelista"/>
-        <w:numPr>
-          <w:ilvl w:val="0"/>
-          <w:numId w:val="2"/>
-        </w:numPr>
-        <w:spacing w:line="276" w:lineRule="auto"/>
-        <w:jc w:val="both"/>
-        <w:outlineLvl w:val="0"/>
-        <w:rPr>
-          <w:rFonts w:ascii="Arial" w:hAnsi="Arial" w:cs="Arial"/>
-          <w:b/>
-          <w:color w:val="000000"/>
-        </w:rPr>
-      </w:pPr>
-      <w:bookmarkStart w:id="29" w:name="_Toc144550030"/>
-      <w:r>
-        <w:rPr>
-          <w:rFonts w:ascii="Arial" w:hAnsi="Arial" w:cs="Arial"/>
-          <w:b/>
-          <w:color w:val="000000"/>
-          <w:u w:val="single"/>
-        </w:rPr>
-        <w:t xml:space="preserve">MONITOREO, INDICADORES CLAVE DE RIESGO Y REPORTES</w:t>
-      </w:r>
-      <w:bookmarkEnd w:id="29"/>
-    </w:p>
-    <w:p>
-      <w:pPr>
-        <w:autoSpaceDE w:val="0"/>
-        <w:autoSpaceDN w:val="0"/>
-        <w:spacing w:line="276" w:lineRule="auto"/>
-        <w:contextualSpacing/>
-        <w:jc w:val="both"/>
-        <w:rPr>
-          <w:rFonts w:ascii="Arial" w:hAnsi="Arial" w:cs="Arial"/>
-          <w:color w:val="000000"/>
-        </w:rPr>
-      </w:pPr>
-    </w:p>
-    <w:p>
-      <w:pPr>
-        <w:autoSpaceDE w:val="0"/>
-        <w:autoSpaceDN w:val="0"/>
-        <w:spacing w:line="276" w:lineRule="auto"/>
-        <w:contextualSpacing/>
-        <w:jc w:val="both"/>
-        <w:rPr>
-          <w:rFonts w:ascii="Arial" w:hAnsi="Arial" w:cs="Arial"/>
-          <w:color w:val="000000"/>
-        </w:rPr>
-      </w:pPr>
-      <w:r>
-        <w:rPr>
-          <w:rFonts w:ascii="Arial" w:hAnsi="Arial" w:cs="Arial"/>
-          <w:color w:val="000000"/>
-          <w:u w:val="single"/>
-        </w:rPr>
-        <w:t xml:space="preserve">El Departamento de Administración de Riesgos establecerá y dará seguimiento, como mínimo, a los siguientes indicadores clave de riesgo (KRI) de tercerización:</w:t>
-      </w:r>
-    </w:p>
-    <w:p>
-      <w:pPr>
-        <w:pStyle w:val="Prrafodelista"/>
-        <w:numPr>
-          <w:ilvl w:val="0"/>
-          <w:numId w:val="4"/>
-        </w:numPr>
-        <w:spacing w:line="276" w:lineRule="auto"/>
-        <w:ind w:left="360"/>
-        <w:jc w:val="both"/>
-        <w:rPr>
-          <w:rFonts w:ascii="Arial" w:hAnsi="Arial" w:cs="Arial"/>
-          <w:color w:val="000000"/>
-        </w:rPr>
-      </w:pPr>
-      <w:r>
-        <w:rPr>
-          <w:rFonts w:ascii="Arial" w:hAnsi="Arial" w:cs="Arial"/>
-          <w:color w:val="000000"/>
-          <w:u w:val="single"/>
-        </w:rPr>
-        <w:t xml:space="preserve">Porcentaje de cumplimiento de ANS por proveedor crítico.</w:t>
-      </w:r>
-    </w:p>
-    <w:p>
-      <w:pPr>
-        <w:pStyle w:val="Prrafodelista"/>
-        <w:numPr>
-          <w:ilvl w:val="0"/>
-          <w:numId w:val="4"/>
-        </w:numPr>
-        <w:spacing w:line="276" w:lineRule="auto"/>
-        <w:ind w:left="360"/>
-        <w:jc w:val="both"/>
-        <w:rPr>
-          <w:rFonts w:ascii="Arial" w:hAnsi="Arial" w:cs="Arial"/>
-          <w:color w:val="000000"/>
-        </w:rPr>
-      </w:pPr>
-      <w:r>
-        <w:rPr>
-          <w:rFonts w:ascii="Arial" w:hAnsi="Arial" w:cs="Arial"/>
-          <w:color w:val="000000"/>
-          <w:u w:val="single"/>
-        </w:rPr>
-        <w:t xml:space="preserve">Número y severidad de incidentes e interrupciones atribuibles a proveedores, y pérdidas asociadas (NRP-42).</w:t>
-      </w:r>
-    </w:p>
-    <w:p>
-      <w:pPr>
-        <w:pStyle w:val="Prrafodelista"/>
-        <w:numPr>
-          <w:ilvl w:val="0"/>
-          <w:numId w:val="4"/>
-        </w:numPr>
-        <w:spacing w:line="276" w:lineRule="auto"/>
-        <w:ind w:left="360"/>
-        <w:jc w:val="both"/>
-        <w:rPr>
-          <w:rFonts w:ascii="Arial" w:hAnsi="Arial" w:cs="Arial"/>
-          <w:color w:val="000000"/>
-        </w:rPr>
-      </w:pPr>
-      <w:r>
-        <w:rPr>
-          <w:rFonts w:ascii="Arial" w:hAnsi="Arial" w:cs="Arial"/>
-          <w:color w:val="000000"/>
-          <w:u w:val="single"/>
-        </w:rPr>
-        <w:t xml:space="preserve">Índice de concentración: número de servicios críticos y porcentaje del gasto en servicios críticos por proveedor o grupo económico (NRP-23).</w:t>
-      </w:r>
-    </w:p>
-    <w:p>
-      <w:pPr>
-        <w:pStyle w:val="Prrafodelista"/>
-        <w:numPr>
-          <w:ilvl w:val="0"/>
-          <w:numId w:val="4"/>
-        </w:numPr>
-        <w:spacing w:line="276" w:lineRule="auto"/>
-        <w:ind w:left="360"/>
-        <w:jc w:val="both"/>
-        <w:rPr>
-          <w:rFonts w:ascii="Arial" w:hAnsi="Arial" w:cs="Arial"/>
-          <w:color w:val="000000"/>
-        </w:rPr>
-      </w:pPr>
-      <w:r>
-        <w:rPr>
-          <w:rFonts w:ascii="Arial" w:hAnsi="Arial" w:cs="Arial"/>
-          <w:color w:val="000000"/>
-          <w:u w:val="single"/>
-        </w:rPr>
-        <w:t xml:space="preserve">Proveedores críticos con deterioro en su calificación financiera o de riesgo de contraparte.</w:t>
-      </w:r>
-    </w:p>
-    <w:p>
-      <w:pPr>
-        <w:pStyle w:val="Prrafodelista"/>
-        <w:numPr>
-          <w:ilvl w:val="0"/>
-          <w:numId w:val="4"/>
-        </w:numPr>
-        <w:spacing w:line="276" w:lineRule="auto"/>
-        <w:ind w:left="360"/>
-        <w:jc w:val="both"/>
-        <w:rPr>
-          <w:rFonts w:ascii="Arial" w:hAnsi="Arial" w:cs="Arial"/>
-          <w:color w:val="000000"/>
-        </w:rPr>
-      </w:pPr>
-      <w:r>
-        <w:rPr>
-          <w:rFonts w:ascii="Arial" w:hAnsi="Arial" w:cs="Arial"/>
-          <w:color w:val="000000"/>
-          <w:u w:val="single"/>
-        </w:rPr>
-        <w:t xml:space="preserve">Monto comprometido con proveedores críticos y su proporción respecto de los gastos operativos, y exposición por anticipos no garantizados (NRP-05).</w:t>
-      </w:r>
-    </w:p>
-    <w:p>
-      <w:pPr>
-        <w:pStyle w:val="Prrafodelista"/>
-        <w:numPr>
-          <w:ilvl w:val="0"/>
-          <w:numId w:val="4"/>
-        </w:numPr>
-        <w:spacing w:line="276" w:lineRule="auto"/>
-        <w:ind w:left="360"/>
-        <w:jc w:val="both"/>
-        <w:rPr>
-          <w:rFonts w:ascii="Arial" w:hAnsi="Arial" w:cs="Arial"/>
-          <w:color w:val="000000"/>
-        </w:rPr>
-      </w:pPr>
-      <w:r>
-        <w:rPr>
-          <w:rFonts w:ascii="Arial" w:hAnsi="Arial" w:cs="Arial"/>
-          <w:color w:val="000000"/>
-          <w:u w:val="single"/>
-        </w:rPr>
-        <w:t xml:space="preserve">Porcentaje de proveedores críticos con pruebas de continuidad del negocio vigentes (NRP-24).</w:t>
-      </w:r>
-    </w:p>
-    <w:p>
-      <w:pPr>
-        <w:pStyle w:val="Prrafodelista"/>
-        <w:numPr>
-          <w:ilvl w:val="0"/>
-          <w:numId w:val="4"/>
-        </w:numPr>
-        <w:spacing w:line="276" w:lineRule="auto"/>
-        <w:ind w:left="360"/>
-        <w:jc w:val="both"/>
-        <w:rPr>
-          <w:rFonts w:ascii="Arial" w:hAnsi="Arial" w:cs="Arial"/>
-          <w:color w:val="000000"/>
-        </w:rPr>
-      </w:pPr>
-      <w:r>
-        <w:rPr>
-          <w:rFonts w:ascii="Arial" w:hAnsi="Arial" w:cs="Arial"/>
-          <w:color w:val="000000"/>
-          <w:u w:val="single"/>
-        </w:rPr>
-        <w:t xml:space="preserve">Brechas de seguridad de la información abiertas y vulnerabilidades críticas no corregidas en plazo (NRP-23 / NRP-20).</w:t>
-      </w:r>
-    </w:p>
-    <w:p>
-      <w:pPr>
-        <w:autoSpaceDE w:val="0"/>
-        <w:autoSpaceDN w:val="0"/>
-        <w:spacing w:line="276" w:lineRule="auto"/>
-        <w:contextualSpacing/>
-        <w:jc w:val="both"/>
-        <w:rPr>
-          <w:rFonts w:ascii="Arial" w:hAnsi="Arial" w:cs="Arial"/>
-          <w:color w:val="000000" w:themeColor="text1"/>
-        </w:rPr>
-      </w:pPr>
-      <w:r>
-        <w:rPr>
-          <w:rFonts w:ascii="Arial" w:hAnsi="Arial" w:cs="Arial"/>
-          <w:color w:val="000000" w:themeColor="text1"/>
-          <w:u w:val="single"/>
-        </w:rPr>
-        <w:t xml:space="preserve">Los resultados se informarán semestralmente</w:t>
-      </w:r>
-      <w:r>
-        <w:rPr>
-          <w:rFonts w:ascii="Arial" w:hAnsi="Arial" w:cs="Arial"/>
-          <w:color w:val="000000" w:themeColor="text1"/>
-        </w:rPr>
-        <w:t xml:space="preserve"> al </w:t>
-      </w:r>
-      <w:r>
-        <w:rPr>
-          <w:rFonts w:ascii="Arial" w:hAnsi="Arial" w:cs="Arial"/>
-          <w:color w:val="000000" w:themeColor="text1"/>
-          <w:u w:val="single"/>
-        </w:rPr>
-        <w:t xml:space="preserve">Comité de Riesgos y anualmente al Consejo</w:t>
-      </w:r>
-      <w:r>
-        <w:rPr>
-          <w:rFonts w:ascii="Arial" w:hAnsi="Arial" w:cs="Arial"/>
-          <w:color w:val="000000" w:themeColor="text1"/>
-        </w:rPr>
-        <w:t xml:space="preserve"> de Administración, </w:t>
-      </w:r>
-      <w:r>
-        <w:rPr>
-          <w:rFonts w:ascii="Arial" w:hAnsi="Arial" w:cs="Arial"/>
-          <w:color w:val="000000" w:themeColor="text1"/>
-          <w:u w:val="single"/>
-        </w:rPr>
-        <w:t xml:space="preserve">junto con</w:t>
-      </w:r>
-      <w:r>
-        <w:rPr>
-          <w:rFonts w:ascii="Arial" w:hAnsi="Arial" w:cs="Arial"/>
-          <w:color w:val="000000" w:themeColor="text1"/>
-        </w:rPr>
-        <w:t xml:space="preserve"> la Matriz Centralizada de Servicios Críticos Tercerizados </w:t>
-      </w:r>
-      <w:r>
-        <w:rPr>
-          <w:rFonts w:ascii="Arial" w:hAnsi="Arial" w:cs="Arial"/>
-          <w:color w:val="000000" w:themeColor="text1"/>
-          <w:u w:val="single"/>
-        </w:rPr>
-        <w:t xml:space="preserve">actualizada.</w:t>
-      </w:r>
-    </w:p>
-    <w:p>
-      <w:pPr>
-        <w:autoSpaceDE w:val="0"/>
-        <w:autoSpaceDN w:val="0"/>
-        <w:spacing w:line="276" w:lineRule="auto"/>
-        <w:contextualSpacing/>
-        <w:jc w:val="both"/>
-        <w:rPr>
-          <w:rFonts w:ascii="Arial" w:hAnsi="Arial" w:cs="Arial"/>
-          <w:color w:val="000000" w:themeColor="text1"/>
         </w:rPr>
       </w:pPr>
     </w:p>
@@ -9061,79 +8749,79 @@
               <w:rPr>
                 <w:rFonts w:ascii="Arial" w:hAnsi="Arial" w:cs="Arial"/>
               </w:rPr>
-              <w:t xml:space="preserve">Realizar una evaluación </w:t>
+              <w:t xml:space="preserve">Realizar una evaluación de riesgos a efecto de identificar aquellos riesgos derivados de los servicios a contratar y establecer los mecanismos de mitigación apropiados. </w:t>
             </w:r>
             <w:r>
               <w:rPr>
                 <w:rFonts w:ascii="Arial" w:hAnsi="Arial" w:cs="Arial"/>
                 <w:u w:val="single"/>
               </w:rPr>
-              <w:t xml:space="preserve">integral</w:t>
-            </w:r>
-            <w:r>
-              <w:rPr>
-                <w:rFonts w:ascii="Arial" w:hAnsi="Arial" w:cs="Arial"/>
-              </w:rPr>
-              <w:t xml:space="preserve"> de riesgos a efecto de identificar aquellos riesgos derivados de los servicios a contratar y establecer los mecanismos de mitigación apropiados. </w:t>
+              <w:t xml:space="preserve">La evaluación deberá considerar los</w:t>
+            </w:r>
+            <w:r>
+              <w:rPr>
+                <w:rFonts w:ascii="Arial" w:hAnsi="Arial" w:cs="Arial"/>
+              </w:rPr>
+              <w:t xml:space="preserve"> riesgos </w:t>
             </w:r>
             <w:r>
               <w:rPr>
                 <w:rFonts w:ascii="Arial" w:hAnsi="Arial" w:cs="Arial"/>
                 <w:u w:val="single"/>
               </w:rPr>
-              <w:t xml:space="preserve">La evaluación deberá considerar los riesgos operacionales (incluyendo los tecnológicos y legales), riesgos reputacionales y riesgos financieros, así como la continuidad (NRP-24), la contraparte y el impacto en liquidez (NRP-05).</w:t>
-            </w:r>
-            <w:r>
-              <w:rPr>
-                <w:rFonts w:ascii="Arial" w:hAnsi="Arial" w:cs="Arial"/>
-              </w:rPr>
-              <w:t xml:space="preserve"> Evaluar </w:t>
+              <w:t xml:space="preserve">operacionales (incluyendo los tecnológicos y legales), riesgos reputacionales y riesgos financieros, así como la continuidad del negocio (NRP-24) y el riesgo</w:t>
+            </w:r>
+            <w:r>
+              <w:rPr>
+                <w:rFonts w:ascii="Arial" w:hAnsi="Arial" w:cs="Arial"/>
+              </w:rPr>
+              <w:t xml:space="preserve"> de </w:t>
             </w:r>
             <w:r>
               <w:rPr>
                 <w:rFonts w:ascii="Arial" w:hAnsi="Arial" w:cs="Arial"/>
                 <w:u w:val="single"/>
               </w:rPr>
-              <w:t xml:space="preserve">los</w:t>
-            </w:r>
-            <w:r>
-              <w:rPr>
-                <w:rFonts w:ascii="Arial" w:hAnsi="Arial" w:cs="Arial"/>
-              </w:rPr>
-              <w:t xml:space="preserve"> riesgos </w:t>
+              <w:t xml:space="preserve">liquidez (NRP-05). Considerar en</w:t>
+            </w:r>
+            <w:r>
+              <w:rPr>
+                <w:rFonts w:ascii="Arial" w:hAnsi="Arial" w:cs="Arial"/>
+              </w:rPr>
+              <w:t xml:space="preserve"> la </w:t>
             </w:r>
             <w:r>
               <w:rPr>
                 <w:rFonts w:ascii="Arial" w:hAnsi="Arial" w:cs="Arial"/>
                 <w:u w:val="single"/>
               </w:rPr>
-              <w:t xml:space="preserve">que se generan como consecuencia</w:t>
-            </w:r>
-            <w:r>
-              <w:rPr>
-                <w:rFonts w:ascii="Arial" w:hAnsi="Arial" w:cs="Arial"/>
-              </w:rPr>
-              <w:t xml:space="preserve"> de la concentración de </w:t>
+              <w:t xml:space="preserve">evaluación aquellos riesgos que se generan como consecuencia de</w:t>
+            </w:r>
+            <w:r>
+              <w:rPr>
+                <w:rFonts w:ascii="Arial" w:hAnsi="Arial" w:cs="Arial"/>
+              </w:rPr>
+              <w:t xml:space="preserve"> la concentración de </w:t>
             </w:r>
             <w:r>
               <w:rPr>
                 <w:rFonts w:ascii="Arial" w:hAnsi="Arial" w:cs="Arial"/>
                 <w:u w:val="single"/>
               </w:rPr>
-              <w:t xml:space="preserve">entidades financieras en</w:t>
-            </w:r>
-            <w:r>
-              <w:rPr>
-                <w:rFonts w:ascii="Arial" w:hAnsi="Arial" w:cs="Arial"/>
-              </w:rPr>
-              <w:t xml:space="preserve"> el proveedor, </w:t>
+              <w:t xml:space="preserve">entidades financieras en un proveedor, así como la concentración de la propia Cooperativa en dicho proveedor y su grupo económico, debiendo establecer los mecanismos de mitigación y las acciones a realizar si dicho proveedor falla, considerando, en la medida de lo posible, contratar otros proveedores o contar</w:t>
+            </w:r>
+            <w:r>
+              <w:rPr>
+                <w:rFonts w:ascii="Arial" w:hAnsi="Arial" w:cs="Arial"/>
+              </w:rPr>
+              <w:t xml:space="preserve"> con </w:t>
             </w:r>
             <w:r>
               <w:rPr>
                 <w:rFonts w:ascii="Arial" w:hAnsi="Arial" w:cs="Arial"/>
                 <w:u w:val="single"/>
               </w:rPr>
-              <w:t xml:space="preserve">así como la concentración de la propia Cooperativa en dicho proveedor y su grupo económico, estableciendo los mecanismos de mitigación y las acciones a realizar si dicho proveedor falla, considerando, en la medida de lo posible, contratar otros proveedores o contar con otras garantías.</w:t>
+              <w:t xml:space="preserve">otras garantías.</w:t>
             </w:r>
           </w:p>
         </w:tc>
@@ -13889,7 +13577,7 @@
                 <w:szCs w:val="20"/>
                 <w:u w:val="single"/>
               </w:rPr>
-              <w:t xml:space="preserve">Se realizan las siguientes modificaciones: Se sustituye Comité de Administración de Riesgos por Comité de Riesgos y NPB4-50 por NRP-42. I. PROPÓSITO: se amplía y se incorpora la alineación con NRP-20, NRP-42, NRP-24, NRP-23, NRP-17 y NRP-05. II. ALCANCE: se amplía al ciclo de vida del servicio y a servicios de otra naturaleza, y se incorporan nuevas normativas. III. DEFINICIONES: se actualizan definiciones conforme a NRP-20, NRP-24 y NRP-42, y se incorporan riesgo tecnológico, riesgo operacional, riesgo de tercerización, riesgo de concentración de proveedores, riesgo de contraparte, impacto en liquidez, ANS, RTO/RPO/MTPD, apetito y tolerancia al riesgo y Matriz Centralizada de Servicios Críticos Tercerizados. IV. RESPONSABILIDADES: se incorporan responsabilidades del Consejo de Administración, Comité de Riesgos y Jefe de Administración de Riesgos en la gestión de riesgos de tercerización; se actualizan las del Administrador de Contrato en lo relativo al reporte de eventos de riesgo operacional y las del Jefe de Servicios Generales en lo relativo a los campos de la Matriz Centralizada (NRP-42, art. 4). V. CRITERIOS: se incorporan criterios de riesgo tecnológico, concentración y contraparte e impacto en liquidez, niveles de criticidad y reevaluación. VI. se actualiza conforme a la NRP-23 (arts. 22 y 26). VII. se amplía la evaluación de riesgos y se establece el monitoreo continuo. Se incorporan los apartados XI. Monitoreo, Indicadores Clave de Riesgo y Reportes, y XII. Gestión de Eventos de Riesgo Operacional Originados en Proveedores. XIII. ACTUALIZACIÓN: se establece revisión al menos anual. XIV. APROBACIÓN: se incorpora la remisión a la Superintendencia (NRP-20, art. 8). XVI. DISPOSICIÓN FINAL: se incorpora la opinión previa del Comité de Riesgos. ANEXO 1: se actualiza conforme a la NRP-23; Sección A, se actualizan los numerales 1, 3 y 5 y se incorporan los numerales 6 y 7; Sección B, se incorpora el acceso del Departamento de Administración de Riesgos en el numeral 20 y se incorporan los numerales 22 y 23.</w:t>
+              <w:t xml:space="preserve">Se realizan las siguientes modificaciones: Se sustituye Comité de Administración de Riesgos por Comité de Riesgos y NPB4-50 por NRP-42. I. PROPÓSITO: se amplía y se incorpora la alineación con NRP-20, NRP-42, NRP-24, NRP-23, NRP-17 y NRP-05. II. ALCANCE: se amplía al ciclo de vida del servicio y a servicios de otra naturaleza, y se incorporan nuevas normativas. III. DEFINICIONES: se sustituyen e incorporan definiciones conforme a la normativa (NRP-20, NRP-23, NRP-24 y NRP-42): tercerización de servicios, tercerización de actividades, operaciones o procesos de tecnologías de la información, servicios críticos, procesos críticos, servicios críticos tercerizados, proveedor, riesgo operacional, factor de riesgo operacional, tecnología de información, evento de riesgo operacional, riesgo de liquidez, riesgo reputacional, SLA, BIA, RTO, RPO, MTPD, apetito y tolerancia al riesgo y Matriz Centralizada de Servicios Críticos Tercerizados. IV. RESPONSABILIDADES: se incorporan responsabilidades del Consejo de Administración, Comité de Riesgos y Jefe de Administración de Riesgos en la gestión de riesgos de tercerización; se actualizan las del Administrador de Contrato en lo relativo al reporte de eventos de riesgo operacional y las del Jefe de Servicios Generales en lo relativo a los campos de la Matriz Centralizada (NRP-42, art. 4). V. CRITERIOS: se incorporan criterios de tecnología de información, concentración en el proveedor y riesgo de liquidez, niveles de criticidad y reevaluación. VI. se actualiza conforme a la NRP-23 (arts. 22 y 26). VII. se amplía la evaluación de riesgos y se establece el monitoreo. Se incorpora el apartado XI. Gestión de Eventos de Riesgo Operacional Originados en Proveedores; los apartados XII a XV se renumeran. XII. ACTUALIZACIÓN: se establece revisión al menos anual. XIII. APROBACIÓN: se incorpora la remisión a la Superintendencia (NRP-20, art. 8). XV. DISPOSICIÓN FINAL: se incorpora la opinión previa del Comité de Riesgos. ANEXO 1: se actualiza conforme a la NRP-23; Sección A, se actualizan los numerales 1, 3 y 5 y se incorporan los numerales 6 y 7; Sección B, se incorpora el acceso del Departamento de Administración de Riesgos en el numeral 20 y se incorporan los numerales 22 y 23.</w:t>
             </w:r>
           </w:p>
         </w:tc>

</xml_diff>